<commit_message>
add: add pdf format of the opsfolio lead magnet tour
</commit_message>
<xml_diff>
--- a/opsfolio-branding/marketing-assets/partner enablement/opsfolio_lead_magnets_tour_public_partner_enablement.docx
+++ b/opsfolio-branding/marketing-assets/partner enablement/opsfolio_lead_magnets_tour_public_partner_enablement.docx
@@ -21,7 +21,7 @@
               <w:noProof/>
             </w:rPr>
             <w:drawing>
-              <wp:anchor distT="0" distB="0" distL="114300" distR="114300" simplePos="0" relativeHeight="251642368" behindDoc="1" locked="0" layoutInCell="1" allowOverlap="1" wp14:anchorId="24AC2418" wp14:editId="24EA478C">
+              <wp:anchor distT="0" distB="0" distL="114300" distR="114300" simplePos="0" relativeHeight="251646976" behindDoc="1" locked="0" layoutInCell="1" allowOverlap="1" wp14:anchorId="24AC2418" wp14:editId="24EA478C">
                 <wp:simplePos x="0" y="0"/>
                 <wp:positionH relativeFrom="column">
                   <wp:posOffset>-939800</wp:posOffset>
@@ -222,7 +222,6 @@
                         <w:alias w:val="Author"/>
                         <w:tag w:val=""/>
                         <w:id w:val="-1536112409"/>
-                        <w:showingPlcHdr/>
                         <w:dataBinding w:prefixMappings="xmlns:ns0='http://purl.org/dc/elements/1.1/' xmlns:ns1='http://schemas.openxmlformats.org/package/2006/metadata/core-properties' " w:xpath="/ns1:coreProperties[1]/ns0:creator[1]" w:storeItemID="{6C3C8BC8-F283-45AE-878A-BAB7291924A1}"/>
                         <w:text/>
                       </w:sdtPr>
@@ -243,7 +242,7 @@
                               <w:sz w:val="24"/>
                               <w:szCs w:val="24"/>
                             </w:rPr>
-                            <w:t xml:space="preserve">     </w:t>
+                            <w:t>Ajay Kumaran</w:t>
                           </w:r>
                         </w:p>
                       </w:sdtContent>
@@ -259,7 +258,7 @@
               <w:noProof/>
             </w:rPr>
             <w:drawing>
-              <wp:anchor distT="0" distB="0" distL="114300" distR="114300" simplePos="0" relativeHeight="251658752" behindDoc="0" locked="0" layoutInCell="1" allowOverlap="1" wp14:anchorId="51401E60" wp14:editId="75CF8190">
+              <wp:anchor distT="0" distB="0" distL="114300" distR="114300" simplePos="0" relativeHeight="251662336" behindDoc="0" locked="0" layoutInCell="1" allowOverlap="1" wp14:anchorId="51401E60" wp14:editId="75CF8190">
                 <wp:simplePos x="0" y="0"/>
                 <wp:positionH relativeFrom="column">
                   <wp:posOffset>1146810</wp:posOffset>
@@ -385,7 +384,7 @@
           <w:r>
             <w:fldChar w:fldCharType="separate"/>
           </w:r>
-          <w:hyperlink w:anchor="_Toc229582197" w:history="1">
+          <w:hyperlink w:anchor="_Toc229646191" w:history="1">
             <w:r>
               <w:rPr>
                 <w:rStyle w:val="Hyperlink"/>
@@ -412,7 +411,7 @@
                 <w:noProof/>
                 <w:webHidden/>
               </w:rPr>
-              <w:instrText xml:space="preserve"> PAGEREF _Toc229582197 \h </w:instrText>
+              <w:instrText xml:space="preserve"> PAGEREF _Toc229646191 \h </w:instrText>
             </w:r>
             <w:r>
               <w:rPr>
@@ -456,7 +455,7 @@
               <w14:ligatures w14:val="standardContextual"/>
             </w:rPr>
           </w:pPr>
-          <w:hyperlink w:anchor="_Toc229582198" w:history="1">
+          <w:hyperlink w:anchor="_Toc229646192" w:history="1">
             <w:r>
               <w:rPr>
                 <w:rStyle w:val="Hyperlink"/>
@@ -483,7 +482,7 @@
                 <w:noProof/>
                 <w:webHidden/>
               </w:rPr>
-              <w:instrText xml:space="preserve"> PAGEREF _Toc229582198 \h </w:instrText>
+              <w:instrText xml:space="preserve"> PAGEREF _Toc229646192 \h </w:instrText>
             </w:r>
             <w:r>
               <w:rPr>
@@ -527,7 +526,7 @@
               <w14:ligatures w14:val="standardContextual"/>
             </w:rPr>
           </w:pPr>
-          <w:hyperlink w:anchor="_Toc229582199" w:history="1">
+          <w:hyperlink w:anchor="_Toc229646193" w:history="1">
             <w:r>
               <w:rPr>
                 <w:rStyle w:val="Hyperlink"/>
@@ -554,7 +553,7 @@
                 <w:noProof/>
                 <w:webHidden/>
               </w:rPr>
-              <w:instrText xml:space="preserve"> PAGEREF _Toc229582199 \h </w:instrText>
+              <w:instrText xml:space="preserve"> PAGEREF _Toc229646193 \h </w:instrText>
             </w:r>
             <w:r>
               <w:rPr>
@@ -598,7 +597,7 @@
               <w14:ligatures w14:val="standardContextual"/>
             </w:rPr>
           </w:pPr>
-          <w:hyperlink w:anchor="_Toc229582200" w:history="1">
+          <w:hyperlink w:anchor="_Toc229646194" w:history="1">
             <w:r>
               <w:rPr>
                 <w:rStyle w:val="Hyperlink"/>
@@ -625,7 +624,7 @@
                 <w:noProof/>
                 <w:webHidden/>
               </w:rPr>
-              <w:instrText xml:space="preserve"> PAGEREF _Toc229582200 \h </w:instrText>
+              <w:instrText xml:space="preserve"> PAGEREF _Toc229646194 \h </w:instrText>
             </w:r>
             <w:r>
               <w:rPr>
@@ -669,7 +668,7 @@
               <w14:ligatures w14:val="standardContextual"/>
             </w:rPr>
           </w:pPr>
-          <w:hyperlink w:anchor="_Toc229582201" w:history="1">
+          <w:hyperlink w:anchor="_Toc229646195" w:history="1">
             <w:r>
               <w:rPr>
                 <w:rStyle w:val="Hyperlink"/>
@@ -696,7 +695,7 @@
                 <w:noProof/>
                 <w:webHidden/>
               </w:rPr>
-              <w:instrText xml:space="preserve"> PAGEREF _Toc229582201 \h </w:instrText>
+              <w:instrText xml:space="preserve"> PAGEREF _Toc229646195 \h </w:instrText>
             </w:r>
             <w:r>
               <w:rPr>
@@ -740,7 +739,7 @@
               <w14:ligatures w14:val="standardContextual"/>
             </w:rPr>
           </w:pPr>
-          <w:hyperlink w:anchor="_Toc229582202" w:history="1">
+          <w:hyperlink w:anchor="_Toc229646196" w:history="1">
             <w:r>
               <w:rPr>
                 <w:rStyle w:val="Hyperlink"/>
@@ -767,149 +766,7 @@
                 <w:noProof/>
                 <w:webHidden/>
               </w:rPr>
-              <w:instrText xml:space="preserve"> PAGEREF _Toc229582202 \h </w:instrText>
-            </w:r>
-            <w:r>
-              <w:rPr>
-                <w:noProof/>
-                <w:webHidden/>
-              </w:rPr>
-            </w:r>
-            <w:r>
-              <w:rPr>
-                <w:noProof/>
-                <w:webHidden/>
-              </w:rPr>
-              <w:fldChar w:fldCharType="separate"/>
-            </w:r>
-            <w:r>
-              <w:rPr>
-                <w:noProof/>
-                <w:webHidden/>
-              </w:rPr>
-              <w:t>3</w:t>
-            </w:r>
-            <w:r>
-              <w:rPr>
-                <w:noProof/>
-                <w:webHidden/>
-              </w:rPr>
-              <w:fldChar w:fldCharType="end"/>
-            </w:r>
-          </w:hyperlink>
-        </w:p>
-        <w:p>
-          <w:pPr>
-            <w:pStyle w:val="TOC3"/>
-            <w:tabs>
-              <w:tab w:val="right" w:leader="dot" w:pos="9350"/>
-            </w:tabs>
-            <w:rPr>
-              <w:rFonts w:eastAsiaTheme="minorEastAsia"/>
-              <w:noProof/>
-              <w:kern w:val="2"/>
-              <w14:ligatures w14:val="standardContextual"/>
-            </w:rPr>
-          </w:pPr>
-          <w:hyperlink w:anchor="_Toc229582203" w:history="1">
-            <w:r>
-              <w:rPr>
-                <w:rStyle w:val="Hyperlink"/>
-                <w:noProof/>
-              </w:rPr>
-              <w:t>Opsfolio – Self-Assessment Malyszek</w:t>
-            </w:r>
-            <w:r>
-              <w:rPr>
-                <w:noProof/>
-                <w:webHidden/>
-              </w:rPr>
-              <w:tab/>
-            </w:r>
-            <w:r>
-              <w:rPr>
-                <w:noProof/>
-                <w:webHidden/>
-              </w:rPr>
-              <w:fldChar w:fldCharType="begin"/>
-            </w:r>
-            <w:r>
-              <w:rPr>
-                <w:noProof/>
-                <w:webHidden/>
-              </w:rPr>
-              <w:instrText xml:space="preserve"> PAGEREF _Toc229582203 \h </w:instrText>
-            </w:r>
-            <w:r>
-              <w:rPr>
-                <w:noProof/>
-                <w:webHidden/>
-              </w:rPr>
-            </w:r>
-            <w:r>
-              <w:rPr>
-                <w:noProof/>
-                <w:webHidden/>
-              </w:rPr>
-              <w:fldChar w:fldCharType="separate"/>
-            </w:r>
-            <w:r>
-              <w:rPr>
-                <w:noProof/>
-                <w:webHidden/>
-              </w:rPr>
-              <w:t>3</w:t>
-            </w:r>
-            <w:r>
-              <w:rPr>
-                <w:noProof/>
-                <w:webHidden/>
-              </w:rPr>
-              <w:fldChar w:fldCharType="end"/>
-            </w:r>
-          </w:hyperlink>
-        </w:p>
-        <w:p>
-          <w:pPr>
-            <w:pStyle w:val="TOC3"/>
-            <w:tabs>
-              <w:tab w:val="right" w:leader="dot" w:pos="9350"/>
-            </w:tabs>
-            <w:rPr>
-              <w:rFonts w:eastAsiaTheme="minorEastAsia"/>
-              <w:noProof/>
-              <w:kern w:val="2"/>
-              <w14:ligatures w14:val="standardContextual"/>
-            </w:rPr>
-          </w:pPr>
-          <w:hyperlink w:anchor="_Toc229582204" w:history="1">
-            <w:r>
-              <w:rPr>
-                <w:rStyle w:val="Hyperlink"/>
-                <w:noProof/>
-              </w:rPr>
-              <w:t>Self-Assessment Malyszek – Readiness Score Experience</w:t>
-            </w:r>
-            <w:r>
-              <w:rPr>
-                <w:noProof/>
-                <w:webHidden/>
-              </w:rPr>
-              <w:tab/>
-            </w:r>
-            <w:r>
-              <w:rPr>
-                <w:noProof/>
-                <w:webHidden/>
-              </w:rPr>
-              <w:fldChar w:fldCharType="begin"/>
-            </w:r>
-            <w:r>
-              <w:rPr>
-                <w:noProof/>
-                <w:webHidden/>
-              </w:rPr>
-              <w:instrText xml:space="preserve"> PAGEREF _Toc229582204 \h </w:instrText>
+              <w:instrText xml:space="preserve"> PAGEREF _Toc229646196 \h </w:instrText>
             </w:r>
             <w:r>
               <w:rPr>
@@ -953,7 +810,7 @@
               <w14:ligatures w14:val="standardContextual"/>
             </w:rPr>
           </w:pPr>
-          <w:hyperlink w:anchor="_Toc229582205" w:history="1">
+          <w:hyperlink w:anchor="_Toc229646197" w:history="1">
             <w:r>
               <w:rPr>
                 <w:rStyle w:val="Hyperlink"/>
@@ -980,7 +837,7 @@
                 <w:noProof/>
                 <w:webHidden/>
               </w:rPr>
-              <w:instrText xml:space="preserve"> PAGEREF _Toc229582205 \h </w:instrText>
+              <w:instrText xml:space="preserve"> PAGEREF _Toc229646197 \h </w:instrText>
             </w:r>
             <w:r>
               <w:rPr>
@@ -1024,7 +881,7 @@
               <w14:ligatures w14:val="standardContextual"/>
             </w:rPr>
           </w:pPr>
-          <w:hyperlink w:anchor="_Toc229582206" w:history="1">
+          <w:hyperlink w:anchor="_Toc229646198" w:history="1">
             <w:r>
               <w:rPr>
                 <w:rStyle w:val="Hyperlink"/>
@@ -1051,7 +908,7 @@
                 <w:noProof/>
                 <w:webHidden/>
               </w:rPr>
-              <w:instrText xml:space="preserve"> PAGEREF _Toc229582206 \h </w:instrText>
+              <w:instrText xml:space="preserve"> PAGEREF _Toc229646198 \h </w:instrText>
             </w:r>
             <w:r>
               <w:rPr>
@@ -1095,7 +952,7 @@
               <w14:ligatures w14:val="standardContextual"/>
             </w:rPr>
           </w:pPr>
-          <w:hyperlink w:anchor="_Toc229582207" w:history="1">
+          <w:hyperlink w:anchor="_Toc229646199" w:history="1">
             <w:r>
               <w:rPr>
                 <w:rStyle w:val="Hyperlink"/>
@@ -1122,7 +979,7 @@
                 <w:noProof/>
                 <w:webHidden/>
               </w:rPr>
-              <w:instrText xml:space="preserve"> PAGEREF _Toc229582207 \h </w:instrText>
+              <w:instrText xml:space="preserve"> PAGEREF _Toc229646199 \h </w:instrText>
             </w:r>
             <w:r>
               <w:rPr>
@@ -1166,7 +1023,7 @@
               <w14:ligatures w14:val="standardContextual"/>
             </w:rPr>
           </w:pPr>
-          <w:hyperlink w:anchor="_Toc229582208" w:history="1">
+          <w:hyperlink w:anchor="_Toc229646200" w:history="1">
             <w:r>
               <w:rPr>
                 <w:rStyle w:val="Hyperlink"/>
@@ -1193,7 +1050,7 @@
                 <w:noProof/>
                 <w:webHidden/>
               </w:rPr>
-              <w:instrText xml:space="preserve"> PAGEREF _Toc229582208 \h </w:instrText>
+              <w:instrText xml:space="preserve"> PAGEREF _Toc229646200 \h </w:instrText>
             </w:r>
             <w:r>
               <w:rPr>
@@ -1237,7 +1094,7 @@
               <w14:ligatures w14:val="standardContextual"/>
             </w:rPr>
           </w:pPr>
-          <w:hyperlink w:anchor="_Toc229582209" w:history="1">
+          <w:hyperlink w:anchor="_Toc229646201" w:history="1">
             <w:r>
               <w:rPr>
                 <w:rStyle w:val="Hyperlink"/>
@@ -1264,7 +1121,7 @@
                 <w:noProof/>
                 <w:webHidden/>
               </w:rPr>
-              <w:instrText xml:space="preserve"> PAGEREF _Toc229582209 \h </w:instrText>
+              <w:instrText xml:space="preserve"> PAGEREF _Toc229646201 \h </w:instrText>
             </w:r>
             <w:r>
               <w:rPr>
@@ -1308,7 +1165,7 @@
               <w14:ligatures w14:val="standardContextual"/>
             </w:rPr>
           </w:pPr>
-          <w:hyperlink w:anchor="_Toc229582210" w:history="1">
+          <w:hyperlink w:anchor="_Toc229646202" w:history="1">
             <w:r>
               <w:rPr>
                 <w:rStyle w:val="Hyperlink"/>
@@ -1335,7 +1192,7 @@
                 <w:noProof/>
                 <w:webHidden/>
               </w:rPr>
-              <w:instrText xml:space="preserve"> PAGEREF _Toc229582210 \h </w:instrText>
+              <w:instrText xml:space="preserve"> PAGEREF _Toc229646202 \h </w:instrText>
             </w:r>
             <w:r>
               <w:rPr>
@@ -1379,7 +1236,7 @@
               <w14:ligatures w14:val="standardContextual"/>
             </w:rPr>
           </w:pPr>
-          <w:hyperlink w:anchor="_Toc229582211" w:history="1">
+          <w:hyperlink w:anchor="_Toc229646203" w:history="1">
             <w:r>
               <w:rPr>
                 <w:rStyle w:val="Hyperlink"/>
@@ -1406,7 +1263,7 @@
                 <w:noProof/>
                 <w:webHidden/>
               </w:rPr>
-              <w:instrText xml:space="preserve"> PAGEREF _Toc229582211 \h </w:instrText>
+              <w:instrText xml:space="preserve"> PAGEREF _Toc229646203 \h </w:instrText>
             </w:r>
             <w:r>
               <w:rPr>
@@ -1450,7 +1307,7 @@
               <w14:ligatures w14:val="standardContextual"/>
             </w:rPr>
           </w:pPr>
-          <w:hyperlink w:anchor="_Toc229582212" w:history="1">
+          <w:hyperlink w:anchor="_Toc229646204" w:history="1">
             <w:r>
               <w:rPr>
                 <w:rStyle w:val="Hyperlink"/>
@@ -1477,7 +1334,7 @@
                 <w:noProof/>
                 <w:webHidden/>
               </w:rPr>
-              <w:instrText xml:space="preserve"> PAGEREF _Toc229582212 \h </w:instrText>
+              <w:instrText xml:space="preserve"> PAGEREF _Toc229646204 \h </w:instrText>
             </w:r>
             <w:r>
               <w:rPr>
@@ -1521,7 +1378,7 @@
               <w14:ligatures w14:val="standardContextual"/>
             </w:rPr>
           </w:pPr>
-          <w:hyperlink w:anchor="_Toc229582213" w:history="1">
+          <w:hyperlink w:anchor="_Toc229646205" w:history="1">
             <w:r>
               <w:rPr>
                 <w:rStyle w:val="Hyperlink"/>
@@ -1548,7 +1405,7 @@
                 <w:noProof/>
                 <w:webHidden/>
               </w:rPr>
-              <w:instrText xml:space="preserve"> PAGEREF _Toc229582213 \h </w:instrText>
+              <w:instrText xml:space="preserve"> PAGEREF _Toc229646205 \h </w:instrText>
             </w:r>
             <w:r>
               <w:rPr>
@@ -1592,7 +1449,7 @@
               <w14:ligatures w14:val="standardContextual"/>
             </w:rPr>
           </w:pPr>
-          <w:hyperlink w:anchor="_Toc229582214" w:history="1">
+          <w:hyperlink w:anchor="_Toc229646206" w:history="1">
             <w:r>
               <w:rPr>
                 <w:rStyle w:val="Hyperlink"/>
@@ -1619,7 +1476,7 @@
                 <w:noProof/>
                 <w:webHidden/>
               </w:rPr>
-              <w:instrText xml:space="preserve"> PAGEREF _Toc229582214 \h </w:instrText>
+              <w:instrText xml:space="preserve"> PAGEREF _Toc229646206 \h </w:instrText>
             </w:r>
             <w:r>
               <w:rPr>
@@ -1663,7 +1520,7 @@
               <w14:ligatures w14:val="standardContextual"/>
             </w:rPr>
           </w:pPr>
-          <w:hyperlink w:anchor="_Toc229582215" w:history="1">
+          <w:hyperlink w:anchor="_Toc229646207" w:history="1">
             <w:r>
               <w:rPr>
                 <w:rStyle w:val="Hyperlink"/>
@@ -1690,7 +1547,7 @@
                 <w:noProof/>
                 <w:webHidden/>
               </w:rPr>
-              <w:instrText xml:space="preserve"> PAGEREF _Toc229582215 \h </w:instrText>
+              <w:instrText xml:space="preserve"> PAGEREF _Toc229646207 \h </w:instrText>
             </w:r>
             <w:r>
               <w:rPr>
@@ -1734,7 +1591,7 @@
               <w14:ligatures w14:val="standardContextual"/>
             </w:rPr>
           </w:pPr>
-          <w:hyperlink w:anchor="_Toc229582216" w:history="1">
+          <w:hyperlink w:anchor="_Toc229646208" w:history="1">
             <w:r>
               <w:rPr>
                 <w:rStyle w:val="Hyperlink"/>
@@ -1761,7 +1618,7 @@
                 <w:noProof/>
                 <w:webHidden/>
               </w:rPr>
-              <w:instrText xml:space="preserve"> PAGEREF _Toc229582216 \h </w:instrText>
+              <w:instrText xml:space="preserve"> PAGEREF _Toc229646208 \h </w:instrText>
             </w:r>
             <w:r>
               <w:rPr>
@@ -1805,7 +1662,7 @@
               <w14:ligatures w14:val="standardContextual"/>
             </w:rPr>
           </w:pPr>
-          <w:hyperlink w:anchor="_Toc229582217" w:history="1">
+          <w:hyperlink w:anchor="_Toc229646209" w:history="1">
             <w:r>
               <w:rPr>
                 <w:rStyle w:val="Hyperlink"/>
@@ -1832,7 +1689,7 @@
                 <w:noProof/>
                 <w:webHidden/>
               </w:rPr>
-              <w:instrText xml:space="preserve"> PAGEREF _Toc229582217 \h </w:instrText>
+              <w:instrText xml:space="preserve"> PAGEREF _Toc229646209 \h </w:instrText>
             </w:r>
             <w:r>
               <w:rPr>
@@ -1876,7 +1733,7 @@
               <w14:ligatures w14:val="standardContextual"/>
             </w:rPr>
           </w:pPr>
-          <w:hyperlink w:anchor="_Toc229582218" w:history="1">
+          <w:hyperlink w:anchor="_Toc229646210" w:history="1">
             <w:r>
               <w:rPr>
                 <w:rStyle w:val="Hyperlink"/>
@@ -1903,7 +1760,7 @@
                 <w:noProof/>
                 <w:webHidden/>
               </w:rPr>
-              <w:instrText xml:space="preserve"> PAGEREF _Toc229582218 \h </w:instrText>
+              <w:instrText xml:space="preserve"> PAGEREF _Toc229646210 \h </w:instrText>
             </w:r>
             <w:r>
               <w:rPr>
@@ -1947,7 +1804,7 @@
               <w14:ligatures w14:val="standardContextual"/>
             </w:rPr>
           </w:pPr>
-          <w:hyperlink w:anchor="_Toc229582219" w:history="1">
+          <w:hyperlink w:anchor="_Toc229646211" w:history="1">
             <w:r>
               <w:rPr>
                 <w:rStyle w:val="Hyperlink"/>
@@ -1974,7 +1831,7 @@
                 <w:noProof/>
                 <w:webHidden/>
               </w:rPr>
-              <w:instrText xml:space="preserve"> PAGEREF _Toc229582219 \h </w:instrText>
+              <w:instrText xml:space="preserve"> PAGEREF _Toc229646211 \h </w:instrText>
             </w:r>
             <w:r>
               <w:rPr>
@@ -2018,7 +1875,7 @@
               <w14:ligatures w14:val="standardContextual"/>
             </w:rPr>
           </w:pPr>
-          <w:hyperlink w:anchor="_Toc229582220" w:history="1">
+          <w:hyperlink w:anchor="_Toc229646212" w:history="1">
             <w:r>
               <w:rPr>
                 <w:rStyle w:val="Hyperlink"/>
@@ -2045,7 +1902,7 @@
                 <w:noProof/>
                 <w:webHidden/>
               </w:rPr>
-              <w:instrText xml:space="preserve"> PAGEREF _Toc229582220 \h </w:instrText>
+              <w:instrText xml:space="preserve"> PAGEREF _Toc229646212 \h </w:instrText>
             </w:r>
             <w:r>
               <w:rPr>
@@ -2089,7 +1946,7 @@
               <w14:ligatures w14:val="standardContextual"/>
             </w:rPr>
           </w:pPr>
-          <w:hyperlink w:anchor="_Toc229582221" w:history="1">
+          <w:hyperlink w:anchor="_Toc229646213" w:history="1">
             <w:r>
               <w:rPr>
                 <w:rStyle w:val="Hyperlink"/>
@@ -2116,7 +1973,7 @@
                 <w:noProof/>
                 <w:webHidden/>
               </w:rPr>
-              <w:instrText xml:space="preserve"> PAGEREF _Toc229582221 \h </w:instrText>
+              <w:instrText xml:space="preserve"> PAGEREF _Toc229646213 \h </w:instrText>
             </w:r>
             <w:r>
               <w:rPr>
@@ -2160,7 +2017,7 @@
               <w14:ligatures w14:val="standardContextual"/>
             </w:rPr>
           </w:pPr>
-          <w:hyperlink w:anchor="_Toc229582222" w:history="1">
+          <w:hyperlink w:anchor="_Toc229646214" w:history="1">
             <w:r>
               <w:rPr>
                 <w:rStyle w:val="Hyperlink"/>
@@ -2187,7 +2044,7 @@
                 <w:noProof/>
                 <w:webHidden/>
               </w:rPr>
-              <w:instrText xml:space="preserve"> PAGEREF _Toc229582222 \h </w:instrText>
+              <w:instrText xml:space="preserve"> PAGEREF _Toc229646214 \h </w:instrText>
             </w:r>
             <w:r>
               <w:rPr>
@@ -2231,7 +2088,7 @@
               <w14:ligatures w14:val="standardContextual"/>
             </w:rPr>
           </w:pPr>
-          <w:hyperlink w:anchor="_Toc229582223" w:history="1">
+          <w:hyperlink w:anchor="_Toc229646215" w:history="1">
             <w:r>
               <w:rPr>
                 <w:rStyle w:val="Hyperlink"/>
@@ -2258,7 +2115,7 @@
                 <w:noProof/>
                 <w:webHidden/>
               </w:rPr>
-              <w:instrText xml:space="preserve"> PAGEREF _Toc229582223 \h </w:instrText>
+              <w:instrText xml:space="preserve"> PAGEREF _Toc229646215 \h </w:instrText>
             </w:r>
             <w:r>
               <w:rPr>
@@ -2302,7 +2159,7 @@
               <w14:ligatures w14:val="standardContextual"/>
             </w:rPr>
           </w:pPr>
-          <w:hyperlink w:anchor="_Toc229582224" w:history="1">
+          <w:hyperlink w:anchor="_Toc229646216" w:history="1">
             <w:r>
               <w:rPr>
                 <w:rStyle w:val="Hyperlink"/>
@@ -2329,7 +2186,7 @@
                 <w:noProof/>
                 <w:webHidden/>
               </w:rPr>
-              <w:instrText xml:space="preserve"> PAGEREF _Toc229582224 \h </w:instrText>
+              <w:instrText xml:space="preserve"> PAGEREF _Toc229646216 \h </w:instrText>
             </w:r>
             <w:r>
               <w:rPr>
@@ -2373,7 +2230,7 @@
               <w14:ligatures w14:val="standardContextual"/>
             </w:rPr>
           </w:pPr>
-          <w:hyperlink w:anchor="_Toc229582225" w:history="1">
+          <w:hyperlink w:anchor="_Toc229646217" w:history="1">
             <w:r>
               <w:rPr>
                 <w:rStyle w:val="Hyperlink"/>
@@ -2400,7 +2257,7 @@
                 <w:noProof/>
                 <w:webHidden/>
               </w:rPr>
-              <w:instrText xml:space="preserve"> PAGEREF _Toc229582225 \h </w:instrText>
+              <w:instrText xml:space="preserve"> PAGEREF _Toc229646217 \h </w:instrText>
             </w:r>
             <w:r>
               <w:rPr>
@@ -2444,7 +2301,7 @@
               <w14:ligatures w14:val="standardContextual"/>
             </w:rPr>
           </w:pPr>
-          <w:hyperlink w:anchor="_Toc229582226" w:history="1">
+          <w:hyperlink w:anchor="_Toc229646218" w:history="1">
             <w:r>
               <w:rPr>
                 <w:rStyle w:val="Hyperlink"/>
@@ -2471,7 +2328,7 @@
                 <w:noProof/>
                 <w:webHidden/>
               </w:rPr>
-              <w:instrText xml:space="preserve"> PAGEREF _Toc229582226 \h </w:instrText>
+              <w:instrText xml:space="preserve"> PAGEREF _Toc229646218 \h </w:instrText>
             </w:r>
             <w:r>
               <w:rPr>
@@ -2521,7 +2378,7 @@
           <w:color w:val="auto"/>
         </w:rPr>
       </w:pPr>
-      <w:bookmarkStart w:id="1" w:name="_Toc229582197"/>
+      <w:bookmarkStart w:id="1" w:name="_Toc229646191"/>
       <w:r>
         <w:rPr>
           <w:color w:val="auto"/>
@@ -2546,15 +2403,15 @@
           <w:color w:val="auto"/>
         </w:rPr>
       </w:pPr>
-      <w:bookmarkStart w:id="2" w:name="_Toc229582198"/>
-      <w:bookmarkStart w:id="3" w:name="overview"/>
+      <w:bookmarkStart w:id="2" w:name="overview"/>
+      <w:bookmarkStart w:id="3" w:name="_Toc229646192"/>
       <w:r>
         <w:rPr>
           <w:color w:val="auto"/>
         </w:rPr>
         <w:t>Overview</w:t>
       </w:r>
-      <w:bookmarkEnd w:id="2"/>
+      <w:bookmarkEnd w:id="3"/>
     </w:p>
     <w:p>
       <w:pPr>
@@ -2795,10 +2652,10 @@
           <w:color w:val="auto"/>
         </w:rPr>
       </w:pPr>
-      <w:bookmarkStart w:id="4" w:name="_Toc229582199"/>
-      <w:bookmarkStart w:id="5" w:name="customer-journey-overview"/>
+      <w:bookmarkStart w:id="4" w:name="customer-journey-overview"/>
+      <w:bookmarkStart w:id="5" w:name="_Toc229646193"/>
       <w:bookmarkEnd w:id="0"/>
-      <w:bookmarkEnd w:id="3"/>
+      <w:bookmarkEnd w:id="2"/>
       <w:r>
         <w:rPr>
           <w:color w:val="auto"/>
@@ -2806,7 +2663,7 @@
         <w:lastRenderedPageBreak/>
         <w:t>1. Customer Journey Overview</w:t>
       </w:r>
-      <w:bookmarkEnd w:id="4"/>
+      <w:bookmarkEnd w:id="5"/>
     </w:p>
     <w:p>
       <w:pPr>
@@ -2815,15 +2672,15 @@
           <w:color w:val="auto"/>
         </w:rPr>
       </w:pPr>
-      <w:bookmarkStart w:id="6" w:name="_Toc229582200"/>
-      <w:bookmarkStart w:id="7" w:name="typical-lead-journey"/>
+      <w:bookmarkStart w:id="6" w:name="typical-lead-journey"/>
+      <w:bookmarkStart w:id="7" w:name="_Toc229646194"/>
       <w:r>
         <w:rPr>
           <w:color w:val="auto"/>
         </w:rPr>
         <w:t>Typical Lead Journey</w:t>
       </w:r>
-      <w:bookmarkEnd w:id="6"/>
+      <w:bookmarkEnd w:id="7"/>
     </w:p>
     <w:p>
       <w:pPr>
@@ -2945,17 +2802,17 @@
           <w:color w:val="auto"/>
         </w:rPr>
       </w:pPr>
-      <w:bookmarkStart w:id="8" w:name="_Toc229582201"/>
-      <w:bookmarkStart w:id="9" w:name="landing-pages-campaign-experience"/>
-      <w:bookmarkEnd w:id="5"/>
-      <w:bookmarkEnd w:id="7"/>
+      <w:bookmarkStart w:id="8" w:name="landing-pages-campaign-experience"/>
+      <w:bookmarkStart w:id="9" w:name="_Toc229646195"/>
+      <w:bookmarkEnd w:id="4"/>
+      <w:bookmarkEnd w:id="6"/>
       <w:r>
         <w:rPr>
           <w:color w:val="auto"/>
         </w:rPr>
         <w:t>2. Landing Pages &amp; Campaign Experience</w:t>
       </w:r>
-      <w:bookmarkEnd w:id="8"/>
+      <w:bookmarkEnd w:id="9"/>
     </w:p>
     <w:p>
       <w:pPr>
@@ -2964,43 +2821,33 @@
           <w:color w:val="auto"/>
         </w:rPr>
       </w:pPr>
-      <w:bookmarkStart w:id="10" w:name="_Toc229582202"/>
-      <w:bookmarkStart w:id="11" w:name="example-public-landing-pages"/>
+      <w:bookmarkStart w:id="10" w:name="example-public-landing-pages"/>
+      <w:bookmarkStart w:id="11" w:name="_Toc229646196"/>
       <w:r>
         <w:rPr>
           <w:color w:val="auto"/>
         </w:rPr>
         <w:t>Example Public Landing Pages</w:t>
       </w:r>
-      <w:bookmarkEnd w:id="10"/>
-    </w:p>
-    <w:p>
-      <w:pPr>
-        <w:pStyle w:val="Heading3"/>
-        <w:spacing w:before="240" w:after="0"/>
+      <w:bookmarkEnd w:id="11"/>
+    </w:p>
+    <w:p>
+      <w:pPr>
+        <w:pStyle w:val="FirstParagraph"/>
+        <w:spacing w:after="0"/>
         <w:rPr>
+          <w:rStyle w:val="Hyperlink"/>
           <w:color w:val="auto"/>
         </w:rPr>
       </w:pPr>
-      <w:proofErr w:type="spellStart"/>
-      <w:r>
-        <w:rPr>
-          <w:color w:val="auto"/>
-        </w:rPr>
-        <w:t>Opsfolio</w:t>
-      </w:r>
-      <w:proofErr w:type="spellEnd"/>
-      <w:r>
-        <w:rPr>
-          <w:color w:val="auto"/>
-        </w:rPr>
-        <w:t xml:space="preserve"> – </w:t>
-      </w:r>
-      <w:r>
-        <w:rPr>
-          <w:color w:val="auto"/>
-        </w:rPr>
+      <w:r>
+        <w:t xml:space="preserve">Opsfolio – </w:t>
+      </w:r>
+      <w:r>
         <w:t>CMMC Level 1 Self-Assessment</w:t>
+      </w:r>
+      <w:r>
+        <w:t xml:space="preserve"> </w:t>
       </w:r>
       <w:r>
         <w:br/>
@@ -3016,26 +2863,21 @@
     </w:p>
     <w:p>
       <w:pPr>
-        <w:pStyle w:val="Heading3"/>
-        <w:spacing w:before="240" w:after="0"/>
-        <w:rPr>
-          <w:color w:val="auto"/>
-        </w:rPr>
-      </w:pPr>
-      <w:bookmarkStart w:id="12" w:name="_Toc229582203"/>
-      <w:bookmarkStart w:id="13" w:name="opsfolio-self-assessment-malyszek"/>
-      <w:r>
-        <w:rPr>
-          <w:color w:val="auto"/>
-        </w:rPr>
+        <w:pStyle w:val="FirstParagraph"/>
+        <w:spacing w:after="0"/>
+      </w:pPr>
+      <w:bookmarkStart w:id="12" w:name="opsfolio-self-assessment-malyszek"/>
+      <w:r>
         <w:t>Opsfolio – Self-Assessment Malyszek</w:t>
       </w:r>
-      <w:bookmarkEnd w:id="12"/>
     </w:p>
     <w:p>
       <w:pPr>
         <w:pStyle w:val="FirstParagraph"/>
         <w:spacing w:before="0" w:after="0"/>
+        <w:rPr>
+          <w:rStyle w:val="Hyperlink"/>
+        </w:rPr>
       </w:pPr>
       <w:hyperlink r:id="rId15" w:history="1">
         <w:r>
@@ -3046,11 +2888,14 @@
         </w:r>
       </w:hyperlink>
       <w:r>
+        <w:rPr>
+          <w:rStyle w:val="Hyperlink"/>
+        </w:rPr>
         <w:t xml:space="preserve"> </w:t>
       </w:r>
     </w:p>
-    <w:bookmarkStart w:id="14" w:name="Xc4d74da137984280ce133d02f1f80e19a7baa3c"/>
-    <w:bookmarkEnd w:id="13"/>
+    <w:bookmarkStart w:id="13" w:name="Xc4d74da137984280ce133d02f1f80e19a7baa3c"/>
+    <w:bookmarkEnd w:id="12"/>
     <w:p>
       <w:pPr>
         <w:pStyle w:val="FirstParagraph"/>
@@ -3139,10 +2984,10 @@
           <w:color w:val="auto"/>
         </w:rPr>
       </w:pPr>
-      <w:bookmarkStart w:id="15" w:name="_Toc229582205"/>
-      <w:bookmarkStart w:id="16" w:name="landing-page-goals"/>
-      <w:bookmarkEnd w:id="11"/>
-      <w:bookmarkEnd w:id="14"/>
+      <w:bookmarkStart w:id="14" w:name="landing-page-goals"/>
+      <w:bookmarkStart w:id="15" w:name="_Toc229646197"/>
+      <w:bookmarkEnd w:id="10"/>
+      <w:bookmarkEnd w:id="13"/>
       <w:r>
         <w:rPr>
           <w:noProof/>
@@ -3358,10 +3203,10 @@
           <w:color w:val="auto"/>
         </w:rPr>
       </w:pPr>
-      <w:bookmarkStart w:id="17" w:name="_Toc229582206"/>
-      <w:bookmarkStart w:id="18" w:name="sign-up-user-inputs"/>
-      <w:bookmarkEnd w:id="9"/>
-      <w:bookmarkEnd w:id="16"/>
+      <w:bookmarkStart w:id="16" w:name="sign-up-user-inputs"/>
+      <w:bookmarkStart w:id="17" w:name="_Toc229646198"/>
+      <w:bookmarkEnd w:id="8"/>
+      <w:bookmarkEnd w:id="14"/>
       <w:r>
         <w:rPr>
           <w:color w:val="auto"/>
@@ -3429,8 +3274,8 @@
           <w:color w:val="auto"/>
         </w:rPr>
       </w:pPr>
-      <w:bookmarkStart w:id="19" w:name="_Toc229582207"/>
-      <w:bookmarkStart w:id="20" w:name="initial-sign-up-information"/>
+      <w:bookmarkStart w:id="18" w:name="initial-sign-up-information"/>
+      <w:bookmarkStart w:id="19" w:name="_Toc229646199"/>
       <w:r>
         <w:rPr>
           <w:noProof/>
@@ -3546,10 +3391,10 @@
           <w:color w:val="auto"/>
         </w:rPr>
       </w:pPr>
-      <w:bookmarkStart w:id="21" w:name="_Toc229582208"/>
-      <w:bookmarkStart w:id="22" w:name="assessment-experience"/>
+      <w:bookmarkStart w:id="20" w:name="assessment-experience"/>
+      <w:bookmarkStart w:id="21" w:name="_Toc229646200"/>
+      <w:bookmarkEnd w:id="16"/>
       <w:bookmarkEnd w:id="18"/>
-      <w:bookmarkEnd w:id="20"/>
       <w:r>
         <w:rPr>
           <w:color w:val="auto"/>
@@ -3566,8 +3411,8 @@
           <w:color w:val="auto"/>
         </w:rPr>
       </w:pPr>
-      <w:bookmarkStart w:id="23" w:name="_Toc229582209"/>
-      <w:bookmarkStart w:id="24" w:name="cmmc-assessments"/>
+      <w:bookmarkStart w:id="22" w:name="cmmc-assessments"/>
+      <w:bookmarkStart w:id="23" w:name="_Toc229646201"/>
       <w:r>
         <w:rPr>
           <w:color w:val="auto"/>
@@ -3597,7 +3442,7 @@
           <w:noProof/>
         </w:rPr>
         <w:drawing>
-          <wp:anchor distT="0" distB="0" distL="114300" distR="114300" simplePos="0" relativeHeight="251657216" behindDoc="0" locked="0" layoutInCell="1" allowOverlap="1" wp14:anchorId="6E34D4D9" wp14:editId="28706F99">
+          <wp:anchor distT="0" distB="0" distL="114300" distR="114300" simplePos="0" relativeHeight="251656192" behindDoc="0" locked="0" layoutInCell="1" allowOverlap="1" wp14:anchorId="6E34D4D9" wp14:editId="70D777B9">
             <wp:simplePos x="0" y="0"/>
             <wp:positionH relativeFrom="column">
               <wp:posOffset>4475480</wp:posOffset>
@@ -3843,9 +3688,9 @@
           <w:color w:val="auto"/>
         </w:rPr>
       </w:pPr>
-      <w:bookmarkStart w:id="25" w:name="_Toc229582210"/>
-      <w:bookmarkStart w:id="26" w:name="soc-2-readiness-assessments"/>
-      <w:bookmarkEnd w:id="24"/>
+      <w:bookmarkStart w:id="24" w:name="soc-2-readiness-assessments"/>
+      <w:bookmarkStart w:id="25" w:name="_Toc229646202"/>
+      <w:bookmarkEnd w:id="22"/>
       <w:r>
         <w:rPr>
           <w:color w:val="auto"/>
@@ -3864,7 +3709,7 @@
           <w:noProof/>
         </w:rPr>
         <w:drawing>
-          <wp:anchor distT="0" distB="0" distL="114300" distR="114300" simplePos="0" relativeHeight="251662336" behindDoc="0" locked="0" layoutInCell="1" allowOverlap="1" wp14:anchorId="76E7A80C" wp14:editId="098BA944">
+          <wp:anchor distT="0" distB="0" distL="114300" distR="114300" simplePos="0" relativeHeight="251672576" behindDoc="0" locked="0" layoutInCell="1" allowOverlap="1" wp14:anchorId="76E7A80C" wp14:editId="098BA944">
             <wp:simplePos x="0" y="0"/>
             <wp:positionH relativeFrom="column">
               <wp:posOffset>4390390</wp:posOffset>
@@ -4067,10 +3912,10 @@
           <w:color w:val="auto"/>
         </w:rPr>
       </w:pPr>
-      <w:bookmarkStart w:id="27" w:name="_Toc229582211"/>
-      <w:bookmarkStart w:id="28" w:name="automated-emails-customer-touchpoints"/>
-      <w:bookmarkEnd w:id="22"/>
-      <w:bookmarkEnd w:id="26"/>
+      <w:bookmarkStart w:id="26" w:name="automated-emails-customer-touchpoints"/>
+      <w:bookmarkStart w:id="27" w:name="_Toc229646203"/>
+      <w:bookmarkEnd w:id="20"/>
+      <w:bookmarkEnd w:id="24"/>
       <w:r>
         <w:rPr>
           <w:color w:val="auto"/>
@@ -4086,8 +3931,8 @@
           <w:color w:val="auto"/>
         </w:rPr>
       </w:pPr>
-      <w:bookmarkStart w:id="29" w:name="_Toc229582212"/>
-      <w:bookmarkStart w:id="30" w:name="automated-customer-experience"/>
+      <w:bookmarkStart w:id="28" w:name="automated-customer-experience"/>
+      <w:bookmarkStart w:id="29" w:name="_Toc229646204"/>
       <w:r>
         <w:rPr>
           <w:color w:val="auto"/>
@@ -4261,10 +4106,10 @@
           <w:color w:val="auto"/>
         </w:rPr>
       </w:pPr>
-      <w:bookmarkStart w:id="31" w:name="_Toc229582213"/>
-      <w:bookmarkStart w:id="32" w:name="reports-outputs-generated"/>
+      <w:bookmarkStart w:id="30" w:name="reports-outputs-generated"/>
+      <w:bookmarkStart w:id="31" w:name="_Toc229646205"/>
+      <w:bookmarkEnd w:id="26"/>
       <w:bookmarkEnd w:id="28"/>
-      <w:bookmarkEnd w:id="30"/>
       <w:r>
         <w:rPr>
           <w:color w:val="auto"/>
@@ -4281,8 +4126,8 @@
           <w:color w:val="auto"/>
         </w:rPr>
       </w:pPr>
-      <w:bookmarkStart w:id="33" w:name="_Toc229582214"/>
-      <w:bookmarkStart w:id="34" w:name="cmmc-level-1-reports"/>
+      <w:bookmarkStart w:id="32" w:name="cmmc-level-1-reports"/>
+      <w:bookmarkStart w:id="33" w:name="_Toc229646206"/>
       <w:r>
         <w:rPr>
           <w:color w:val="auto"/>
@@ -4445,9 +4290,9 @@
           <w:color w:val="auto"/>
         </w:rPr>
       </w:pPr>
-      <w:bookmarkStart w:id="35" w:name="_Toc229582215"/>
-      <w:bookmarkStart w:id="36" w:name="soc-2-readiness-reports"/>
-      <w:bookmarkEnd w:id="34"/>
+      <w:bookmarkStart w:id="34" w:name="soc-2-readiness-reports"/>
+      <w:bookmarkStart w:id="35" w:name="_Toc229646207"/>
+      <w:bookmarkEnd w:id="32"/>
       <w:r>
         <w:rPr>
           <w:color w:val="auto"/>
@@ -4529,10 +4374,10 @@
           <w:color w:val="auto"/>
         </w:rPr>
       </w:pPr>
-      <w:bookmarkStart w:id="37" w:name="_Toc229582216"/>
-      <w:bookmarkStart w:id="38" w:name="how-channel-partners-can-use-the-system"/>
-      <w:bookmarkEnd w:id="32"/>
-      <w:bookmarkEnd w:id="36"/>
+      <w:bookmarkStart w:id="36" w:name="how-channel-partners-can-use-the-system"/>
+      <w:bookmarkStart w:id="37" w:name="_Toc229646208"/>
+      <w:bookmarkEnd w:id="30"/>
+      <w:bookmarkEnd w:id="34"/>
       <w:r>
         <w:rPr>
           <w:color w:val="auto"/>
@@ -4548,8 +4393,8 @@
           <w:color w:val="auto"/>
         </w:rPr>
       </w:pPr>
-      <w:bookmarkStart w:id="39" w:name="_Toc229582217"/>
-      <w:bookmarkStart w:id="40" w:name="partner-driven-campaigns"/>
+      <w:bookmarkStart w:id="38" w:name="partner-driven-campaigns"/>
+      <w:bookmarkStart w:id="39" w:name="_Toc229646209"/>
       <w:r>
         <w:rPr>
           <w:color w:val="auto"/>
@@ -4662,9 +4507,9 @@
           <w:color w:val="auto"/>
         </w:rPr>
       </w:pPr>
-      <w:bookmarkStart w:id="41" w:name="_Toc229582218"/>
-      <w:bookmarkStart w:id="42" w:name="why-this-matters-for-partners"/>
-      <w:bookmarkEnd w:id="40"/>
+      <w:bookmarkStart w:id="40" w:name="why-this-matters-for-partners"/>
+      <w:bookmarkStart w:id="41" w:name="_Toc229646210"/>
+      <w:bookmarkEnd w:id="38"/>
       <w:r>
         <w:rPr>
           <w:color w:val="auto"/>
@@ -4806,10 +4651,10 @@
           <w:color w:val="auto"/>
         </w:rPr>
       </w:pPr>
-      <w:bookmarkStart w:id="43" w:name="_Toc229582219"/>
-      <w:bookmarkStart w:id="44" w:name="example-funnel-progression"/>
-      <w:bookmarkEnd w:id="38"/>
-      <w:bookmarkEnd w:id="42"/>
+      <w:bookmarkStart w:id="42" w:name="example-funnel-progression"/>
+      <w:bookmarkStart w:id="43" w:name="_Toc229646211"/>
+      <w:bookmarkEnd w:id="36"/>
+      <w:bookmarkEnd w:id="40"/>
       <w:r>
         <w:rPr>
           <w:color w:val="auto"/>
@@ -4825,8 +4670,8 @@
           <w:color w:val="auto"/>
         </w:rPr>
       </w:pPr>
-      <w:bookmarkStart w:id="45" w:name="_Toc229582220"/>
-      <w:bookmarkStart w:id="46" w:name="awareness-stage"/>
+      <w:bookmarkStart w:id="44" w:name="awareness-stage"/>
+      <w:bookmarkStart w:id="45" w:name="_Toc229646212"/>
       <w:r>
         <w:rPr>
           <w:color w:val="auto"/>
@@ -4887,9 +4732,9 @@
           <w:color w:val="auto"/>
         </w:rPr>
       </w:pPr>
-      <w:bookmarkStart w:id="47" w:name="_Toc229582221"/>
-      <w:bookmarkStart w:id="48" w:name="engagement-stage"/>
-      <w:bookmarkEnd w:id="46"/>
+      <w:bookmarkStart w:id="46" w:name="engagement-stage"/>
+      <w:bookmarkStart w:id="47" w:name="_Toc229646213"/>
+      <w:bookmarkEnd w:id="44"/>
       <w:r>
         <w:rPr>
           <w:color w:val="auto"/>
@@ -4950,9 +4795,9 @@
           <w:color w:val="auto"/>
         </w:rPr>
       </w:pPr>
-      <w:bookmarkStart w:id="49" w:name="_Toc229582222"/>
-      <w:bookmarkStart w:id="50" w:name="evaluation-stage"/>
-      <w:bookmarkEnd w:id="48"/>
+      <w:bookmarkStart w:id="48" w:name="evaluation-stage"/>
+      <w:bookmarkStart w:id="49" w:name="_Toc229646214"/>
+      <w:bookmarkEnd w:id="46"/>
       <w:r>
         <w:rPr>
           <w:color w:val="auto"/>
@@ -5013,9 +4858,9 @@
           <w:color w:val="auto"/>
         </w:rPr>
       </w:pPr>
-      <w:bookmarkStart w:id="51" w:name="_Toc229582223"/>
-      <w:bookmarkStart w:id="52" w:name="follow-up-stage"/>
-      <w:bookmarkEnd w:id="50"/>
+      <w:bookmarkStart w:id="50" w:name="follow-up-stage"/>
+      <w:bookmarkStart w:id="51" w:name="_Toc229646215"/>
+      <w:bookmarkEnd w:id="48"/>
       <w:r>
         <w:rPr>
           <w:color w:val="auto"/>
@@ -5089,10 +4934,10 @@
           <w:color w:val="auto"/>
         </w:rPr>
       </w:pPr>
-      <w:bookmarkStart w:id="53" w:name="_Toc229582224"/>
-      <w:bookmarkStart w:id="54" w:name="current-capabilities"/>
-      <w:bookmarkEnd w:id="44"/>
-      <w:bookmarkEnd w:id="52"/>
+      <w:bookmarkStart w:id="52" w:name="current-capabilities"/>
+      <w:bookmarkStart w:id="53" w:name="_Toc229646216"/>
+      <w:bookmarkEnd w:id="42"/>
+      <w:bookmarkEnd w:id="50"/>
       <w:r>
         <w:rPr>
           <w:color w:val="auto"/>
@@ -5241,9 +5086,9 @@
           <w:color w:val="auto"/>
         </w:rPr>
       </w:pPr>
-      <w:bookmarkStart w:id="55" w:name="_Toc229582225"/>
-      <w:bookmarkStart w:id="56" w:name="business-value"/>
-      <w:bookmarkEnd w:id="54"/>
+      <w:bookmarkStart w:id="54" w:name="business-value"/>
+      <w:bookmarkStart w:id="55" w:name="_Toc229646217"/>
+      <w:bookmarkEnd w:id="52"/>
       <w:r>
         <w:rPr>
           <w:color w:val="auto"/>
@@ -5332,9 +5177,9 @@
           <w:color w:val="auto"/>
         </w:rPr>
       </w:pPr>
-      <w:bookmarkStart w:id="57" w:name="_Toc229582226"/>
-      <w:bookmarkStart w:id="58" w:name="final-summary"/>
-      <w:bookmarkEnd w:id="56"/>
+      <w:bookmarkStart w:id="56" w:name="final-summary"/>
+      <w:bookmarkStart w:id="57" w:name="_Toc229646218"/>
+      <w:bookmarkEnd w:id="54"/>
       <w:r>
         <w:rPr>
           <w:color w:val="auto"/>
@@ -5431,7 +5276,7 @@
       <w:r>
         <w:t>The workflows help prospects quickly understand where they stand while giving partners and GTM teams a scalable way to initiate meaningful compliance-readiness conversations.</w:t>
       </w:r>
-      <w:bookmarkEnd w:id="58"/>
+      <w:bookmarkEnd w:id="56"/>
     </w:p>
     <w:sectPr>
       <w:footnotePr>

</xml_diff>

<commit_message>
docs: fine tunie the presentation
</commit_message>
<xml_diff>
--- a/opsfolio-branding/marketing-assets/partner enablement/opsfolio_lead_magnets_tour_public_partner_enablement.docx
+++ b/opsfolio-branding/marketing-assets/partner enablement/opsfolio_lead_magnets_tour_public_partner_enablement.docx
@@ -21,13 +21,13 @@
               <w:noProof/>
             </w:rPr>
             <w:drawing>
-              <wp:anchor distT="0" distB="0" distL="114300" distR="114300" simplePos="0" relativeHeight="251646976" behindDoc="1" locked="0" layoutInCell="1" allowOverlap="1" wp14:anchorId="24AC2418" wp14:editId="24EA478C">
+              <wp:anchor distT="0" distB="0" distL="114300" distR="114300" simplePos="0" relativeHeight="251654144" behindDoc="1" locked="0" layoutInCell="1" allowOverlap="1" wp14:anchorId="24AC2418" wp14:editId="48429845">
                 <wp:simplePos x="0" y="0"/>
                 <wp:positionH relativeFrom="column">
                   <wp:posOffset>-939800</wp:posOffset>
                 </wp:positionH>
                 <wp:positionV relativeFrom="paragraph">
-                  <wp:posOffset>369941</wp:posOffset>
+                  <wp:posOffset>388620</wp:posOffset>
                 </wp:positionV>
                 <wp:extent cx="7824158" cy="7824158"/>
                 <wp:effectExtent l="0" t="0" r="0" b="0"/>
@@ -97,46 +97,12 @@
             <w:rPr>
               <w:noProof/>
             </w:rPr>
-            <w:pict w14:anchorId="363B6E62">
-              <v:rect id="_x0000_s1046" style="position:absolute;left:0;text-align:left;margin-left:301.95pt;margin-top:548.5pt;width:203.1pt;height:46.85pt;z-index:251663360;mso-position-horizontal-relative:text;mso-position-vertical-relative:text" filled="f" stroked="f">
-                <v:textbox style="mso-next-textbox:#_x0000_s1046">
-                  <w:txbxContent>
-                    <w:p>
-                      <w:pPr>
-                        <w:jc w:val="right"/>
-                        <w:rPr>
-                          <w:lang w:val="en-IN"/>
-                        </w:rPr>
-                      </w:pPr>
-                      <w:r>
-                        <w:rPr>
-                          <w:lang w:val="en-IN"/>
-                        </w:rPr>
-                        <w:t>Netspective Communications</w:t>
-                      </w:r>
-                      <w:r>
-                        <w:rPr>
-                          <w:lang w:val="en-IN"/>
-                        </w:rPr>
-                        <w:br/>
-                        <w:t>May 13, 2026</w:t>
-                      </w:r>
-                    </w:p>
-                  </w:txbxContent>
-                </v:textbox>
-              </v:rect>
-            </w:pict>
-          </w:r>
-          <w:r>
-            <w:rPr>
-              <w:noProof/>
-            </w:rPr>
             <w:pict w14:anchorId="7894E603">
               <v:shapetype id="_x0000_t202" coordsize="21600,21600" o:spt="202" path="m,l,21600r21600,l21600,xe">
                 <v:stroke joinstyle="miter"/>
                 <v:path gradientshapeok="t" o:connecttype="rect"/>
               </v:shapetype>
-              <v:shape id="Text Box 131" o:spid="_x0000_s1045" type="#_x0000_t202" style="position:absolute;left:0;text-align:left;margin-left:91.5pt;margin-top:383.25pt;width:327.5pt;height:114.6pt;z-index:251660288;visibility:visible;mso-height-percent:350;mso-wrap-distance-left:14.4pt;mso-wrap-distance-top:0;mso-wrap-distance-right:14.4pt;mso-wrap-distance-bottom:0;mso-position-horizontal-relative:margin;mso-position-vertical-relative:page;mso-height-percent:350;mso-width-relative:margin;mso-height-relative:page;v-text-anchor:top" filled="f" stroked="f" strokeweight=".5pt">
+              <v:shape id="Text Box 131" o:spid="_x0000_s1045" type="#_x0000_t202" style="position:absolute;left:0;text-align:left;margin-left:91.5pt;margin-top:423.75pt;width:327.5pt;height:98.8pt;z-index:251658240;visibility:visible;mso-height-percent:350;mso-wrap-distance-left:14.4pt;mso-wrap-distance-top:0;mso-wrap-distance-right:14.4pt;mso-wrap-distance-bottom:0;mso-position-horizontal-relative:margin;mso-position-vertical-relative:page;mso-height-percent:350;mso-width-relative:margin;mso-height-relative:page;v-text-anchor:top" filled="f" stroked="f" strokeweight=".5pt">
                 <v:textbox style="mso-next-textbox:#Text Box 131;mso-fit-shape-to-text:t" inset="0,0,0,0">
                   <w:txbxContent>
                     <w:p>
@@ -257,8 +223,42 @@
             <w:rPr>
               <w:noProof/>
             </w:rPr>
+            <w:pict w14:anchorId="363B6E62">
+              <v:rect id="_x0000_s1046" style="position:absolute;left:0;text-align:left;margin-left:274.95pt;margin-top:550pt;width:203.1pt;height:46.85pt;z-index:251659264;mso-position-horizontal-relative:text;mso-position-vertical-relative:text" filled="f" stroked="f">
+                <v:textbox style="mso-next-textbox:#_x0000_s1046">
+                  <w:txbxContent>
+                    <w:p>
+                      <w:pPr>
+                        <w:jc w:val="right"/>
+                        <w:rPr>
+                          <w:lang w:val="en-IN"/>
+                        </w:rPr>
+                      </w:pPr>
+                      <w:r>
+                        <w:rPr>
+                          <w:lang w:val="en-IN"/>
+                        </w:rPr>
+                        <w:t>Netspective Communications</w:t>
+                      </w:r>
+                      <w:r>
+                        <w:rPr>
+                          <w:lang w:val="en-IN"/>
+                        </w:rPr>
+                        <w:br/>
+                        <w:t>May 13, 2026</w:t>
+                      </w:r>
+                    </w:p>
+                  </w:txbxContent>
+                </v:textbox>
+              </v:rect>
+            </w:pict>
+          </w:r>
+          <w:r>
+            <w:rPr>
+              <w:noProof/>
+            </w:rPr>
             <w:drawing>
-              <wp:anchor distT="0" distB="0" distL="114300" distR="114300" simplePos="0" relativeHeight="251662336" behindDoc="0" locked="0" layoutInCell="1" allowOverlap="1" wp14:anchorId="51401E60" wp14:editId="75CF8190">
+              <wp:anchor distT="0" distB="0" distL="114300" distR="114300" simplePos="0" relativeHeight="251656192" behindDoc="0" locked="0" layoutInCell="1" allowOverlap="1" wp14:anchorId="51401E60" wp14:editId="75CF8190">
                 <wp:simplePos x="0" y="0"/>
                 <wp:positionH relativeFrom="column">
                   <wp:posOffset>1146810</wp:posOffset>
@@ -384,7 +384,7 @@
           <w:r>
             <w:fldChar w:fldCharType="separate"/>
           </w:r>
-          <w:hyperlink w:anchor="_Toc229646191" w:history="1">
+          <w:hyperlink w:anchor="_Toc229651007" w:history="1">
             <w:r>
               <w:rPr>
                 <w:rStyle w:val="Hyperlink"/>
@@ -411,7 +411,7 @@
                 <w:noProof/>
                 <w:webHidden/>
               </w:rPr>
-              <w:instrText xml:space="preserve"> PAGEREF _Toc229646191 \h </w:instrText>
+              <w:instrText xml:space="preserve"> PAGEREF _Toc229651007 \h </w:instrText>
             </w:r>
             <w:r>
               <w:rPr>
@@ -455,7 +455,7 @@
               <w14:ligatures w14:val="standardContextual"/>
             </w:rPr>
           </w:pPr>
-          <w:hyperlink w:anchor="_Toc229646192" w:history="1">
+          <w:hyperlink w:anchor="_Toc229651008" w:history="1">
             <w:r>
               <w:rPr>
                 <w:rStyle w:val="Hyperlink"/>
@@ -482,7 +482,7 @@
                 <w:noProof/>
                 <w:webHidden/>
               </w:rPr>
-              <w:instrText xml:space="preserve"> PAGEREF _Toc229646192 \h </w:instrText>
+              <w:instrText xml:space="preserve"> PAGEREF _Toc229651008 \h </w:instrText>
             </w:r>
             <w:r>
               <w:rPr>
@@ -526,7 +526,7 @@
               <w14:ligatures w14:val="standardContextual"/>
             </w:rPr>
           </w:pPr>
-          <w:hyperlink w:anchor="_Toc229646193" w:history="1">
+          <w:hyperlink w:anchor="_Toc229651009" w:history="1">
             <w:r>
               <w:rPr>
                 <w:rStyle w:val="Hyperlink"/>
@@ -553,7 +553,7 @@
                 <w:noProof/>
                 <w:webHidden/>
               </w:rPr>
-              <w:instrText xml:space="preserve"> PAGEREF _Toc229646193 \h </w:instrText>
+              <w:instrText xml:space="preserve"> PAGEREF _Toc229651009 \h </w:instrText>
             </w:r>
             <w:r>
               <w:rPr>
@@ -597,7 +597,7 @@
               <w14:ligatures w14:val="standardContextual"/>
             </w:rPr>
           </w:pPr>
-          <w:hyperlink w:anchor="_Toc229646194" w:history="1">
+          <w:hyperlink w:anchor="_Toc229651010" w:history="1">
             <w:r>
               <w:rPr>
                 <w:rStyle w:val="Hyperlink"/>
@@ -624,7 +624,7 @@
                 <w:noProof/>
                 <w:webHidden/>
               </w:rPr>
-              <w:instrText xml:space="preserve"> PAGEREF _Toc229646194 \h </w:instrText>
+              <w:instrText xml:space="preserve"> PAGEREF _Toc229651010 \h </w:instrText>
             </w:r>
             <w:r>
               <w:rPr>
@@ -668,7 +668,7 @@
               <w14:ligatures w14:val="standardContextual"/>
             </w:rPr>
           </w:pPr>
-          <w:hyperlink w:anchor="_Toc229646195" w:history="1">
+          <w:hyperlink w:anchor="_Toc229651011" w:history="1">
             <w:r>
               <w:rPr>
                 <w:rStyle w:val="Hyperlink"/>
@@ -695,7 +695,7 @@
                 <w:noProof/>
                 <w:webHidden/>
               </w:rPr>
-              <w:instrText xml:space="preserve"> PAGEREF _Toc229646195 \h </w:instrText>
+              <w:instrText xml:space="preserve"> PAGEREF _Toc229651011 \h </w:instrText>
             </w:r>
             <w:r>
               <w:rPr>
@@ -739,7 +739,7 @@
               <w14:ligatures w14:val="standardContextual"/>
             </w:rPr>
           </w:pPr>
-          <w:hyperlink w:anchor="_Toc229646196" w:history="1">
+          <w:hyperlink w:anchor="_Toc229651012" w:history="1">
             <w:r>
               <w:rPr>
                 <w:rStyle w:val="Hyperlink"/>
@@ -766,7 +766,7 @@
                 <w:noProof/>
                 <w:webHidden/>
               </w:rPr>
-              <w:instrText xml:space="preserve"> PAGEREF _Toc229646196 \h </w:instrText>
+              <w:instrText xml:space="preserve"> PAGEREF _Toc229651012 \h </w:instrText>
             </w:r>
             <w:r>
               <w:rPr>
@@ -810,7 +810,7 @@
               <w14:ligatures w14:val="standardContextual"/>
             </w:rPr>
           </w:pPr>
-          <w:hyperlink w:anchor="_Toc229646197" w:history="1">
+          <w:hyperlink w:anchor="_Toc229651013" w:history="1">
             <w:r>
               <w:rPr>
                 <w:rStyle w:val="Hyperlink"/>
@@ -837,7 +837,7 @@
                 <w:noProof/>
                 <w:webHidden/>
               </w:rPr>
-              <w:instrText xml:space="preserve"> PAGEREF _Toc229646197 \h </w:instrText>
+              <w:instrText xml:space="preserve"> PAGEREF _Toc229651013 \h </w:instrText>
             </w:r>
             <w:r>
               <w:rPr>
@@ -881,7 +881,7 @@
               <w14:ligatures w14:val="standardContextual"/>
             </w:rPr>
           </w:pPr>
-          <w:hyperlink w:anchor="_Toc229646198" w:history="1">
+          <w:hyperlink w:anchor="_Toc229651014" w:history="1">
             <w:r>
               <w:rPr>
                 <w:rStyle w:val="Hyperlink"/>
@@ -908,7 +908,7 @@
                 <w:noProof/>
                 <w:webHidden/>
               </w:rPr>
-              <w:instrText xml:space="preserve"> PAGEREF _Toc229646198 \h </w:instrText>
+              <w:instrText xml:space="preserve"> PAGEREF _Toc229651014 \h </w:instrText>
             </w:r>
             <w:r>
               <w:rPr>
@@ -952,7 +952,7 @@
               <w14:ligatures w14:val="standardContextual"/>
             </w:rPr>
           </w:pPr>
-          <w:hyperlink w:anchor="_Toc229646199" w:history="1">
+          <w:hyperlink w:anchor="_Toc229651015" w:history="1">
             <w:r>
               <w:rPr>
                 <w:rStyle w:val="Hyperlink"/>
@@ -979,7 +979,7 @@
                 <w:noProof/>
                 <w:webHidden/>
               </w:rPr>
-              <w:instrText xml:space="preserve"> PAGEREF _Toc229646199 \h </w:instrText>
+              <w:instrText xml:space="preserve"> PAGEREF _Toc229651015 \h </w:instrText>
             </w:r>
             <w:r>
               <w:rPr>
@@ -1023,7 +1023,7 @@
               <w14:ligatures w14:val="standardContextual"/>
             </w:rPr>
           </w:pPr>
-          <w:hyperlink w:anchor="_Toc229646200" w:history="1">
+          <w:hyperlink w:anchor="_Toc229651016" w:history="1">
             <w:r>
               <w:rPr>
                 <w:rStyle w:val="Hyperlink"/>
@@ -1050,7 +1050,7 @@
                 <w:noProof/>
                 <w:webHidden/>
               </w:rPr>
-              <w:instrText xml:space="preserve"> PAGEREF _Toc229646200 \h </w:instrText>
+              <w:instrText xml:space="preserve"> PAGEREF _Toc229651016 \h </w:instrText>
             </w:r>
             <w:r>
               <w:rPr>
@@ -1070,7 +1070,7 @@
                 <w:noProof/>
                 <w:webHidden/>
               </w:rPr>
-              <w:t>1</w:t>
+              <w:t>5</w:t>
             </w:r>
             <w:r>
               <w:rPr>
@@ -1094,7 +1094,7 @@
               <w14:ligatures w14:val="standardContextual"/>
             </w:rPr>
           </w:pPr>
-          <w:hyperlink w:anchor="_Toc229646201" w:history="1">
+          <w:hyperlink w:anchor="_Toc229651017" w:history="1">
             <w:r>
               <w:rPr>
                 <w:rStyle w:val="Hyperlink"/>
@@ -1121,7 +1121,7 @@
                 <w:noProof/>
                 <w:webHidden/>
               </w:rPr>
-              <w:instrText xml:space="preserve"> PAGEREF _Toc229646201 \h </w:instrText>
+              <w:instrText xml:space="preserve"> PAGEREF _Toc229651017 \h </w:instrText>
             </w:r>
             <w:r>
               <w:rPr>
@@ -1141,7 +1141,7 @@
                 <w:noProof/>
                 <w:webHidden/>
               </w:rPr>
-              <w:t>1</w:t>
+              <w:t>5</w:t>
             </w:r>
             <w:r>
               <w:rPr>
@@ -1165,7 +1165,7 @@
               <w14:ligatures w14:val="standardContextual"/>
             </w:rPr>
           </w:pPr>
-          <w:hyperlink w:anchor="_Toc229646202" w:history="1">
+          <w:hyperlink w:anchor="_Toc229651018" w:history="1">
             <w:r>
               <w:rPr>
                 <w:rStyle w:val="Hyperlink"/>
@@ -1192,7 +1192,7 @@
                 <w:noProof/>
                 <w:webHidden/>
               </w:rPr>
-              <w:instrText xml:space="preserve"> PAGEREF _Toc229646202 \h </w:instrText>
+              <w:instrText xml:space="preserve"> PAGEREF _Toc229651018 \h </w:instrText>
             </w:r>
             <w:r>
               <w:rPr>
@@ -1212,7 +1212,7 @@
                 <w:noProof/>
                 <w:webHidden/>
               </w:rPr>
-              <w:t>2</w:t>
+              <w:t>6</w:t>
             </w:r>
             <w:r>
               <w:rPr>
@@ -1236,7 +1236,7 @@
               <w14:ligatures w14:val="standardContextual"/>
             </w:rPr>
           </w:pPr>
-          <w:hyperlink w:anchor="_Toc229646203" w:history="1">
+          <w:hyperlink w:anchor="_Toc229651019" w:history="1">
             <w:r>
               <w:rPr>
                 <w:rStyle w:val="Hyperlink"/>
@@ -1263,7 +1263,7 @@
                 <w:noProof/>
                 <w:webHidden/>
               </w:rPr>
-              <w:instrText xml:space="preserve"> PAGEREF _Toc229646203 \h </w:instrText>
+              <w:instrText xml:space="preserve"> PAGEREF _Toc229651019 \h </w:instrText>
             </w:r>
             <w:r>
               <w:rPr>
@@ -1283,7 +1283,7 @@
                 <w:noProof/>
                 <w:webHidden/>
               </w:rPr>
-              <w:t>2</w:t>
+              <w:t>6</w:t>
             </w:r>
             <w:r>
               <w:rPr>
@@ -1307,7 +1307,7 @@
               <w14:ligatures w14:val="standardContextual"/>
             </w:rPr>
           </w:pPr>
-          <w:hyperlink w:anchor="_Toc229646204" w:history="1">
+          <w:hyperlink w:anchor="_Toc229651020" w:history="1">
             <w:r>
               <w:rPr>
                 <w:rStyle w:val="Hyperlink"/>
@@ -1334,7 +1334,7 @@
                 <w:noProof/>
                 <w:webHidden/>
               </w:rPr>
-              <w:instrText xml:space="preserve"> PAGEREF _Toc229646204 \h </w:instrText>
+              <w:instrText xml:space="preserve"> PAGEREF _Toc229651020 \h </w:instrText>
             </w:r>
             <w:r>
               <w:rPr>
@@ -1354,7 +1354,7 @@
                 <w:noProof/>
                 <w:webHidden/>
               </w:rPr>
-              <w:t>2</w:t>
+              <w:t>6</w:t>
             </w:r>
             <w:r>
               <w:rPr>
@@ -1378,7 +1378,7 @@
               <w14:ligatures w14:val="standardContextual"/>
             </w:rPr>
           </w:pPr>
-          <w:hyperlink w:anchor="_Toc229646205" w:history="1">
+          <w:hyperlink w:anchor="_Toc229651021" w:history="1">
             <w:r>
               <w:rPr>
                 <w:rStyle w:val="Hyperlink"/>
@@ -1405,7 +1405,7 @@
                 <w:noProof/>
                 <w:webHidden/>
               </w:rPr>
-              <w:instrText xml:space="preserve"> PAGEREF _Toc229646205 \h </w:instrText>
+              <w:instrText xml:space="preserve"> PAGEREF _Toc229651021 \h </w:instrText>
             </w:r>
             <w:r>
               <w:rPr>
@@ -1425,7 +1425,7 @@
                 <w:noProof/>
                 <w:webHidden/>
               </w:rPr>
-              <w:t>4</w:t>
+              <w:t>8</w:t>
             </w:r>
             <w:r>
               <w:rPr>
@@ -1449,7 +1449,7 @@
               <w14:ligatures w14:val="standardContextual"/>
             </w:rPr>
           </w:pPr>
-          <w:hyperlink w:anchor="_Toc229646206" w:history="1">
+          <w:hyperlink w:anchor="_Toc229651022" w:history="1">
             <w:r>
               <w:rPr>
                 <w:rStyle w:val="Hyperlink"/>
@@ -1476,7 +1476,7 @@
                 <w:noProof/>
                 <w:webHidden/>
               </w:rPr>
-              <w:instrText xml:space="preserve"> PAGEREF _Toc229646206 \h </w:instrText>
+              <w:instrText xml:space="preserve"> PAGEREF _Toc229651022 \h </w:instrText>
             </w:r>
             <w:r>
               <w:rPr>
@@ -1496,7 +1496,7 @@
                 <w:noProof/>
                 <w:webHidden/>
               </w:rPr>
-              <w:t>4</w:t>
+              <w:t>8</w:t>
             </w:r>
             <w:r>
               <w:rPr>
@@ -1520,7 +1520,7 @@
               <w14:ligatures w14:val="standardContextual"/>
             </w:rPr>
           </w:pPr>
-          <w:hyperlink w:anchor="_Toc229646207" w:history="1">
+          <w:hyperlink w:anchor="_Toc229651023" w:history="1">
             <w:r>
               <w:rPr>
                 <w:rStyle w:val="Hyperlink"/>
@@ -1547,7 +1547,7 @@
                 <w:noProof/>
                 <w:webHidden/>
               </w:rPr>
-              <w:instrText xml:space="preserve"> PAGEREF _Toc229646207 \h </w:instrText>
+              <w:instrText xml:space="preserve"> PAGEREF _Toc229651023 \h </w:instrText>
             </w:r>
             <w:r>
               <w:rPr>
@@ -1567,7 +1567,7 @@
                 <w:noProof/>
                 <w:webHidden/>
               </w:rPr>
-              <w:t>5</w:t>
+              <w:t>9</w:t>
             </w:r>
             <w:r>
               <w:rPr>
@@ -1591,7 +1591,7 @@
               <w14:ligatures w14:val="standardContextual"/>
             </w:rPr>
           </w:pPr>
-          <w:hyperlink w:anchor="_Toc229646208" w:history="1">
+          <w:hyperlink w:anchor="_Toc229651024" w:history="1">
             <w:r>
               <w:rPr>
                 <w:rStyle w:val="Hyperlink"/>
@@ -1618,7 +1618,7 @@
                 <w:noProof/>
                 <w:webHidden/>
               </w:rPr>
-              <w:instrText xml:space="preserve"> PAGEREF _Toc229646208 \h </w:instrText>
+              <w:instrText xml:space="preserve"> PAGEREF _Toc229651024 \h </w:instrText>
             </w:r>
             <w:r>
               <w:rPr>
@@ -1638,7 +1638,7 @@
                 <w:noProof/>
                 <w:webHidden/>
               </w:rPr>
-              <w:t>5</w:t>
+              <w:t>9</w:t>
             </w:r>
             <w:r>
               <w:rPr>
@@ -1662,7 +1662,7 @@
               <w14:ligatures w14:val="standardContextual"/>
             </w:rPr>
           </w:pPr>
-          <w:hyperlink w:anchor="_Toc229646209" w:history="1">
+          <w:hyperlink w:anchor="_Toc229651025" w:history="1">
             <w:r>
               <w:rPr>
                 <w:rStyle w:val="Hyperlink"/>
@@ -1689,7 +1689,7 @@
                 <w:noProof/>
                 <w:webHidden/>
               </w:rPr>
-              <w:instrText xml:space="preserve"> PAGEREF _Toc229646209 \h </w:instrText>
+              <w:instrText xml:space="preserve"> PAGEREF _Toc229651025 \h </w:instrText>
             </w:r>
             <w:r>
               <w:rPr>
@@ -1709,7 +1709,7 @@
                 <w:noProof/>
                 <w:webHidden/>
               </w:rPr>
-              <w:t>5</w:t>
+              <w:t>9</w:t>
             </w:r>
             <w:r>
               <w:rPr>
@@ -1733,7 +1733,7 @@
               <w14:ligatures w14:val="standardContextual"/>
             </w:rPr>
           </w:pPr>
-          <w:hyperlink w:anchor="_Toc229646210" w:history="1">
+          <w:hyperlink w:anchor="_Toc229651026" w:history="1">
             <w:r>
               <w:rPr>
                 <w:rStyle w:val="Hyperlink"/>
@@ -1760,7 +1760,7 @@
                 <w:noProof/>
                 <w:webHidden/>
               </w:rPr>
-              <w:instrText xml:space="preserve"> PAGEREF _Toc229646210 \h </w:instrText>
+              <w:instrText xml:space="preserve"> PAGEREF _Toc229651026 \h </w:instrText>
             </w:r>
             <w:r>
               <w:rPr>
@@ -1780,7 +1780,7 @@
                 <w:noProof/>
                 <w:webHidden/>
               </w:rPr>
-              <w:t>5</w:t>
+              <w:t>9</w:t>
             </w:r>
             <w:r>
               <w:rPr>
@@ -1804,7 +1804,7 @@
               <w14:ligatures w14:val="standardContextual"/>
             </w:rPr>
           </w:pPr>
-          <w:hyperlink w:anchor="_Toc229646211" w:history="1">
+          <w:hyperlink w:anchor="_Toc229651027" w:history="1">
             <w:r>
               <w:rPr>
                 <w:rStyle w:val="Hyperlink"/>
@@ -1831,7 +1831,7 @@
                 <w:noProof/>
                 <w:webHidden/>
               </w:rPr>
-              <w:instrText xml:space="preserve"> PAGEREF _Toc229646211 \h </w:instrText>
+              <w:instrText xml:space="preserve"> PAGEREF _Toc229651027 \h </w:instrText>
             </w:r>
             <w:r>
               <w:rPr>
@@ -1851,7 +1851,7 @@
                 <w:noProof/>
                 <w:webHidden/>
               </w:rPr>
-              <w:t>6</w:t>
+              <w:t>10</w:t>
             </w:r>
             <w:r>
               <w:rPr>
@@ -1875,7 +1875,7 @@
               <w14:ligatures w14:val="standardContextual"/>
             </w:rPr>
           </w:pPr>
-          <w:hyperlink w:anchor="_Toc229646212" w:history="1">
+          <w:hyperlink w:anchor="_Toc229651028" w:history="1">
             <w:r>
               <w:rPr>
                 <w:rStyle w:val="Hyperlink"/>
@@ -1902,7 +1902,7 @@
                 <w:noProof/>
                 <w:webHidden/>
               </w:rPr>
-              <w:instrText xml:space="preserve"> PAGEREF _Toc229646212 \h </w:instrText>
+              <w:instrText xml:space="preserve"> PAGEREF _Toc229651028 \h </w:instrText>
             </w:r>
             <w:r>
               <w:rPr>
@@ -1922,7 +1922,7 @@
                 <w:noProof/>
                 <w:webHidden/>
               </w:rPr>
-              <w:t>6</w:t>
+              <w:t>10</w:t>
             </w:r>
             <w:r>
               <w:rPr>
@@ -1946,7 +1946,7 @@
               <w14:ligatures w14:val="standardContextual"/>
             </w:rPr>
           </w:pPr>
-          <w:hyperlink w:anchor="_Toc229646213" w:history="1">
+          <w:hyperlink w:anchor="_Toc229651029" w:history="1">
             <w:r>
               <w:rPr>
                 <w:rStyle w:val="Hyperlink"/>
@@ -1973,7 +1973,7 @@
                 <w:noProof/>
                 <w:webHidden/>
               </w:rPr>
-              <w:instrText xml:space="preserve"> PAGEREF _Toc229646213 \h </w:instrText>
+              <w:instrText xml:space="preserve"> PAGEREF _Toc229651029 \h </w:instrText>
             </w:r>
             <w:r>
               <w:rPr>
@@ -1993,7 +1993,7 @@
                 <w:noProof/>
                 <w:webHidden/>
               </w:rPr>
-              <w:t>6</w:t>
+              <w:t>10</w:t>
             </w:r>
             <w:r>
               <w:rPr>
@@ -2017,7 +2017,7 @@
               <w14:ligatures w14:val="standardContextual"/>
             </w:rPr>
           </w:pPr>
-          <w:hyperlink w:anchor="_Toc229646214" w:history="1">
+          <w:hyperlink w:anchor="_Toc229651030" w:history="1">
             <w:r>
               <w:rPr>
                 <w:rStyle w:val="Hyperlink"/>
@@ -2044,7 +2044,7 @@
                 <w:noProof/>
                 <w:webHidden/>
               </w:rPr>
-              <w:instrText xml:space="preserve"> PAGEREF _Toc229646214 \h </w:instrText>
+              <w:instrText xml:space="preserve"> PAGEREF _Toc229651030 \h </w:instrText>
             </w:r>
             <w:r>
               <w:rPr>
@@ -2064,7 +2064,7 @@
                 <w:noProof/>
                 <w:webHidden/>
               </w:rPr>
-              <w:t>6</w:t>
+              <w:t>10</w:t>
             </w:r>
             <w:r>
               <w:rPr>
@@ -2088,7 +2088,7 @@
               <w14:ligatures w14:val="standardContextual"/>
             </w:rPr>
           </w:pPr>
-          <w:hyperlink w:anchor="_Toc229646215" w:history="1">
+          <w:hyperlink w:anchor="_Toc229651031" w:history="1">
             <w:r>
               <w:rPr>
                 <w:rStyle w:val="Hyperlink"/>
@@ -2115,7 +2115,7 @@
                 <w:noProof/>
                 <w:webHidden/>
               </w:rPr>
-              <w:instrText xml:space="preserve"> PAGEREF _Toc229646215 \h </w:instrText>
+              <w:instrText xml:space="preserve"> PAGEREF _Toc229651031 \h </w:instrText>
             </w:r>
             <w:r>
               <w:rPr>
@@ -2135,7 +2135,7 @@
                 <w:noProof/>
                 <w:webHidden/>
               </w:rPr>
-              <w:t>6</w:t>
+              <w:t>10</w:t>
             </w:r>
             <w:r>
               <w:rPr>
@@ -2159,7 +2159,7 @@
               <w14:ligatures w14:val="standardContextual"/>
             </w:rPr>
           </w:pPr>
-          <w:hyperlink w:anchor="_Toc229646216" w:history="1">
+          <w:hyperlink w:anchor="_Toc229651032" w:history="1">
             <w:r>
               <w:rPr>
                 <w:rStyle w:val="Hyperlink"/>
@@ -2186,7 +2186,7 @@
                 <w:noProof/>
                 <w:webHidden/>
               </w:rPr>
-              <w:instrText xml:space="preserve"> PAGEREF _Toc229646216 \h </w:instrText>
+              <w:instrText xml:space="preserve"> PAGEREF _Toc229651032 \h </w:instrText>
             </w:r>
             <w:r>
               <w:rPr>
@@ -2206,7 +2206,7 @@
                 <w:noProof/>
                 <w:webHidden/>
               </w:rPr>
-              <w:t>7</w:t>
+              <w:t>11</w:t>
             </w:r>
             <w:r>
               <w:rPr>
@@ -2230,7 +2230,7 @@
               <w14:ligatures w14:val="standardContextual"/>
             </w:rPr>
           </w:pPr>
-          <w:hyperlink w:anchor="_Toc229646217" w:history="1">
+          <w:hyperlink w:anchor="_Toc229651033" w:history="1">
             <w:r>
               <w:rPr>
                 <w:rStyle w:val="Hyperlink"/>
@@ -2257,7 +2257,7 @@
                 <w:noProof/>
                 <w:webHidden/>
               </w:rPr>
-              <w:instrText xml:space="preserve"> PAGEREF _Toc229646217 \h </w:instrText>
+              <w:instrText xml:space="preserve"> PAGEREF _Toc229651033 \h </w:instrText>
             </w:r>
             <w:r>
               <w:rPr>
@@ -2277,7 +2277,7 @@
                 <w:noProof/>
                 <w:webHidden/>
               </w:rPr>
-              <w:t>7</w:t>
+              <w:t>11</w:t>
             </w:r>
             <w:r>
               <w:rPr>
@@ -2301,7 +2301,7 @@
               <w14:ligatures w14:val="standardContextual"/>
             </w:rPr>
           </w:pPr>
-          <w:hyperlink w:anchor="_Toc229646218" w:history="1">
+          <w:hyperlink w:anchor="_Toc229651034" w:history="1">
             <w:r>
               <w:rPr>
                 <w:rStyle w:val="Hyperlink"/>
@@ -2328,7 +2328,7 @@
                 <w:noProof/>
                 <w:webHidden/>
               </w:rPr>
-              <w:instrText xml:space="preserve"> PAGEREF _Toc229646218 \h </w:instrText>
+              <w:instrText xml:space="preserve"> PAGEREF _Toc229651034 \h </w:instrText>
             </w:r>
             <w:r>
               <w:rPr>
@@ -2348,7 +2348,7 @@
                 <w:noProof/>
                 <w:webHidden/>
               </w:rPr>
-              <w:t>8</w:t>
+              <w:t>12</w:t>
             </w:r>
             <w:r>
               <w:rPr>
@@ -2378,7 +2378,7 @@
           <w:color w:val="auto"/>
         </w:rPr>
       </w:pPr>
-      <w:bookmarkStart w:id="1" w:name="_Toc229646191"/>
+      <w:bookmarkStart w:id="1" w:name="_Toc229651007"/>
       <w:r>
         <w:rPr>
           <w:color w:val="auto"/>
@@ -2404,7 +2404,7 @@
         </w:rPr>
       </w:pPr>
       <w:bookmarkStart w:id="2" w:name="overview"/>
-      <w:bookmarkStart w:id="3" w:name="_Toc229646192"/>
+      <w:bookmarkStart w:id="3" w:name="_Toc229651008"/>
       <w:r>
         <w:rPr>
           <w:color w:val="auto"/>
@@ -2653,7 +2653,7 @@
         </w:rPr>
       </w:pPr>
       <w:bookmarkStart w:id="4" w:name="customer-journey-overview"/>
-      <w:bookmarkStart w:id="5" w:name="_Toc229646193"/>
+      <w:bookmarkStart w:id="5" w:name="_Toc229651009"/>
       <w:bookmarkEnd w:id="0"/>
       <w:bookmarkEnd w:id="2"/>
       <w:r>
@@ -2673,7 +2673,7 @@
         </w:rPr>
       </w:pPr>
       <w:bookmarkStart w:id="6" w:name="typical-lead-journey"/>
-      <w:bookmarkStart w:id="7" w:name="_Toc229646194"/>
+      <w:bookmarkStart w:id="7" w:name="_Toc229651010"/>
       <w:r>
         <w:rPr>
           <w:color w:val="auto"/>
@@ -2803,7 +2803,7 @@
         </w:rPr>
       </w:pPr>
       <w:bookmarkStart w:id="8" w:name="landing-pages-campaign-experience"/>
-      <w:bookmarkStart w:id="9" w:name="_Toc229646195"/>
+      <w:bookmarkStart w:id="9" w:name="_Toc229651011"/>
       <w:bookmarkEnd w:id="4"/>
       <w:bookmarkEnd w:id="6"/>
       <w:r>
@@ -2822,7 +2822,7 @@
         </w:rPr>
       </w:pPr>
       <w:bookmarkStart w:id="10" w:name="example-public-landing-pages"/>
-      <w:bookmarkStart w:id="11" w:name="_Toc229646196"/>
+      <w:bookmarkStart w:id="11" w:name="_Toc229651012"/>
       <w:r>
         <w:rPr>
           <w:color w:val="auto"/>
@@ -2933,7 +2933,7 @@
           <w:noProof/>
         </w:rPr>
         <w:drawing>
-          <wp:inline distT="0" distB="0" distL="0" distR="0" wp14:anchorId="7171A308" wp14:editId="241061B6">
+          <wp:inline distT="0" distB="0" distL="0" distR="0" wp14:anchorId="07A7D8DC" wp14:editId="14C4A1FD">
             <wp:extent cx="5943600" cy="2901315"/>
             <wp:effectExtent l="19050" t="19050" r="0" b="0"/>
             <wp:docPr id="723410919" name="Picture 1"/>
@@ -2985,7 +2985,7 @@
         </w:rPr>
       </w:pPr>
       <w:bookmarkStart w:id="14" w:name="landing-page-goals"/>
-      <w:bookmarkStart w:id="15" w:name="_Toc229646197"/>
+      <w:bookmarkStart w:id="15" w:name="_Toc229651013"/>
       <w:bookmarkEnd w:id="10"/>
       <w:bookmarkEnd w:id="13"/>
       <w:r>
@@ -2995,7 +2995,7 @@
         </w:rPr>
         <w:lastRenderedPageBreak/>
         <w:pict w14:anchorId="46CB9FE6">
-          <v:rect id="_x0000_s1048" style="position:absolute;margin-left:241.5pt;margin-top:23pt;width:225.75pt;height:165pt;z-index:251667968;mso-position-horizontal-relative:text;mso-position-vertical-relative:text" filled="f" strokecolor="#d8d8d8 [2732]"/>
+          <v:rect id="_x0000_s1048" style="position:absolute;margin-left:241.5pt;margin-top:23pt;width:225.75pt;height:165pt;z-index:251660288;mso-position-horizontal-relative:text;mso-position-vertical-relative:text" filled="f" strokecolor="#d8d8d8 [2732]"/>
         </w:pict>
       </w:r>
       <w:r>
@@ -3204,7 +3204,7 @@
         </w:rPr>
       </w:pPr>
       <w:bookmarkStart w:id="16" w:name="sign-up-user-inputs"/>
-      <w:bookmarkStart w:id="17" w:name="_Toc229646198"/>
+      <w:bookmarkStart w:id="17" w:name="_Toc229651014"/>
       <w:bookmarkEnd w:id="8"/>
       <w:bookmarkEnd w:id="14"/>
       <w:r>
@@ -3275,13 +3275,13 @@
         </w:rPr>
       </w:pPr>
       <w:bookmarkStart w:id="18" w:name="initial-sign-up-information"/>
-      <w:bookmarkStart w:id="19" w:name="_Toc229646199"/>
+      <w:bookmarkStart w:id="19" w:name="_Toc229651015"/>
       <w:r>
         <w:rPr>
           <w:noProof/>
         </w:rPr>
         <w:pict w14:anchorId="46CB9FE6">
-          <v:rect id="_x0000_s1049" style="position:absolute;margin-left:241.5pt;margin-top:20.7pt;width:225.75pt;height:70.5pt;z-index:251668992;mso-position-horizontal-relative:text;mso-position-vertical-relative:text" filled="f" strokecolor="#d8d8d8 [2732]"/>
+          <v:rect id="_x0000_s1049" style="position:absolute;margin-left:241.5pt;margin-top:20.7pt;width:225.75pt;height:70.5pt;z-index:251661312;mso-position-horizontal-relative:text;mso-position-vertical-relative:text" filled="f" strokecolor="#d8d8d8 [2732]"/>
         </w:pict>
       </w:r>
       <w:r>
@@ -3392,7 +3392,7 @@
         </w:rPr>
       </w:pPr>
       <w:bookmarkStart w:id="20" w:name="assessment-experience"/>
-      <w:bookmarkStart w:id="21" w:name="_Toc229646200"/>
+      <w:bookmarkStart w:id="21" w:name="_Toc229651016"/>
       <w:bookmarkEnd w:id="16"/>
       <w:bookmarkEnd w:id="18"/>
       <w:r>
@@ -3412,7 +3412,7 @@
         </w:rPr>
       </w:pPr>
       <w:bookmarkStart w:id="22" w:name="cmmc-assessments"/>
-      <w:bookmarkStart w:id="23" w:name="_Toc229646201"/>
+      <w:bookmarkStart w:id="23" w:name="_Toc229651017"/>
       <w:r>
         <w:rPr>
           <w:color w:val="auto"/>
@@ -3442,7 +3442,7 @@
           <w:noProof/>
         </w:rPr>
         <w:drawing>
-          <wp:anchor distT="0" distB="0" distL="114300" distR="114300" simplePos="0" relativeHeight="251656192" behindDoc="0" locked="0" layoutInCell="1" allowOverlap="1" wp14:anchorId="6E34D4D9" wp14:editId="70D777B9">
+          <wp:anchor distT="0" distB="0" distL="114300" distR="114300" simplePos="0" relativeHeight="251655168" behindDoc="0" locked="0" layoutInCell="1" allowOverlap="1" wp14:anchorId="6E34D4D9" wp14:editId="774FAC7C">
             <wp:simplePos x="0" y="0"/>
             <wp:positionH relativeFrom="column">
               <wp:posOffset>4475480</wp:posOffset>
@@ -3689,7 +3689,7 @@
         </w:rPr>
       </w:pPr>
       <w:bookmarkStart w:id="24" w:name="soc-2-readiness-assessments"/>
-      <w:bookmarkStart w:id="25" w:name="_Toc229646202"/>
+      <w:bookmarkStart w:id="25" w:name="_Toc229651018"/>
       <w:bookmarkEnd w:id="22"/>
       <w:r>
         <w:rPr>
@@ -3709,7 +3709,7 @@
           <w:noProof/>
         </w:rPr>
         <w:drawing>
-          <wp:anchor distT="0" distB="0" distL="114300" distR="114300" simplePos="0" relativeHeight="251672576" behindDoc="0" locked="0" layoutInCell="1" allowOverlap="1" wp14:anchorId="76E7A80C" wp14:editId="098BA944">
+          <wp:anchor distT="0" distB="0" distL="114300" distR="114300" simplePos="0" relativeHeight="251657216" behindDoc="0" locked="0" layoutInCell="1" allowOverlap="1" wp14:anchorId="76E7A80C" wp14:editId="098BA944">
             <wp:simplePos x="0" y="0"/>
             <wp:positionH relativeFrom="column">
               <wp:posOffset>4390390</wp:posOffset>
@@ -3913,7 +3913,7 @@
         </w:rPr>
       </w:pPr>
       <w:bookmarkStart w:id="26" w:name="automated-emails-customer-touchpoints"/>
-      <w:bookmarkStart w:id="27" w:name="_Toc229646203"/>
+      <w:bookmarkStart w:id="27" w:name="_Toc229651019"/>
       <w:bookmarkEnd w:id="20"/>
       <w:bookmarkEnd w:id="24"/>
       <w:r>
@@ -3932,7 +3932,7 @@
         </w:rPr>
       </w:pPr>
       <w:bookmarkStart w:id="28" w:name="automated-customer-experience"/>
-      <w:bookmarkStart w:id="29" w:name="_Toc229646204"/>
+      <w:bookmarkStart w:id="29" w:name="_Toc229651020"/>
       <w:r>
         <w:rPr>
           <w:color w:val="auto"/>
@@ -4107,7 +4107,7 @@
         </w:rPr>
       </w:pPr>
       <w:bookmarkStart w:id="30" w:name="reports-outputs-generated"/>
-      <w:bookmarkStart w:id="31" w:name="_Toc229646205"/>
+      <w:bookmarkStart w:id="31" w:name="_Toc229651021"/>
       <w:bookmarkEnd w:id="26"/>
       <w:bookmarkEnd w:id="28"/>
       <w:r>
@@ -4127,7 +4127,7 @@
         </w:rPr>
       </w:pPr>
       <w:bookmarkStart w:id="32" w:name="cmmc-level-1-reports"/>
-      <w:bookmarkStart w:id="33" w:name="_Toc229646206"/>
+      <w:bookmarkStart w:id="33" w:name="_Toc229651022"/>
       <w:r>
         <w:rPr>
           <w:color w:val="auto"/>
@@ -4291,7 +4291,7 @@
         </w:rPr>
       </w:pPr>
       <w:bookmarkStart w:id="34" w:name="soc-2-readiness-reports"/>
-      <w:bookmarkStart w:id="35" w:name="_Toc229646207"/>
+      <w:bookmarkStart w:id="35" w:name="_Toc229651023"/>
       <w:bookmarkEnd w:id="32"/>
       <w:r>
         <w:rPr>
@@ -4375,7 +4375,7 @@
         </w:rPr>
       </w:pPr>
       <w:bookmarkStart w:id="36" w:name="how-channel-partners-can-use-the-system"/>
-      <w:bookmarkStart w:id="37" w:name="_Toc229646208"/>
+      <w:bookmarkStart w:id="37" w:name="_Toc229651024"/>
       <w:bookmarkEnd w:id="30"/>
       <w:bookmarkEnd w:id="34"/>
       <w:r>
@@ -4394,7 +4394,7 @@
         </w:rPr>
       </w:pPr>
       <w:bookmarkStart w:id="38" w:name="partner-driven-campaigns"/>
-      <w:bookmarkStart w:id="39" w:name="_Toc229646209"/>
+      <w:bookmarkStart w:id="39" w:name="_Toc229651025"/>
       <w:r>
         <w:rPr>
           <w:color w:val="auto"/>
@@ -4508,7 +4508,7 @@
         </w:rPr>
       </w:pPr>
       <w:bookmarkStart w:id="40" w:name="why-this-matters-for-partners"/>
-      <w:bookmarkStart w:id="41" w:name="_Toc229646210"/>
+      <w:bookmarkStart w:id="41" w:name="_Toc229651026"/>
       <w:bookmarkEnd w:id="38"/>
       <w:r>
         <w:rPr>
@@ -4652,7 +4652,7 @@
         </w:rPr>
       </w:pPr>
       <w:bookmarkStart w:id="42" w:name="example-funnel-progression"/>
-      <w:bookmarkStart w:id="43" w:name="_Toc229646211"/>
+      <w:bookmarkStart w:id="43" w:name="_Toc229651027"/>
       <w:bookmarkEnd w:id="36"/>
       <w:bookmarkEnd w:id="40"/>
       <w:r>
@@ -4671,7 +4671,7 @@
         </w:rPr>
       </w:pPr>
       <w:bookmarkStart w:id="44" w:name="awareness-stage"/>
-      <w:bookmarkStart w:id="45" w:name="_Toc229646212"/>
+      <w:bookmarkStart w:id="45" w:name="_Toc229651028"/>
       <w:r>
         <w:rPr>
           <w:color w:val="auto"/>
@@ -4733,7 +4733,7 @@
         </w:rPr>
       </w:pPr>
       <w:bookmarkStart w:id="46" w:name="engagement-stage"/>
-      <w:bookmarkStart w:id="47" w:name="_Toc229646213"/>
+      <w:bookmarkStart w:id="47" w:name="_Toc229651029"/>
       <w:bookmarkEnd w:id="44"/>
       <w:r>
         <w:rPr>
@@ -4796,7 +4796,7 @@
         </w:rPr>
       </w:pPr>
       <w:bookmarkStart w:id="48" w:name="evaluation-stage"/>
-      <w:bookmarkStart w:id="49" w:name="_Toc229646214"/>
+      <w:bookmarkStart w:id="49" w:name="_Toc229651030"/>
       <w:bookmarkEnd w:id="46"/>
       <w:r>
         <w:rPr>
@@ -4859,7 +4859,7 @@
         </w:rPr>
       </w:pPr>
       <w:bookmarkStart w:id="50" w:name="follow-up-stage"/>
-      <w:bookmarkStart w:id="51" w:name="_Toc229646215"/>
+      <w:bookmarkStart w:id="51" w:name="_Toc229651031"/>
       <w:bookmarkEnd w:id="48"/>
       <w:r>
         <w:rPr>
@@ -4935,7 +4935,7 @@
         </w:rPr>
       </w:pPr>
       <w:bookmarkStart w:id="52" w:name="current-capabilities"/>
-      <w:bookmarkStart w:id="53" w:name="_Toc229646216"/>
+      <w:bookmarkStart w:id="53" w:name="_Toc229651032"/>
       <w:bookmarkEnd w:id="42"/>
       <w:bookmarkEnd w:id="50"/>
       <w:r>
@@ -5087,7 +5087,7 @@
         </w:rPr>
       </w:pPr>
       <w:bookmarkStart w:id="54" w:name="business-value"/>
-      <w:bookmarkStart w:id="55" w:name="_Toc229646217"/>
+      <w:bookmarkStart w:id="55" w:name="_Toc229651033"/>
       <w:bookmarkEnd w:id="52"/>
       <w:r>
         <w:rPr>
@@ -5178,7 +5178,7 @@
         </w:rPr>
       </w:pPr>
       <w:bookmarkStart w:id="56" w:name="final-summary"/>
-      <w:bookmarkStart w:id="57" w:name="_Toc229646218"/>
+      <w:bookmarkStart w:id="57" w:name="_Toc229651034"/>
       <w:bookmarkEnd w:id="54"/>
       <w:r>
         <w:rPr>
@@ -5285,7 +5285,7 @@
       <w:type w:val="continuous"/>
       <w:pgSz w:w="12240" w:h="15840"/>
       <w:pgMar w:top="1440" w:right="1440" w:bottom="1440" w:left="1440" w:header="720" w:footer="720" w:gutter="0"/>
-      <w:pgNumType w:start="0"/>
+      <w:pgNumType w:start="4"/>
       <w:cols w:space="720"/>
       <w:titlePg/>
       <w:docGrid w:linePitch="326"/>
@@ -5323,7 +5323,7 @@
 <w:ftr xmlns:wpc="http://schemas.microsoft.com/office/word/2010/wordprocessingCanvas" xmlns:cx="http://schemas.microsoft.com/office/drawing/2014/chartex" xmlns:cx1="http://schemas.microsoft.com/office/drawing/2015/9/8/chartex" xmlns:cx2="http://schemas.microsoft.com/office/drawing/2015/10/21/chartex" xmlns:cx3="http://schemas.microsoft.com/office/drawing/2016/5/9/chartex" xmlns:cx4="http://schemas.microsoft.com/office/drawing/2016/5/10/chartex" xmlns:cx5="http://schemas.microsoft.com/office/drawing/2016/5/11/chartex" xmlns:cx6="http://schemas.microsoft.com/office/drawing/2016/5/12/chartex" xmlns:cx7="http://schemas.microsoft.com/office/drawing/2016/5/13/chartex" xmlns:cx8="http://schemas.microsoft.com/office/drawing/2016/5/14/chartex" xmlns:mc="http://schemas.openxmlformats.org/markup-compatibility/2006" xmlns:aink="http://schemas.microsoft.com/office/drawing/2016/ink" xmlns:am3d="http://schemas.microsoft.com/office/drawing/2017/model3d" xmlns:o="urn:schemas-microsoft-com:office:office" xmlns:oel="http://schemas.microsoft.com/office/2019/extlst" xmlns:r="http://schemas.openxmlformats.org/officeDocument/2006/relationships" xmlns:m="http://schemas.openxmlformats.org/officeDocument/2006/math" xmlns:v="urn:schemas-microsoft-com:vml" xmlns:wp14="http://schemas.microsoft.com/office/word/2010/wordprocessingDrawing" xmlns:wp="http://schemas.openxmlformats.org/drawingml/2006/wordprocessingDrawing" xmlns:w10="urn:schemas-microsoft-com:office:word" xmlns:w="http://schemas.openxmlformats.org/wordprocessingml/2006/main" xmlns:w14="http://schemas.microsoft.com/office/word/2010/wordml" xmlns:w15="http://schemas.microsoft.com/office/word/2012/wordml" xmlns:w16cex="http://schemas.microsoft.com/office/word/2018/wordml/cex" xmlns:w16cid="http://schemas.microsoft.com/office/word/2016/wordml/cid" xmlns:w16="http://schemas.microsoft.com/office/word/2018/wordml" xmlns:w16du="http://schemas.microsoft.com/office/word/2023/wordml/word16du" xmlns:w16sdtdh="http://schemas.microsoft.com/office/word/2020/wordml/sdtdatahash" xmlns:w16sdtfl="http://schemas.microsoft.com/office/word/2024/wordml/sdtformatlock" xmlns:w16se="http://schemas.microsoft.com/office/word/2015/wordml/symex" xmlns:wpg="http://schemas.microsoft.com/office/word/2010/wordprocessingGroup" xmlns:wpi="http://schemas.microsoft.com/office/word/2010/wordprocessingInk" xmlns:wne="http://schemas.microsoft.com/office/word/2006/wordml" xmlns:wps="http://schemas.microsoft.com/office/word/2010/wordprocessingShape" mc:Ignorable="w14 w15 w16se w16cid w16 w16cex w16sdtdh w16sdtfl w16du wp14">
   <w:sdt>
     <w:sdtPr>
-      <w:id w:val="1985578493"/>
+      <w:id w:val="-1635476246"/>
       <w:docPartObj>
         <w:docPartGallery w:val="Page Numbers (Bottom of Page)"/>
         <w:docPartUnique/>
@@ -6246,6 +6246,7 @@
   <w:style w:type="character" w:default="1" w:styleId="DefaultParagraphFont">
     <w:name w:val="Default Paragraph Font"/>
     <w:uiPriority w:val="1"/>
+    <w:semiHidden/>
     <w:unhideWhenUsed/>
   </w:style>
   <w:style w:type="table" w:default="1" w:styleId="TableNormal">

</xml_diff>

<commit_message>
docs: add cmmc level 2 report and update content
</commit_message>
<xml_diff>
--- a/opsfolio-branding/marketing-assets/partner enablement/opsfolio_lead_magnets_tour_public_partner_enablement.docx
+++ b/opsfolio-branding/marketing-assets/partner enablement/opsfolio_lead_magnets_tour_public_partner_enablement.docx
@@ -361,7 +361,7 @@
           <w:r>
             <w:fldChar w:fldCharType="separate"/>
           </w:r>
-          <w:hyperlink w:anchor="_Toc229651007" w:history="1">
+          <w:hyperlink w:anchor="_Toc229663305" w:history="1">
             <w:r>
               <w:rPr>
                 <w:rStyle w:val="Hyperlink"/>
@@ -388,7 +388,7 @@
                 <w:noProof/>
                 <w:webHidden/>
               </w:rPr>
-              <w:instrText xml:space="preserve"> PAGEREF _Toc229651007 \h </w:instrText>
+              <w:instrText xml:space="preserve"> PAGEREF _Toc229663305 \h </w:instrText>
             </w:r>
             <w:r>
               <w:rPr>
@@ -432,7 +432,7 @@
               <w14:ligatures w14:val="standardContextual"/>
             </w:rPr>
           </w:pPr>
-          <w:hyperlink w:anchor="_Toc229651008" w:history="1">
+          <w:hyperlink w:anchor="_Toc229663306" w:history="1">
             <w:r>
               <w:rPr>
                 <w:rStyle w:val="Hyperlink"/>
@@ -459,7 +459,7 @@
                 <w:noProof/>
                 <w:webHidden/>
               </w:rPr>
-              <w:instrText xml:space="preserve"> PAGEREF _Toc229651008 \h </w:instrText>
+              <w:instrText xml:space="preserve"> PAGEREF _Toc229663306 \h </w:instrText>
             </w:r>
             <w:r>
               <w:rPr>
@@ -503,7 +503,7 @@
               <w14:ligatures w14:val="standardContextual"/>
             </w:rPr>
           </w:pPr>
-          <w:hyperlink w:anchor="_Toc229651009" w:history="1">
+          <w:hyperlink w:anchor="_Toc229663307" w:history="1">
             <w:r>
               <w:rPr>
                 <w:rStyle w:val="Hyperlink"/>
@@ -530,7 +530,7 @@
                 <w:noProof/>
                 <w:webHidden/>
               </w:rPr>
-              <w:instrText xml:space="preserve"> PAGEREF _Toc229651009 \h </w:instrText>
+              <w:instrText xml:space="preserve"> PAGEREF _Toc229663307 \h </w:instrText>
             </w:r>
             <w:r>
               <w:rPr>
@@ -574,7 +574,7 @@
               <w14:ligatures w14:val="standardContextual"/>
             </w:rPr>
           </w:pPr>
-          <w:hyperlink w:anchor="_Toc229651010" w:history="1">
+          <w:hyperlink w:anchor="_Toc229663308" w:history="1">
             <w:r>
               <w:rPr>
                 <w:rStyle w:val="Hyperlink"/>
@@ -601,7 +601,7 @@
                 <w:noProof/>
                 <w:webHidden/>
               </w:rPr>
-              <w:instrText xml:space="preserve"> PAGEREF _Toc229651010 \h </w:instrText>
+              <w:instrText xml:space="preserve"> PAGEREF _Toc229663308 \h </w:instrText>
             </w:r>
             <w:r>
               <w:rPr>
@@ -645,7 +645,7 @@
               <w14:ligatures w14:val="standardContextual"/>
             </w:rPr>
           </w:pPr>
-          <w:hyperlink w:anchor="_Toc229651011" w:history="1">
+          <w:hyperlink w:anchor="_Toc229663309" w:history="1">
             <w:r>
               <w:rPr>
                 <w:rStyle w:val="Hyperlink"/>
@@ -672,7 +672,7 @@
                 <w:noProof/>
                 <w:webHidden/>
               </w:rPr>
-              <w:instrText xml:space="preserve"> PAGEREF _Toc229651011 \h </w:instrText>
+              <w:instrText xml:space="preserve"> PAGEREF _Toc229663309 \h </w:instrText>
             </w:r>
             <w:r>
               <w:rPr>
@@ -716,7 +716,7 @@
               <w14:ligatures w14:val="standardContextual"/>
             </w:rPr>
           </w:pPr>
-          <w:hyperlink w:anchor="_Toc229651012" w:history="1">
+          <w:hyperlink w:anchor="_Toc229663310" w:history="1">
             <w:r>
               <w:rPr>
                 <w:rStyle w:val="Hyperlink"/>
@@ -743,7 +743,7 @@
                 <w:noProof/>
                 <w:webHidden/>
               </w:rPr>
-              <w:instrText xml:space="preserve"> PAGEREF _Toc229651012 \h </w:instrText>
+              <w:instrText xml:space="preserve"> PAGEREF _Toc229663310 \h </w:instrText>
             </w:r>
             <w:r>
               <w:rPr>
@@ -787,7 +787,7 @@
               <w14:ligatures w14:val="standardContextual"/>
             </w:rPr>
           </w:pPr>
-          <w:hyperlink w:anchor="_Toc229651013" w:history="1">
+          <w:hyperlink w:anchor="_Toc229663311" w:history="1">
             <w:r>
               <w:rPr>
                 <w:rStyle w:val="Hyperlink"/>
@@ -814,7 +814,7 @@
                 <w:noProof/>
                 <w:webHidden/>
               </w:rPr>
-              <w:instrText xml:space="preserve"> PAGEREF _Toc229651013 \h </w:instrText>
+              <w:instrText xml:space="preserve"> PAGEREF _Toc229663311 \h </w:instrText>
             </w:r>
             <w:r>
               <w:rPr>
@@ -858,7 +858,7 @@
               <w14:ligatures w14:val="standardContextual"/>
             </w:rPr>
           </w:pPr>
-          <w:hyperlink w:anchor="_Toc229651014" w:history="1">
+          <w:hyperlink w:anchor="_Toc229663312" w:history="1">
             <w:r>
               <w:rPr>
                 <w:rStyle w:val="Hyperlink"/>
@@ -885,7 +885,7 @@
                 <w:noProof/>
                 <w:webHidden/>
               </w:rPr>
-              <w:instrText xml:space="preserve"> PAGEREF _Toc229651014 \h </w:instrText>
+              <w:instrText xml:space="preserve"> PAGEREF _Toc229663312 \h </w:instrText>
             </w:r>
             <w:r>
               <w:rPr>
@@ -929,7 +929,7 @@
               <w14:ligatures w14:val="standardContextual"/>
             </w:rPr>
           </w:pPr>
-          <w:hyperlink w:anchor="_Toc229651015" w:history="1">
+          <w:hyperlink w:anchor="_Toc229663313" w:history="1">
             <w:r>
               <w:rPr>
                 <w:rStyle w:val="Hyperlink"/>
@@ -956,7 +956,7 @@
                 <w:noProof/>
                 <w:webHidden/>
               </w:rPr>
-              <w:instrText xml:space="preserve"> PAGEREF _Toc229651015 \h </w:instrText>
+              <w:instrText xml:space="preserve"> PAGEREF _Toc229663313 \h </w:instrText>
             </w:r>
             <w:r>
               <w:rPr>
@@ -1000,7 +1000,7 @@
               <w14:ligatures w14:val="standardContextual"/>
             </w:rPr>
           </w:pPr>
-          <w:hyperlink w:anchor="_Toc229651016" w:history="1">
+          <w:hyperlink w:anchor="_Toc229663314" w:history="1">
             <w:r>
               <w:rPr>
                 <w:rStyle w:val="Hyperlink"/>
@@ -1027,7 +1027,7 @@
                 <w:noProof/>
                 <w:webHidden/>
               </w:rPr>
-              <w:instrText xml:space="preserve"> PAGEREF _Toc229651016 \h </w:instrText>
+              <w:instrText xml:space="preserve"> PAGEREF _Toc229663314 \h </w:instrText>
             </w:r>
             <w:r>
               <w:rPr>
@@ -1071,7 +1071,7 @@
               <w14:ligatures w14:val="standardContextual"/>
             </w:rPr>
           </w:pPr>
-          <w:hyperlink w:anchor="_Toc229651017" w:history="1">
+          <w:hyperlink w:anchor="_Toc229663315" w:history="1">
             <w:r>
               <w:rPr>
                 <w:rStyle w:val="Hyperlink"/>
@@ -1098,7 +1098,7 @@
                 <w:noProof/>
                 <w:webHidden/>
               </w:rPr>
-              <w:instrText xml:space="preserve"> PAGEREF _Toc229651017 \h </w:instrText>
+              <w:instrText xml:space="preserve"> PAGEREF _Toc229663315 \h </w:instrText>
             </w:r>
             <w:r>
               <w:rPr>
@@ -1142,7 +1142,7 @@
               <w14:ligatures w14:val="standardContextual"/>
             </w:rPr>
           </w:pPr>
-          <w:hyperlink w:anchor="_Toc229651018" w:history="1">
+          <w:hyperlink w:anchor="_Toc229663316" w:history="1">
             <w:r>
               <w:rPr>
                 <w:rStyle w:val="Hyperlink"/>
@@ -1169,7 +1169,7 @@
                 <w:noProof/>
                 <w:webHidden/>
               </w:rPr>
-              <w:instrText xml:space="preserve"> PAGEREF _Toc229651018 \h </w:instrText>
+              <w:instrText xml:space="preserve"> PAGEREF _Toc229663316 \h </w:instrText>
             </w:r>
             <w:r>
               <w:rPr>
@@ -1213,7 +1213,7 @@
               <w14:ligatures w14:val="standardContextual"/>
             </w:rPr>
           </w:pPr>
-          <w:hyperlink w:anchor="_Toc229651019" w:history="1">
+          <w:hyperlink w:anchor="_Toc229663317" w:history="1">
             <w:r>
               <w:rPr>
                 <w:rStyle w:val="Hyperlink"/>
@@ -1240,7 +1240,7 @@
                 <w:noProof/>
                 <w:webHidden/>
               </w:rPr>
-              <w:instrText xml:space="preserve"> PAGEREF _Toc229651019 \h </w:instrText>
+              <w:instrText xml:space="preserve"> PAGEREF _Toc229663317 \h </w:instrText>
             </w:r>
             <w:r>
               <w:rPr>
@@ -1284,7 +1284,7 @@
               <w14:ligatures w14:val="standardContextual"/>
             </w:rPr>
           </w:pPr>
-          <w:hyperlink w:anchor="_Toc229651020" w:history="1">
+          <w:hyperlink w:anchor="_Toc229663318" w:history="1">
             <w:r>
               <w:rPr>
                 <w:rStyle w:val="Hyperlink"/>
@@ -1311,7 +1311,7 @@
                 <w:noProof/>
                 <w:webHidden/>
               </w:rPr>
-              <w:instrText xml:space="preserve"> PAGEREF _Toc229651020 \h </w:instrText>
+              <w:instrText xml:space="preserve"> PAGEREF _Toc229663318 \h </w:instrText>
             </w:r>
             <w:r>
               <w:rPr>
@@ -1355,7 +1355,7 @@
               <w14:ligatures w14:val="standardContextual"/>
             </w:rPr>
           </w:pPr>
-          <w:hyperlink w:anchor="_Toc229651021" w:history="1">
+          <w:hyperlink w:anchor="_Toc229663319" w:history="1">
             <w:r>
               <w:rPr>
                 <w:rStyle w:val="Hyperlink"/>
@@ -1382,7 +1382,7 @@
                 <w:noProof/>
                 <w:webHidden/>
               </w:rPr>
-              <w:instrText xml:space="preserve"> PAGEREF _Toc229651021 \h </w:instrText>
+              <w:instrText xml:space="preserve"> PAGEREF _Toc229663319 \h </w:instrText>
             </w:r>
             <w:r>
               <w:rPr>
@@ -1426,7 +1426,7 @@
               <w14:ligatures w14:val="standardContextual"/>
             </w:rPr>
           </w:pPr>
-          <w:hyperlink w:anchor="_Toc229651022" w:history="1">
+          <w:hyperlink w:anchor="_Toc229663320" w:history="1">
             <w:r>
               <w:rPr>
                 <w:rStyle w:val="Hyperlink"/>
@@ -1453,7 +1453,7 @@
                 <w:noProof/>
                 <w:webHidden/>
               </w:rPr>
-              <w:instrText xml:space="preserve"> PAGEREF _Toc229651022 \h </w:instrText>
+              <w:instrText xml:space="preserve"> PAGEREF _Toc229663320 \h </w:instrText>
             </w:r>
             <w:r>
               <w:rPr>
@@ -1497,12 +1497,83 @@
               <w14:ligatures w14:val="standardContextual"/>
             </w:rPr>
           </w:pPr>
-          <w:hyperlink w:anchor="_Toc229651023" w:history="1">
+          <w:hyperlink w:anchor="_Toc229663321" w:history="1">
             <w:r>
               <w:rPr>
                 <w:rStyle w:val="Hyperlink"/>
                 <w:noProof/>
               </w:rPr>
+              <w:t>CMMC Level 2 Reports</w:t>
+            </w:r>
+            <w:r>
+              <w:rPr>
+                <w:noProof/>
+                <w:webHidden/>
+              </w:rPr>
+              <w:tab/>
+            </w:r>
+            <w:r>
+              <w:rPr>
+                <w:noProof/>
+                <w:webHidden/>
+              </w:rPr>
+              <w:fldChar w:fldCharType="begin"/>
+            </w:r>
+            <w:r>
+              <w:rPr>
+                <w:noProof/>
+                <w:webHidden/>
+              </w:rPr>
+              <w:instrText xml:space="preserve"> PAGEREF _Toc229663321 \h </w:instrText>
+            </w:r>
+            <w:r>
+              <w:rPr>
+                <w:noProof/>
+                <w:webHidden/>
+              </w:rPr>
+            </w:r>
+            <w:r>
+              <w:rPr>
+                <w:noProof/>
+                <w:webHidden/>
+              </w:rPr>
+              <w:fldChar w:fldCharType="separate"/>
+            </w:r>
+            <w:r>
+              <w:rPr>
+                <w:noProof/>
+                <w:webHidden/>
+              </w:rPr>
+              <w:t>9</w:t>
+            </w:r>
+            <w:r>
+              <w:rPr>
+                <w:noProof/>
+                <w:webHidden/>
+              </w:rPr>
+              <w:fldChar w:fldCharType="end"/>
+            </w:r>
+          </w:hyperlink>
+        </w:p>
+        <w:p>
+          <w:pPr>
+            <w:pStyle w:val="TOC2"/>
+            <w:tabs>
+              <w:tab w:val="right" w:leader="dot" w:pos="9350"/>
+            </w:tabs>
+            <w:rPr>
+              <w:rFonts w:eastAsiaTheme="minorEastAsia"/>
+              <w:noProof/>
+              <w:kern w:val="2"/>
+              <w14:ligatures w14:val="standardContextual"/>
+            </w:rPr>
+          </w:pPr>
+          <w:hyperlink w:anchor="_Toc229663322" w:history="1">
+            <w:r>
+              <w:rPr>
+                <w:rStyle w:val="Hyperlink"/>
+                <w:noProof/>
+              </w:rPr>
               <w:t>SOC 2 Readiness Reports</w:t>
             </w:r>
             <w:r>
@@ -1524,7 +1595,7 @@
                 <w:noProof/>
                 <w:webHidden/>
               </w:rPr>
-              <w:instrText xml:space="preserve"> PAGEREF _Toc229651023 \h </w:instrText>
+              <w:instrText xml:space="preserve"> PAGEREF _Toc229663322 \h </w:instrText>
             </w:r>
             <w:r>
               <w:rPr>
@@ -1544,7 +1615,7 @@
                 <w:noProof/>
                 <w:webHidden/>
               </w:rPr>
-              <w:t>9</w:t>
+              <w:t>10</w:t>
             </w:r>
             <w:r>
               <w:rPr>
@@ -1568,7 +1639,7 @@
               <w14:ligatures w14:val="standardContextual"/>
             </w:rPr>
           </w:pPr>
-          <w:hyperlink w:anchor="_Toc229651024" w:history="1">
+          <w:hyperlink w:anchor="_Toc229663323" w:history="1">
             <w:r>
               <w:rPr>
                 <w:rStyle w:val="Hyperlink"/>
@@ -1595,7 +1666,7 @@
                 <w:noProof/>
                 <w:webHidden/>
               </w:rPr>
-              <w:instrText xml:space="preserve"> PAGEREF _Toc229651024 \h </w:instrText>
+              <w:instrText xml:space="preserve"> PAGEREF _Toc229663323 \h </w:instrText>
             </w:r>
             <w:r>
               <w:rPr>
@@ -1615,7 +1686,7 @@
                 <w:noProof/>
                 <w:webHidden/>
               </w:rPr>
-              <w:t>9</w:t>
+              <w:t>11</w:t>
             </w:r>
             <w:r>
               <w:rPr>
@@ -1639,7 +1710,7 @@
               <w14:ligatures w14:val="standardContextual"/>
             </w:rPr>
           </w:pPr>
-          <w:hyperlink w:anchor="_Toc229651025" w:history="1">
+          <w:hyperlink w:anchor="_Toc229663324" w:history="1">
             <w:r>
               <w:rPr>
                 <w:rStyle w:val="Hyperlink"/>
@@ -1666,7 +1737,7 @@
                 <w:noProof/>
                 <w:webHidden/>
               </w:rPr>
-              <w:instrText xml:space="preserve"> PAGEREF _Toc229651025 \h </w:instrText>
+              <w:instrText xml:space="preserve"> PAGEREF _Toc229663324 \h </w:instrText>
             </w:r>
             <w:r>
               <w:rPr>
@@ -1686,7 +1757,7 @@
                 <w:noProof/>
                 <w:webHidden/>
               </w:rPr>
-              <w:t>9</w:t>
+              <w:t>11</w:t>
             </w:r>
             <w:r>
               <w:rPr>
@@ -1710,7 +1781,7 @@
               <w14:ligatures w14:val="standardContextual"/>
             </w:rPr>
           </w:pPr>
-          <w:hyperlink w:anchor="_Toc229651026" w:history="1">
+          <w:hyperlink w:anchor="_Toc229663325" w:history="1">
             <w:r>
               <w:rPr>
                 <w:rStyle w:val="Hyperlink"/>
@@ -1737,7 +1808,7 @@
                 <w:noProof/>
                 <w:webHidden/>
               </w:rPr>
-              <w:instrText xml:space="preserve"> PAGEREF _Toc229651026 \h </w:instrText>
+              <w:instrText xml:space="preserve"> PAGEREF _Toc229663325 \h </w:instrText>
             </w:r>
             <w:r>
               <w:rPr>
@@ -1757,7 +1828,7 @@
                 <w:noProof/>
                 <w:webHidden/>
               </w:rPr>
-              <w:t>9</w:t>
+              <w:t>11</w:t>
             </w:r>
             <w:r>
               <w:rPr>
@@ -1781,7 +1852,7 @@
               <w14:ligatures w14:val="standardContextual"/>
             </w:rPr>
           </w:pPr>
-          <w:hyperlink w:anchor="_Toc229651027" w:history="1">
+          <w:hyperlink w:anchor="_Toc229663326" w:history="1">
             <w:r>
               <w:rPr>
                 <w:rStyle w:val="Hyperlink"/>
@@ -1808,7 +1879,7 @@
                 <w:noProof/>
                 <w:webHidden/>
               </w:rPr>
-              <w:instrText xml:space="preserve"> PAGEREF _Toc229651027 \h </w:instrText>
+              <w:instrText xml:space="preserve"> PAGEREF _Toc229663326 \h </w:instrText>
             </w:r>
             <w:r>
               <w:rPr>
@@ -1828,7 +1899,7 @@
                 <w:noProof/>
                 <w:webHidden/>
               </w:rPr>
-              <w:t>10</w:t>
+              <w:t>11</w:t>
             </w:r>
             <w:r>
               <w:rPr>
@@ -1852,7 +1923,7 @@
               <w14:ligatures w14:val="standardContextual"/>
             </w:rPr>
           </w:pPr>
-          <w:hyperlink w:anchor="_Toc229651028" w:history="1">
+          <w:hyperlink w:anchor="_Toc229663327" w:history="1">
             <w:r>
               <w:rPr>
                 <w:rStyle w:val="Hyperlink"/>
@@ -1879,7 +1950,7 @@
                 <w:noProof/>
                 <w:webHidden/>
               </w:rPr>
-              <w:instrText xml:space="preserve"> PAGEREF _Toc229651028 \h </w:instrText>
+              <w:instrText xml:space="preserve"> PAGEREF _Toc229663327 \h </w:instrText>
             </w:r>
             <w:r>
               <w:rPr>
@@ -1899,7 +1970,7 @@
                 <w:noProof/>
                 <w:webHidden/>
               </w:rPr>
-              <w:t>10</w:t>
+              <w:t>11</w:t>
             </w:r>
             <w:r>
               <w:rPr>
@@ -1923,7 +1994,7 @@
               <w14:ligatures w14:val="standardContextual"/>
             </w:rPr>
           </w:pPr>
-          <w:hyperlink w:anchor="_Toc229651029" w:history="1">
+          <w:hyperlink w:anchor="_Toc229663328" w:history="1">
             <w:r>
               <w:rPr>
                 <w:rStyle w:val="Hyperlink"/>
@@ -1950,7 +2021,7 @@
                 <w:noProof/>
                 <w:webHidden/>
               </w:rPr>
-              <w:instrText xml:space="preserve"> PAGEREF _Toc229651029 \h </w:instrText>
+              <w:instrText xml:space="preserve"> PAGEREF _Toc229663328 \h </w:instrText>
             </w:r>
             <w:r>
               <w:rPr>
@@ -1970,7 +2041,7 @@
                 <w:noProof/>
                 <w:webHidden/>
               </w:rPr>
-              <w:t>10</w:t>
+              <w:t>12</w:t>
             </w:r>
             <w:r>
               <w:rPr>
@@ -1994,7 +2065,7 @@
               <w14:ligatures w14:val="standardContextual"/>
             </w:rPr>
           </w:pPr>
-          <w:hyperlink w:anchor="_Toc229651030" w:history="1">
+          <w:hyperlink w:anchor="_Toc229663329" w:history="1">
             <w:r>
               <w:rPr>
                 <w:rStyle w:val="Hyperlink"/>
@@ -2021,7 +2092,7 @@
                 <w:noProof/>
                 <w:webHidden/>
               </w:rPr>
-              <w:instrText xml:space="preserve"> PAGEREF _Toc229651030 \h </w:instrText>
+              <w:instrText xml:space="preserve"> PAGEREF _Toc229663329 \h </w:instrText>
             </w:r>
             <w:r>
               <w:rPr>
@@ -2041,7 +2112,7 @@
                 <w:noProof/>
                 <w:webHidden/>
               </w:rPr>
-              <w:t>10</w:t>
+              <w:t>12</w:t>
             </w:r>
             <w:r>
               <w:rPr>
@@ -2065,7 +2136,7 @@
               <w14:ligatures w14:val="standardContextual"/>
             </w:rPr>
           </w:pPr>
-          <w:hyperlink w:anchor="_Toc229651031" w:history="1">
+          <w:hyperlink w:anchor="_Toc229663330" w:history="1">
             <w:r>
               <w:rPr>
                 <w:rStyle w:val="Hyperlink"/>
@@ -2092,7 +2163,7 @@
                 <w:noProof/>
                 <w:webHidden/>
               </w:rPr>
-              <w:instrText xml:space="preserve"> PAGEREF _Toc229651031 \h </w:instrText>
+              <w:instrText xml:space="preserve"> PAGEREF _Toc229663330 \h </w:instrText>
             </w:r>
             <w:r>
               <w:rPr>
@@ -2112,7 +2183,7 @@
                 <w:noProof/>
                 <w:webHidden/>
               </w:rPr>
-              <w:t>10</w:t>
+              <w:t>12</w:t>
             </w:r>
             <w:r>
               <w:rPr>
@@ -2136,7 +2207,7 @@
               <w14:ligatures w14:val="standardContextual"/>
             </w:rPr>
           </w:pPr>
-          <w:hyperlink w:anchor="_Toc229651032" w:history="1">
+          <w:hyperlink w:anchor="_Toc229663331" w:history="1">
             <w:r>
               <w:rPr>
                 <w:rStyle w:val="Hyperlink"/>
@@ -2163,7 +2234,7 @@
                 <w:noProof/>
                 <w:webHidden/>
               </w:rPr>
-              <w:instrText xml:space="preserve"> PAGEREF _Toc229651032 \h </w:instrText>
+              <w:instrText xml:space="preserve"> PAGEREF _Toc229663331 \h </w:instrText>
             </w:r>
             <w:r>
               <w:rPr>
@@ -2183,7 +2254,7 @@
                 <w:noProof/>
                 <w:webHidden/>
               </w:rPr>
-              <w:t>11</w:t>
+              <w:t>12</w:t>
             </w:r>
             <w:r>
               <w:rPr>
@@ -2207,7 +2278,7 @@
               <w14:ligatures w14:val="standardContextual"/>
             </w:rPr>
           </w:pPr>
-          <w:hyperlink w:anchor="_Toc229651033" w:history="1">
+          <w:hyperlink w:anchor="_Toc229663332" w:history="1">
             <w:r>
               <w:rPr>
                 <w:rStyle w:val="Hyperlink"/>
@@ -2234,7 +2305,7 @@
                 <w:noProof/>
                 <w:webHidden/>
               </w:rPr>
-              <w:instrText xml:space="preserve"> PAGEREF _Toc229651033 \h </w:instrText>
+              <w:instrText xml:space="preserve"> PAGEREF _Toc229663332 \h </w:instrText>
             </w:r>
             <w:r>
               <w:rPr>
@@ -2254,7 +2325,7 @@
                 <w:noProof/>
                 <w:webHidden/>
               </w:rPr>
-              <w:t>11</w:t>
+              <w:t>13</w:t>
             </w:r>
             <w:r>
               <w:rPr>
@@ -2278,7 +2349,7 @@
               <w14:ligatures w14:val="standardContextual"/>
             </w:rPr>
           </w:pPr>
-          <w:hyperlink w:anchor="_Toc229651034" w:history="1">
+          <w:hyperlink w:anchor="_Toc229663333" w:history="1">
             <w:r>
               <w:rPr>
                 <w:rStyle w:val="Hyperlink"/>
@@ -2305,7 +2376,7 @@
                 <w:noProof/>
                 <w:webHidden/>
               </w:rPr>
-              <w:instrText xml:space="preserve"> PAGEREF _Toc229651034 \h </w:instrText>
+              <w:instrText xml:space="preserve"> PAGEREF _Toc229663333 \h </w:instrText>
             </w:r>
             <w:r>
               <w:rPr>
@@ -2325,7 +2396,7 @@
                 <w:noProof/>
                 <w:webHidden/>
               </w:rPr>
-              <w:t>12</w:t>
+              <w:t>13</w:t>
             </w:r>
             <w:r>
               <w:rPr>
@@ -2355,7 +2426,7 @@
           <w:color w:val="auto"/>
         </w:rPr>
       </w:pPr>
-      <w:bookmarkStart w:id="1" w:name="_Toc229651007"/>
+      <w:bookmarkStart w:id="1" w:name="_Toc229663305"/>
       <w:r>
         <w:rPr>
           <w:color w:val="auto"/>
@@ -2380,15 +2451,15 @@
           <w:color w:val="auto"/>
         </w:rPr>
       </w:pPr>
-      <w:bookmarkStart w:id="2" w:name="_Toc229651008"/>
-      <w:bookmarkStart w:id="3" w:name="overview"/>
+      <w:bookmarkStart w:id="2" w:name="overview"/>
+      <w:bookmarkStart w:id="3" w:name="_Toc229663306"/>
       <w:r>
         <w:rPr>
           <w:color w:val="auto"/>
         </w:rPr>
         <w:t>Overview</w:t>
       </w:r>
-      <w:bookmarkEnd w:id="2"/>
+      <w:bookmarkEnd w:id="3"/>
     </w:p>
     <w:p>
       <w:pPr>
@@ -2634,10 +2705,10 @@
           <w:color w:val="auto"/>
         </w:rPr>
       </w:pPr>
-      <w:bookmarkStart w:id="4" w:name="_Toc229651009"/>
-      <w:bookmarkStart w:id="5" w:name="customer-journey-overview"/>
+      <w:bookmarkStart w:id="4" w:name="customer-journey-overview"/>
+      <w:bookmarkStart w:id="5" w:name="_Toc229663307"/>
       <w:bookmarkEnd w:id="0"/>
-      <w:bookmarkEnd w:id="3"/>
+      <w:bookmarkEnd w:id="2"/>
       <w:r>
         <w:rPr>
           <w:color w:val="auto"/>
@@ -2645,7 +2716,7 @@
         <w:lastRenderedPageBreak/>
         <w:t>1. Customer Journey Overview</w:t>
       </w:r>
-      <w:bookmarkEnd w:id="4"/>
+      <w:bookmarkEnd w:id="5"/>
     </w:p>
     <w:p>
       <w:pPr>
@@ -2654,15 +2725,15 @@
           <w:color w:val="auto"/>
         </w:rPr>
       </w:pPr>
-      <w:bookmarkStart w:id="6" w:name="_Toc229651010"/>
-      <w:bookmarkStart w:id="7" w:name="typical-lead-journey"/>
+      <w:bookmarkStart w:id="6" w:name="typical-lead-journey"/>
+      <w:bookmarkStart w:id="7" w:name="_Toc229663308"/>
       <w:r>
         <w:rPr>
           <w:color w:val="auto"/>
         </w:rPr>
         <w:t>Typical Lead Journey</w:t>
       </w:r>
-      <w:bookmarkEnd w:id="6"/>
+      <w:bookmarkEnd w:id="7"/>
     </w:p>
     <w:p>
       <w:pPr>
@@ -2784,17 +2855,17 @@
           <w:color w:val="auto"/>
         </w:rPr>
       </w:pPr>
-      <w:bookmarkStart w:id="8" w:name="_Toc229651011"/>
-      <w:bookmarkStart w:id="9" w:name="landing-pages-campaign-experience"/>
-      <w:bookmarkEnd w:id="5"/>
-      <w:bookmarkEnd w:id="7"/>
+      <w:bookmarkStart w:id="8" w:name="landing-pages-campaign-experience"/>
+      <w:bookmarkStart w:id="9" w:name="_Toc229663309"/>
+      <w:bookmarkEnd w:id="4"/>
+      <w:bookmarkEnd w:id="6"/>
       <w:r>
         <w:rPr>
           <w:color w:val="auto"/>
         </w:rPr>
         <w:t>2. Landing Pages &amp; Campaign Experience</w:t>
       </w:r>
-      <w:bookmarkEnd w:id="8"/>
+      <w:bookmarkEnd w:id="9"/>
     </w:p>
     <w:p>
       <w:pPr>
@@ -2803,15 +2874,15 @@
           <w:color w:val="auto"/>
         </w:rPr>
       </w:pPr>
-      <w:bookmarkStart w:id="10" w:name="_Toc229651012"/>
-      <w:bookmarkStart w:id="11" w:name="example-public-landing-pages"/>
+      <w:bookmarkStart w:id="10" w:name="example-public-landing-pages"/>
+      <w:bookmarkStart w:id="11" w:name="_Toc229663310"/>
       <w:r>
         <w:rPr>
           <w:color w:val="auto"/>
         </w:rPr>
         <w:t>Example Public Landing Pages</w:t>
       </w:r>
-      <w:bookmarkEnd w:id="10"/>
+      <w:bookmarkEnd w:id="11"/>
     </w:p>
     <w:p>
       <w:pPr>
@@ -2966,9 +3037,9 @@
           <w:color w:val="auto"/>
         </w:rPr>
       </w:pPr>
-      <w:bookmarkStart w:id="14" w:name="_Toc229651013"/>
-      <w:bookmarkStart w:id="15" w:name="landing-page-goals"/>
-      <w:bookmarkEnd w:id="11"/>
+      <w:bookmarkStart w:id="14" w:name="landing-page-goals"/>
+      <w:bookmarkStart w:id="15" w:name="_Toc229663311"/>
+      <w:bookmarkEnd w:id="10"/>
       <w:bookmarkEnd w:id="13"/>
       <w:r>
         <w:rPr>
@@ -2986,7 +3057,7 @@
         </w:rPr>
         <w:t>Landing Page Goals</w:t>
       </w:r>
-      <w:bookmarkEnd w:id="14"/>
+      <w:bookmarkEnd w:id="15"/>
     </w:p>
     <w:p>
       <w:pPr>
@@ -3185,17 +3256,17 @@
           <w:color w:val="auto"/>
         </w:rPr>
       </w:pPr>
-      <w:bookmarkStart w:id="16" w:name="_Toc229651014"/>
-      <w:bookmarkStart w:id="17" w:name="sign-up-user-inputs"/>
-      <w:bookmarkEnd w:id="9"/>
-      <w:bookmarkEnd w:id="15"/>
+      <w:bookmarkStart w:id="16" w:name="sign-up-user-inputs"/>
+      <w:bookmarkStart w:id="17" w:name="_Toc229663312"/>
+      <w:bookmarkEnd w:id="8"/>
+      <w:bookmarkEnd w:id="14"/>
       <w:r>
         <w:rPr>
           <w:color w:val="auto"/>
         </w:rPr>
         <w:t>3. Sign-Up &amp; User Inputs</w:t>
       </w:r>
-      <w:bookmarkEnd w:id="16"/>
+      <w:bookmarkEnd w:id="17"/>
     </w:p>
     <w:p>
       <w:pPr>
@@ -3256,8 +3327,8 @@
           <w:color w:val="auto"/>
         </w:rPr>
       </w:pPr>
-      <w:bookmarkStart w:id="18" w:name="_Toc229651015"/>
-      <w:bookmarkStart w:id="19" w:name="initial-sign-up-information"/>
+      <w:bookmarkStart w:id="18" w:name="initial-sign-up-information"/>
+      <w:bookmarkStart w:id="19" w:name="_Toc229663313"/>
       <w:r>
         <w:rPr>
           <w:noProof/>
@@ -3272,7 +3343,7 @@
         </w:rPr>
         <w:t>Initial Sign-Up Information</w:t>
       </w:r>
-      <w:bookmarkEnd w:id="18"/>
+      <w:bookmarkEnd w:id="19"/>
     </w:p>
     <w:p>
       <w:pPr>
@@ -3373,10 +3444,10 @@
           <w:color w:val="auto"/>
         </w:rPr>
       </w:pPr>
-      <w:bookmarkStart w:id="20" w:name="_Toc229651016"/>
-      <w:bookmarkStart w:id="21" w:name="assessment-experience"/>
-      <w:bookmarkEnd w:id="17"/>
-      <w:bookmarkEnd w:id="19"/>
+      <w:bookmarkStart w:id="20" w:name="assessment-experience"/>
+      <w:bookmarkStart w:id="21" w:name="_Toc229663314"/>
+      <w:bookmarkEnd w:id="16"/>
+      <w:bookmarkEnd w:id="18"/>
       <w:r>
         <w:rPr>
           <w:color w:val="auto"/>
@@ -3384,7 +3455,7 @@
         <w:lastRenderedPageBreak/>
         <w:t>4. Assessment Experience</w:t>
       </w:r>
-      <w:bookmarkEnd w:id="20"/>
+      <w:bookmarkEnd w:id="21"/>
     </w:p>
     <w:p>
       <w:pPr>
@@ -3393,15 +3464,15 @@
           <w:color w:val="auto"/>
         </w:rPr>
       </w:pPr>
-      <w:bookmarkStart w:id="22" w:name="_Toc229651017"/>
-      <w:bookmarkStart w:id="23" w:name="cmmc-assessments"/>
+      <w:bookmarkStart w:id="22" w:name="cmmc-assessments"/>
+      <w:bookmarkStart w:id="23" w:name="_Toc229663315"/>
       <w:r>
         <w:rPr>
           <w:color w:val="auto"/>
         </w:rPr>
         <w:t>CMMC Assessments</w:t>
       </w:r>
-      <w:bookmarkEnd w:id="22"/>
+      <w:bookmarkEnd w:id="23"/>
     </w:p>
     <w:p>
       <w:pPr>
@@ -3424,7 +3495,7 @@
           <w:noProof/>
         </w:rPr>
         <w:drawing>
-          <wp:anchor distT="0" distB="0" distL="114300" distR="114300" simplePos="0" relativeHeight="251655168" behindDoc="0" locked="0" layoutInCell="1" allowOverlap="1" wp14:anchorId="6E34D4D9" wp14:editId="1023AB49">
+          <wp:anchor distT="0" distB="0" distL="114300" distR="114300" simplePos="0" relativeHeight="251655168" behindDoc="0" locked="0" layoutInCell="1" allowOverlap="1" wp14:anchorId="6E34D4D9" wp14:editId="751EE464">
             <wp:simplePos x="0" y="0"/>
             <wp:positionH relativeFrom="column">
               <wp:posOffset>4475480</wp:posOffset>
@@ -3670,9 +3741,9 @@
           <w:color w:val="auto"/>
         </w:rPr>
       </w:pPr>
-      <w:bookmarkStart w:id="24" w:name="_Toc229651018"/>
-      <w:bookmarkStart w:id="25" w:name="soc-2-readiness-assessments"/>
-      <w:bookmarkEnd w:id="23"/>
+      <w:bookmarkStart w:id="24" w:name="soc-2-readiness-assessments"/>
+      <w:bookmarkStart w:id="25" w:name="_Toc229663316"/>
+      <w:bookmarkEnd w:id="22"/>
       <w:r>
         <w:rPr>
           <w:color w:val="auto"/>
@@ -3680,7 +3751,7 @@
         <w:lastRenderedPageBreak/>
         <w:t>SOC 2 Readiness Assessments</w:t>
       </w:r>
-      <w:bookmarkEnd w:id="24"/>
+      <w:bookmarkEnd w:id="25"/>
     </w:p>
     <w:p>
       <w:pPr>
@@ -3894,17 +3965,17 @@
           <w:color w:val="auto"/>
         </w:rPr>
       </w:pPr>
-      <w:bookmarkStart w:id="26" w:name="_Toc229651019"/>
-      <w:bookmarkStart w:id="27" w:name="automated-emails-customer-touchpoints"/>
-      <w:bookmarkEnd w:id="21"/>
-      <w:bookmarkEnd w:id="25"/>
+      <w:bookmarkStart w:id="26" w:name="automated-emails-customer-touchpoints"/>
+      <w:bookmarkStart w:id="27" w:name="_Toc229663317"/>
+      <w:bookmarkEnd w:id="20"/>
+      <w:bookmarkEnd w:id="24"/>
       <w:r>
         <w:rPr>
           <w:color w:val="auto"/>
         </w:rPr>
         <w:t>5. Automated Emails &amp; Customer Touchpoints</w:t>
       </w:r>
-      <w:bookmarkEnd w:id="26"/>
+      <w:bookmarkEnd w:id="27"/>
     </w:p>
     <w:p>
       <w:pPr>
@@ -3913,15 +3984,15 @@
           <w:color w:val="auto"/>
         </w:rPr>
       </w:pPr>
-      <w:bookmarkStart w:id="28" w:name="_Toc229651020"/>
-      <w:bookmarkStart w:id="29" w:name="automated-customer-experience"/>
+      <w:bookmarkStart w:id="28" w:name="automated-customer-experience"/>
+      <w:bookmarkStart w:id="29" w:name="_Toc229663318"/>
       <w:r>
         <w:rPr>
           <w:color w:val="auto"/>
         </w:rPr>
         <w:t>Automated Customer Experience</w:t>
       </w:r>
-      <w:bookmarkEnd w:id="28"/>
+      <w:bookmarkEnd w:id="29"/>
     </w:p>
     <w:p>
       <w:pPr>
@@ -4088,10 +4159,10 @@
           <w:color w:val="auto"/>
         </w:rPr>
       </w:pPr>
-      <w:bookmarkStart w:id="30" w:name="_Toc229651021"/>
-      <w:bookmarkStart w:id="31" w:name="reports-outputs-generated"/>
-      <w:bookmarkEnd w:id="27"/>
-      <w:bookmarkEnd w:id="29"/>
+      <w:bookmarkStart w:id="30" w:name="reports-outputs-generated"/>
+      <w:bookmarkStart w:id="31" w:name="_Toc229663319"/>
+      <w:bookmarkEnd w:id="26"/>
+      <w:bookmarkEnd w:id="28"/>
       <w:r>
         <w:rPr>
           <w:color w:val="auto"/>
@@ -4099,7 +4170,7 @@
         <w:lastRenderedPageBreak/>
         <w:t>6. Reports &amp; Outputs Generated</w:t>
       </w:r>
-      <w:bookmarkEnd w:id="30"/>
+      <w:bookmarkEnd w:id="31"/>
     </w:p>
     <w:p>
       <w:pPr>
@@ -4108,15 +4179,15 @@
           <w:color w:val="auto"/>
         </w:rPr>
       </w:pPr>
-      <w:bookmarkStart w:id="32" w:name="_Toc229651022"/>
-      <w:bookmarkStart w:id="33" w:name="cmmc-level-1-reports"/>
+      <w:bookmarkStart w:id="32" w:name="cmmc-level-1-reports"/>
+      <w:bookmarkStart w:id="33" w:name="_Toc229663320"/>
       <w:r>
         <w:rPr>
           <w:color w:val="auto"/>
         </w:rPr>
         <w:t>CMMC Level 1 Reports</w:t>
       </w:r>
-      <w:bookmarkEnd w:id="32"/>
+      <w:bookmarkEnd w:id="33"/>
     </w:p>
     <w:p>
       <w:pPr>
@@ -4164,10 +4235,10 @@
           <w:noProof/>
         </w:rPr>
         <w:drawing>
-          <wp:inline distT="0" distB="0" distL="0" distR="0" wp14:anchorId="001BE299" wp14:editId="7C7C44CA">
-            <wp:extent cx="5943600" cy="4814570"/>
-            <wp:effectExtent l="19050" t="19050" r="0" b="5080"/>
-            <wp:docPr id="1892212426" name="Picture 1"/>
+          <wp:inline distT="0" distB="0" distL="0" distR="0" wp14:anchorId="348FA13A" wp14:editId="34862F70">
+            <wp:extent cx="5943600" cy="4876800"/>
+            <wp:effectExtent l="19050" t="19050" r="0" b="0"/>
+            <wp:docPr id="1595218942" name="Picture 1"/>
             <wp:cNvGraphicFramePr>
               <a:graphicFrameLocks xmlns:a="http://schemas.openxmlformats.org/drawingml/2006/main" noChangeAspect="1"/>
             </wp:cNvGraphicFramePr>
@@ -4175,11 +4246,456 @@
               <a:graphicData uri="http://schemas.openxmlformats.org/drawingml/2006/picture">
                 <pic:pic xmlns:pic="http://schemas.openxmlformats.org/drawingml/2006/picture">
                   <pic:nvPicPr>
-                    <pic:cNvPr id="1892212426" name=""/>
+                    <pic:cNvPr id="1595218942" name=""/>
+                    <pic:cNvPicPr/>
+                  </pic:nvPicPr>
+                  <pic:blipFill rotWithShape="1">
+                    <a:blip r:embed="rId25"/>
+                    <a:srcRect t="1616" b="15634"/>
+                    <a:stretch>
+                      <a:fillRect/>
+                    </a:stretch>
+                  </pic:blipFill>
+                  <pic:spPr bwMode="auto">
+                    <a:xfrm>
+                      <a:off x="0" y="0"/>
+                      <a:ext cx="5943600" cy="4876800"/>
+                    </a:xfrm>
+                    <a:prstGeom prst="rect">
+                      <a:avLst/>
+                    </a:prstGeom>
+                    <a:ln w="9525" cap="flat" cmpd="sng" algn="ctr">
+                      <a:solidFill>
+                        <a:sysClr val="window" lastClr="FFFFFF">
+                          <a:lumMod val="85000"/>
+                        </a:sysClr>
+                      </a:solidFill>
+                      <a:prstDash val="solid"/>
+                      <a:round/>
+                      <a:headEnd type="none" w="med" len="med"/>
+                      <a:tailEnd type="none" w="med" len="med"/>
+                      <a:extLst>
+                        <a:ext uri="{C807C97D-BFC1-408E-A445-0C87EB9F89A2}">
+                          <ask:lineSketchStyleProps xmlns:ask="http://schemas.microsoft.com/office/drawing/2018/sketchyshapes" sd="0">
+                            <a:custGeom>
+                              <a:avLst/>
+                              <a:gdLst/>
+                              <a:ahLst/>
+                              <a:cxnLst/>
+                              <a:rect l="0" t="0" r="0" b="0"/>
+                              <a:pathLst/>
+                            </a:custGeom>
+                            <ask:type/>
+                          </ask:lineSketchStyleProps>
+                        </a:ext>
+                      </a:extLst>
+                    </a:ln>
+                    <a:extLst>
+                      <a:ext uri="{53640926-AAD7-44D8-BBD7-CCE9431645EC}">
+                        <a14:shadowObscured xmlns:a14="http://schemas.microsoft.com/office/drawing/2010/main"/>
+                      </a:ext>
+                    </a:extLst>
+                  </pic:spPr>
+                </pic:pic>
+              </a:graphicData>
+            </a:graphic>
+          </wp:inline>
+        </w:drawing>
+      </w:r>
+    </w:p>
+    <w:p>
+      <w:pPr>
+        <w:pStyle w:val="Compact"/>
+      </w:pPr>
+    </w:p>
+    <w:p>
+      <w:pPr>
+        <w:pStyle w:val="FirstParagraph"/>
+      </w:pPr>
+      <w:r>
+        <w:t>The self-assessment reports help organizations understand:</w:t>
+      </w:r>
+    </w:p>
+    <w:p>
+      <w:pPr>
+        <w:pStyle w:val="Compact"/>
+        <w:numPr>
+          <w:ilvl w:val="0"/>
+          <w:numId w:val="13"/>
+        </w:numPr>
+      </w:pPr>
+      <w:r>
+        <w:t>Current readiness status</w:t>
+      </w:r>
+    </w:p>
+    <w:p>
+      <w:pPr>
+        <w:pStyle w:val="Compact"/>
+        <w:numPr>
+          <w:ilvl w:val="0"/>
+          <w:numId w:val="13"/>
+        </w:numPr>
+      </w:pPr>
+      <w:r>
+        <w:t>Compliance gaps</w:t>
+      </w:r>
+    </w:p>
+    <w:p>
+      <w:pPr>
+        <w:pStyle w:val="Compact"/>
+        <w:numPr>
+          <w:ilvl w:val="0"/>
+          <w:numId w:val="13"/>
+        </w:numPr>
+      </w:pPr>
+      <w:r>
+        <w:t>Areas requiring additional work</w:t>
+      </w:r>
+    </w:p>
+    <w:p>
+      <w:pPr>
+        <w:pStyle w:val="Compact"/>
+        <w:numPr>
+          <w:ilvl w:val="0"/>
+          <w:numId w:val="13"/>
+        </w:numPr>
+      </w:pPr>
+      <w:r>
+        <w:t xml:space="preserve">Suggested improvement </w:t>
+      </w:r>
+      <w:proofErr w:type="gramStart"/>
+      <w:r>
+        <w:t>focus</w:t>
+      </w:r>
+      <w:proofErr w:type="gramEnd"/>
+      <w:r>
+        <w:t xml:space="preserve"> areas</w:t>
+      </w:r>
+    </w:p>
+    <w:p>
+      <w:pPr>
+        <w:pStyle w:val="Heading2"/>
+        <w:rPr>
+          <w:color w:val="auto"/>
+        </w:rPr>
+      </w:pPr>
+      <w:bookmarkStart w:id="34" w:name="cmmc-level-2-reports"/>
+      <w:bookmarkStart w:id="35" w:name="_Toc229663321"/>
+      <w:r>
+        <w:rPr>
+          <w:color w:val="auto"/>
+        </w:rPr>
+        <w:lastRenderedPageBreak/>
+        <w:t>CMMC Level 2 Reports</w:t>
+      </w:r>
+      <w:bookmarkEnd w:id="34"/>
+      <w:bookmarkEnd w:id="35"/>
+    </w:p>
+    <w:p>
+      <w:pPr>
+        <w:pStyle w:val="FirstParagraph"/>
+      </w:pPr>
+      <w:r>
+        <w:t>Upon successful completion of the CMMC Level 2 Self-Assessment:</w:t>
+      </w:r>
+    </w:p>
+    <w:p>
+      <w:pPr>
+        <w:pStyle w:val="Compact"/>
+        <w:numPr>
+          <w:ilvl w:val="0"/>
+          <w:numId w:val="12"/>
+        </w:numPr>
+      </w:pPr>
+      <w:r>
+        <w:t>A self-assessment report is automatically generated</w:t>
+      </w:r>
+    </w:p>
+    <w:p>
+      <w:pPr>
+        <w:pStyle w:val="Compact"/>
+        <w:numPr>
+          <w:ilvl w:val="0"/>
+          <w:numId w:val="12"/>
+        </w:numPr>
+      </w:pPr>
+      <w:r>
+        <w:t>A report link is delivered to the user</w:t>
+      </w:r>
+    </w:p>
+    <w:p>
+      <w:pPr>
+        <w:pStyle w:val="Compact"/>
+      </w:pPr>
+    </w:p>
+    <w:p>
+      <w:pPr>
+        <w:pStyle w:val="Compact"/>
+      </w:pPr>
+      <w:r>
+        <w:rPr>
+          <w:noProof/>
+        </w:rPr>
+        <w:drawing>
+          <wp:inline distT="0" distB="0" distL="0" distR="0" wp14:anchorId="3F930DAE" wp14:editId="793185A2">
+            <wp:extent cx="5942965" cy="4686300"/>
+            <wp:effectExtent l="19050" t="19050" r="635" b="0"/>
+            <wp:docPr id="931357689" name="Picture 1"/>
+            <wp:cNvGraphicFramePr>
+              <a:graphicFrameLocks xmlns:a="http://schemas.openxmlformats.org/drawingml/2006/main" noChangeAspect="1"/>
+            </wp:cNvGraphicFramePr>
+            <a:graphic xmlns:a="http://schemas.openxmlformats.org/drawingml/2006/main">
+              <a:graphicData uri="http://schemas.openxmlformats.org/drawingml/2006/picture">
+                <pic:pic xmlns:pic="http://schemas.openxmlformats.org/drawingml/2006/picture">
+                  <pic:nvPicPr>
+                    <pic:cNvPr id="931357689" name=""/>
+                    <pic:cNvPicPr/>
+                  </pic:nvPicPr>
+                  <pic:blipFill rotWithShape="1">
+                    <a:blip r:embed="rId26"/>
+                    <a:srcRect l="-961" t="2444" r="-963" b="29734"/>
+                    <a:stretch>
+                      <a:fillRect/>
+                    </a:stretch>
+                  </pic:blipFill>
+                  <pic:spPr bwMode="auto">
+                    <a:xfrm>
+                      <a:off x="0" y="0"/>
+                      <a:ext cx="5943600" cy="4686801"/>
+                    </a:xfrm>
+                    <a:prstGeom prst="rect">
+                      <a:avLst/>
+                    </a:prstGeom>
+                    <a:ln w="9525" cap="flat" cmpd="sng" algn="ctr">
+                      <a:solidFill>
+                        <a:sysClr val="window" lastClr="FFFFFF">
+                          <a:lumMod val="85000"/>
+                        </a:sysClr>
+                      </a:solidFill>
+                      <a:prstDash val="solid"/>
+                      <a:round/>
+                      <a:headEnd type="none" w="med" len="med"/>
+                      <a:tailEnd type="none" w="med" len="med"/>
+                      <a:extLst>
+                        <a:ext uri="{C807C97D-BFC1-408E-A445-0C87EB9F89A2}">
+                          <ask:lineSketchStyleProps xmlns:ask="http://schemas.microsoft.com/office/drawing/2018/sketchyshapes" sd="0">
+                            <a:custGeom>
+                              <a:avLst/>
+                              <a:gdLst/>
+                              <a:ahLst/>
+                              <a:cxnLst/>
+                              <a:rect l="0" t="0" r="0" b="0"/>
+                              <a:pathLst/>
+                            </a:custGeom>
+                            <ask:type/>
+                          </ask:lineSketchStyleProps>
+                        </a:ext>
+                      </a:extLst>
+                    </a:ln>
+                    <a:extLst>
+                      <a:ext uri="{53640926-AAD7-44D8-BBD7-CCE9431645EC}">
+                        <a14:shadowObscured xmlns:a14="http://schemas.microsoft.com/office/drawing/2010/main"/>
+                      </a:ext>
+                    </a:extLst>
+                  </pic:spPr>
+                </pic:pic>
+              </a:graphicData>
+            </a:graphic>
+          </wp:inline>
+        </w:drawing>
+      </w:r>
+    </w:p>
+    <w:p>
+      <w:pPr>
+        <w:pStyle w:val="FirstParagraph"/>
+      </w:pPr>
+      <w:r>
+        <w:br/>
+      </w:r>
+      <w:r>
+        <w:t>The report helps organizations understand:</w:t>
+      </w:r>
+    </w:p>
+    <w:p>
+      <w:pPr>
+        <w:pStyle w:val="Compact"/>
+        <w:numPr>
+          <w:ilvl w:val="0"/>
+          <w:numId w:val="12"/>
+        </w:numPr>
+      </w:pPr>
+      <w:r>
+        <w:t>Current readiness status across all 14 CMMC Level 2 practice domains</w:t>
+      </w:r>
+    </w:p>
+    <w:p>
+      <w:pPr>
+        <w:pStyle w:val="Compact"/>
+        <w:numPr>
+          <w:ilvl w:val="0"/>
+          <w:numId w:val="12"/>
+        </w:numPr>
+      </w:pPr>
+      <w:r>
+        <w:t>Practice-level compliance gaps and areas of partial implementation</w:t>
+      </w:r>
+    </w:p>
+    <w:p>
+      <w:pPr>
+        <w:pStyle w:val="Compact"/>
+        <w:numPr>
+          <w:ilvl w:val="0"/>
+          <w:numId w:val="12"/>
+        </w:numPr>
+      </w:pPr>
+      <w:r>
+        <w:t>Which of the 110 required practices are met, partially met, or not yet addressed</w:t>
+      </w:r>
+    </w:p>
+    <w:p>
+      <w:pPr>
+        <w:pStyle w:val="Compact"/>
+        <w:numPr>
+          <w:ilvl w:val="0"/>
+          <w:numId w:val="12"/>
+        </w:numPr>
+      </w:pPr>
+      <w:r>
+        <w:t>Recommended focus areas before engaging a C3PAO for formal assessment</w:t>
+      </w:r>
+    </w:p>
+    <w:p>
+      <w:pPr>
+        <w:pStyle w:val="Compact"/>
+        <w:numPr>
+          <w:ilvl w:val="0"/>
+          <w:numId w:val="12"/>
+        </w:numPr>
+        <w:spacing w:after="240"/>
+      </w:pPr>
+      <w:r>
+        <w:t>An overall readiness posture summary</w:t>
+      </w:r>
+    </w:p>
+    <w:p>
+      <w:pPr>
+        <w:pStyle w:val="Compact"/>
+      </w:pPr>
+      <w:r>
+        <w:t>The Level 2 self-assessment report gives organizations a structured, practice-level view of their current compliance posture and a concrete starting point for remediation planning.</w:t>
+      </w:r>
+    </w:p>
+    <w:p>
+      <w:pPr>
+        <w:pStyle w:val="Heading2"/>
+        <w:rPr>
+          <w:color w:val="auto"/>
+        </w:rPr>
+      </w:pPr>
+      <w:bookmarkStart w:id="36" w:name="soc-2-readiness-reports"/>
+      <w:bookmarkStart w:id="37" w:name="_Toc229663322"/>
+      <w:bookmarkEnd w:id="32"/>
+      <w:r>
+        <w:rPr>
+          <w:color w:val="auto"/>
+        </w:rPr>
+        <w:lastRenderedPageBreak/>
+        <w:t>SOC 2 Readiness Reports</w:t>
+      </w:r>
+      <w:bookmarkEnd w:id="37"/>
+    </w:p>
+    <w:p>
+      <w:pPr>
+        <w:pStyle w:val="FirstParagraph"/>
+      </w:pPr>
+      <w:r>
+        <w:t>SOC 2 readiness workflows generate:</w:t>
+      </w:r>
+    </w:p>
+    <w:p>
+      <w:pPr>
+        <w:pStyle w:val="Compact"/>
+        <w:numPr>
+          <w:ilvl w:val="0"/>
+          <w:numId w:val="14"/>
+        </w:numPr>
+      </w:pPr>
+      <w:r>
+        <w:t>Self-assessment report summarizing readiness findings</w:t>
+      </w:r>
+    </w:p>
+    <w:p>
+      <w:pPr>
+        <w:pStyle w:val="Compact"/>
+        <w:numPr>
+          <w:ilvl w:val="0"/>
+          <w:numId w:val="14"/>
+        </w:numPr>
+      </w:pPr>
+      <w:r>
+        <w:t>Gap-oriented observations</w:t>
+      </w:r>
+    </w:p>
+    <w:p>
+      <w:pPr>
+        <w:pStyle w:val="Compact"/>
+        <w:numPr>
+          <w:ilvl w:val="0"/>
+          <w:numId w:val="14"/>
+        </w:numPr>
+      </w:pPr>
+      <w:r>
+        <w:t>Operational maturity indicators</w:t>
+      </w:r>
+    </w:p>
+    <w:p>
+      <w:pPr>
+        <w:pStyle w:val="Compact"/>
+        <w:numPr>
+          <w:ilvl w:val="0"/>
+          <w:numId w:val="14"/>
+        </w:numPr>
+      </w:pPr>
+      <w:r>
+        <w:t>Directional compliance insights</w:t>
+      </w:r>
+    </w:p>
+    <w:p>
+      <w:pPr>
+        <w:pStyle w:val="FirstParagraph"/>
+      </w:pPr>
+      <w:r>
+        <w:t>These self-assessment reports are intended to serve as starting points for deeper readiness discussions.</w:t>
+      </w:r>
+      <w:r>
+        <w:br/>
+      </w:r>
+    </w:p>
+    <w:p>
+      <w:pPr>
+        <w:pStyle w:val="BodyText"/>
+      </w:pPr>
+      <w:r>
+        <w:rPr>
+          <w:noProof/>
+        </w:rPr>
+        <w:drawing>
+          <wp:inline distT="0" distB="0" distL="0" distR="0" wp14:anchorId="32012F92" wp14:editId="441FFA56">
+            <wp:extent cx="5943600" cy="4876800"/>
+            <wp:effectExtent l="19050" t="19050" r="0" b="0"/>
+            <wp:docPr id="2063426448" name="Picture 1"/>
+            <wp:cNvGraphicFramePr>
+              <a:graphicFrameLocks xmlns:a="http://schemas.openxmlformats.org/drawingml/2006/main" noChangeAspect="1"/>
+            </wp:cNvGraphicFramePr>
+            <a:graphic xmlns:a="http://schemas.openxmlformats.org/drawingml/2006/main">
+              <a:graphicData uri="http://schemas.openxmlformats.org/drawingml/2006/picture">
+                <pic:pic xmlns:pic="http://schemas.openxmlformats.org/drawingml/2006/picture">
+                  <pic:nvPicPr>
+                    <pic:cNvPr id="2063426448" name=""/>
                     <pic:cNvPicPr/>
                   </pic:nvPicPr>
                   <pic:blipFill>
-                    <a:blip r:embed="rId25"/>
+                    <a:blip r:embed="rId27"/>
                     <a:stretch>
                       <a:fillRect/>
                     </a:stretch>
@@ -4187,7 +4703,7 @@
                   <pic:spPr>
                     <a:xfrm>
                       <a:off x="0" y="0"/>
-                      <a:ext cx="5943600" cy="4814570"/>
+                      <a:ext cx="5943600" cy="4876800"/>
                     </a:xfrm>
                     <a:prstGeom prst="rect">
                       <a:avLst/>
@@ -4209,67 +4725,146 @@
     </w:p>
     <w:p>
       <w:pPr>
+        <w:pStyle w:val="BodyText"/>
+      </w:pPr>
+    </w:p>
+    <w:p>
+      <w:pPr>
+        <w:pStyle w:val="BodyText"/>
+      </w:pPr>
+    </w:p>
+    <w:p/>
+    <w:p>
+      <w:pPr>
+        <w:pStyle w:val="Heading1"/>
+        <w:rPr>
+          <w:color w:val="auto"/>
+        </w:rPr>
+      </w:pPr>
+      <w:bookmarkStart w:id="38" w:name="how-channel-partners-can-use-the-system"/>
+      <w:bookmarkStart w:id="39" w:name="_Toc229663323"/>
+      <w:bookmarkEnd w:id="30"/>
+      <w:bookmarkEnd w:id="36"/>
+      <w:r>
+        <w:rPr>
+          <w:color w:val="auto"/>
+        </w:rPr>
+        <w:lastRenderedPageBreak/>
+        <w:t>7. How Channel Partners Can Use the System</w:t>
+      </w:r>
+      <w:bookmarkEnd w:id="39"/>
+    </w:p>
+    <w:p>
+      <w:pPr>
+        <w:pStyle w:val="Heading2"/>
+        <w:rPr>
+          <w:color w:val="auto"/>
+        </w:rPr>
+      </w:pPr>
+      <w:bookmarkStart w:id="40" w:name="partner-driven-campaigns"/>
+      <w:bookmarkStart w:id="41" w:name="_Toc229663324"/>
+      <w:r>
+        <w:rPr>
+          <w:color w:val="auto"/>
+        </w:rPr>
+        <w:t>Partner-Driven Campaigns</w:t>
+      </w:r>
+      <w:bookmarkEnd w:id="41"/>
+    </w:p>
+    <w:p>
+      <w:pPr>
         <w:pStyle w:val="FirstParagraph"/>
       </w:pPr>
       <w:r>
-        <w:br/>
-        <w:t>The self-assessment reports help organizations understand:</w:t>
-      </w:r>
-    </w:p>
-    <w:p>
-      <w:pPr>
-        <w:pStyle w:val="Compact"/>
-        <w:numPr>
-          <w:ilvl w:val="0"/>
-          <w:numId w:val="13"/>
-        </w:numPr>
-      </w:pPr>
-      <w:r>
-        <w:t>Current readiness status</w:t>
-      </w:r>
-    </w:p>
-    <w:p>
-      <w:pPr>
-        <w:pStyle w:val="Compact"/>
-        <w:numPr>
-          <w:ilvl w:val="0"/>
-          <w:numId w:val="13"/>
-        </w:numPr>
-      </w:pPr>
-      <w:r>
-        <w:t>Compliance gaps</w:t>
-      </w:r>
-    </w:p>
-    <w:p>
-      <w:pPr>
-        <w:pStyle w:val="Compact"/>
-        <w:numPr>
-          <w:ilvl w:val="0"/>
-          <w:numId w:val="13"/>
-        </w:numPr>
-      </w:pPr>
-      <w:r>
-        <w:t>Areas requiring additional work</w:t>
-      </w:r>
-    </w:p>
-    <w:p>
-      <w:pPr>
-        <w:pStyle w:val="Compact"/>
-        <w:numPr>
-          <w:ilvl w:val="0"/>
-          <w:numId w:val="13"/>
-        </w:numPr>
-      </w:pPr>
-      <w:r>
-        <w:t xml:space="preserve">Suggested improvement </w:t>
-      </w:r>
-      <w:proofErr w:type="gramStart"/>
-      <w:r>
-        <w:t>focus</w:t>
-      </w:r>
-      <w:proofErr w:type="gramEnd"/>
-      <w:r>
-        <w:t xml:space="preserve"> areas</w:t>
+        <w:t>These Readiness Assessment and Self-Assessment tools are designed to support partner-led engagement models.</w:t>
+      </w:r>
+    </w:p>
+    <w:p>
+      <w:pPr>
+        <w:pStyle w:val="BodyText"/>
+      </w:pPr>
+      <w:r>
+        <w:t>Channel partners can:</w:t>
+      </w:r>
+    </w:p>
+    <w:p>
+      <w:pPr>
+        <w:pStyle w:val="Compact"/>
+        <w:numPr>
+          <w:ilvl w:val="0"/>
+          <w:numId w:val="15"/>
+        </w:numPr>
+      </w:pPr>
+      <w:r>
+        <w:t>Share branded campaign links</w:t>
+      </w:r>
+    </w:p>
+    <w:p>
+      <w:pPr>
+        <w:pStyle w:val="Compact"/>
+        <w:numPr>
+          <w:ilvl w:val="0"/>
+          <w:numId w:val="15"/>
+        </w:numPr>
+      </w:pPr>
+      <w:r>
+        <w:t>Run outreach campaigns</w:t>
+      </w:r>
+    </w:p>
+    <w:p>
+      <w:pPr>
+        <w:pStyle w:val="Compact"/>
+        <w:numPr>
+          <w:ilvl w:val="0"/>
+          <w:numId w:val="15"/>
+        </w:numPr>
+      </w:pPr>
+      <w:r>
+        <w:t>Use custom landing pages</w:t>
+      </w:r>
+    </w:p>
+    <w:p>
+      <w:pPr>
+        <w:pStyle w:val="Compact"/>
+        <w:numPr>
+          <w:ilvl w:val="0"/>
+          <w:numId w:val="15"/>
+        </w:numPr>
+      </w:pPr>
+      <w:r>
+        <w:t>Receive customer engagement visibility</w:t>
+      </w:r>
+    </w:p>
+    <w:p>
+      <w:pPr>
+        <w:pStyle w:val="Compact"/>
+        <w:numPr>
+          <w:ilvl w:val="0"/>
+          <w:numId w:val="15"/>
+        </w:numPr>
+      </w:pPr>
+      <w:r>
+        <w:t>Use generated reports for follow-up conversations</w:t>
+      </w:r>
+    </w:p>
+    <w:p>
+      <w:pPr>
+        <w:pStyle w:val="Compact"/>
+        <w:numPr>
+          <w:ilvl w:val="0"/>
+          <w:numId w:val="15"/>
+        </w:numPr>
+      </w:pPr>
+      <w:r>
+        <w:t>Position remediation and consulting services</w:t>
+      </w:r>
+    </w:p>
+    <w:p>
+      <w:pPr>
+        <w:pStyle w:val="FirstParagraph"/>
+      </w:pPr>
+      <w:r>
+        <w:t>The Malyszek implementation is an example of this partner-driven model.</w:t>
       </w:r>
     </w:p>
     <w:p/>
@@ -4280,125 +4875,594 @@
           <w:color w:val="auto"/>
         </w:rPr>
       </w:pPr>
-      <w:bookmarkStart w:id="34" w:name="_Toc229651023"/>
-      <w:bookmarkStart w:id="35" w:name="soc-2-readiness-reports"/>
-      <w:bookmarkEnd w:id="33"/>
+      <w:bookmarkStart w:id="42" w:name="why-this-matters-for-partners"/>
+      <w:bookmarkStart w:id="43" w:name="_Toc229663325"/>
+      <w:bookmarkEnd w:id="40"/>
       <w:r>
         <w:rPr>
           <w:color w:val="auto"/>
         </w:rPr>
+        <w:t>Why This Matters for Partners</w:t>
+      </w:r>
+      <w:bookmarkEnd w:id="43"/>
+    </w:p>
+    <w:p>
+      <w:pPr>
+        <w:pStyle w:val="FirstParagraph"/>
+      </w:pPr>
+      <w:r>
+        <w:t>The workflows help partners:</w:t>
+      </w:r>
+    </w:p>
+    <w:p>
+      <w:pPr>
+        <w:pStyle w:val="Compact"/>
+        <w:numPr>
+          <w:ilvl w:val="0"/>
+          <w:numId w:val="16"/>
+        </w:numPr>
+      </w:pPr>
+      <w:r>
+        <w:t>Start conversations faster</w:t>
+      </w:r>
+    </w:p>
+    <w:p>
+      <w:pPr>
+        <w:pStyle w:val="Compact"/>
+        <w:numPr>
+          <w:ilvl w:val="0"/>
+          <w:numId w:val="16"/>
+        </w:numPr>
+      </w:pPr>
+      <w:r>
+        <w:t>Reduce manual discovery effort</w:t>
+      </w:r>
+    </w:p>
+    <w:p>
+      <w:pPr>
+        <w:pStyle w:val="Compact"/>
+        <w:numPr>
+          <w:ilvl w:val="0"/>
+          <w:numId w:val="16"/>
+        </w:numPr>
+      </w:pPr>
+      <w:r>
+        <w:t>Generate compliance discussions earlier</w:t>
+      </w:r>
+    </w:p>
+    <w:p>
+      <w:pPr>
+        <w:pStyle w:val="Compact"/>
+        <w:numPr>
+          <w:ilvl w:val="0"/>
+          <w:numId w:val="16"/>
+        </w:numPr>
+      </w:pPr>
+      <w:r>
+        <w:t>Create consulting opportunities</w:t>
+      </w:r>
+    </w:p>
+    <w:p>
+      <w:pPr>
+        <w:pStyle w:val="Compact"/>
+        <w:numPr>
+          <w:ilvl w:val="0"/>
+          <w:numId w:val="16"/>
+        </w:numPr>
+      </w:pPr>
+      <w:r>
+        <w:t>Scale outreach without large technical teams</w:t>
+      </w:r>
+    </w:p>
+    <w:p>
+      <w:pPr>
+        <w:pStyle w:val="FirstParagraph"/>
+      </w:pPr>
+      <w:r>
+        <w:t>Instead of beginning with generic cybersecurity conversations, partners can immediately discuss:</w:t>
+      </w:r>
+    </w:p>
+    <w:p>
+      <w:pPr>
+        <w:pStyle w:val="Compact"/>
+        <w:numPr>
+          <w:ilvl w:val="0"/>
+          <w:numId w:val="17"/>
+        </w:numPr>
+      </w:pPr>
+      <w:r>
+        <w:t>Readiness findings</w:t>
+      </w:r>
+    </w:p>
+    <w:p>
+      <w:pPr>
+        <w:pStyle w:val="Compact"/>
+        <w:numPr>
+          <w:ilvl w:val="0"/>
+          <w:numId w:val="17"/>
+        </w:numPr>
+      </w:pPr>
+      <w:r>
+        <w:t>Gap areas</w:t>
+      </w:r>
+    </w:p>
+    <w:p>
+      <w:pPr>
+        <w:pStyle w:val="Compact"/>
+        <w:numPr>
+          <w:ilvl w:val="0"/>
+          <w:numId w:val="17"/>
+        </w:numPr>
+      </w:pPr>
+      <w:r>
+        <w:t>Business risks</w:t>
+      </w:r>
+    </w:p>
+    <w:p>
+      <w:pPr>
+        <w:pStyle w:val="Compact"/>
+        <w:numPr>
+          <w:ilvl w:val="0"/>
+          <w:numId w:val="17"/>
+        </w:numPr>
+      </w:pPr>
+      <w:r>
+        <w:t>Improvement opportunities</w:t>
+      </w:r>
+    </w:p>
+    <w:p/>
+    <w:p>
+      <w:pPr>
+        <w:pStyle w:val="Heading1"/>
+        <w:rPr>
+          <w:color w:val="auto"/>
+        </w:rPr>
+      </w:pPr>
+      <w:bookmarkStart w:id="44" w:name="example-funnel-progression"/>
+      <w:bookmarkStart w:id="45" w:name="_Toc229663326"/>
+      <w:bookmarkEnd w:id="38"/>
+      <w:bookmarkEnd w:id="42"/>
+      <w:r>
+        <w:rPr>
+          <w:color w:val="auto"/>
+        </w:rPr>
+        <w:t>8. Example Funnel Progression</w:t>
+      </w:r>
+      <w:bookmarkEnd w:id="45"/>
+    </w:p>
+    <w:p>
+      <w:pPr>
+        <w:pStyle w:val="Heading2"/>
+        <w:rPr>
+          <w:color w:val="auto"/>
+        </w:rPr>
+      </w:pPr>
+      <w:bookmarkStart w:id="46" w:name="awareness-stage"/>
+      <w:bookmarkStart w:id="47" w:name="_Toc229663327"/>
+      <w:r>
+        <w:rPr>
+          <w:color w:val="auto"/>
+        </w:rPr>
+        <w:t>Awareness Stage</w:t>
+      </w:r>
+      <w:bookmarkEnd w:id="47"/>
+    </w:p>
+    <w:p>
+      <w:pPr>
+        <w:pStyle w:val="FirstParagraph"/>
+      </w:pPr>
+      <w:r>
+        <w:t>Customer encounters:</w:t>
+      </w:r>
+    </w:p>
+    <w:p>
+      <w:pPr>
+        <w:pStyle w:val="Compact"/>
+        <w:numPr>
+          <w:ilvl w:val="0"/>
+          <w:numId w:val="18"/>
+        </w:numPr>
+      </w:pPr>
+      <w:r>
         <w:lastRenderedPageBreak/>
-        <w:t>SOC 2 Readiness Reports</w:t>
-      </w:r>
-      <w:bookmarkEnd w:id="34"/>
+        <w:t>Campaign landing page</w:t>
+      </w:r>
+    </w:p>
+    <w:p>
+      <w:pPr>
+        <w:pStyle w:val="Compact"/>
+        <w:numPr>
+          <w:ilvl w:val="0"/>
+          <w:numId w:val="18"/>
+        </w:numPr>
+      </w:pPr>
+      <w:r>
+        <w:t>Readiness messaging</w:t>
+      </w:r>
+    </w:p>
+    <w:p>
+      <w:pPr>
+        <w:pStyle w:val="Compact"/>
+        <w:numPr>
+          <w:ilvl w:val="0"/>
+          <w:numId w:val="18"/>
+        </w:numPr>
+      </w:pPr>
+      <w:r>
+        <w:t>Compliance awareness content</w:t>
+      </w:r>
+    </w:p>
+    <w:p/>
+    <w:p>
+      <w:pPr>
+        <w:pStyle w:val="Heading2"/>
+        <w:rPr>
+          <w:color w:val="auto"/>
+        </w:rPr>
+      </w:pPr>
+      <w:bookmarkStart w:id="48" w:name="engagement-stage"/>
+      <w:bookmarkStart w:id="49" w:name="_Toc229663328"/>
+      <w:bookmarkEnd w:id="46"/>
+      <w:r>
+        <w:rPr>
+          <w:color w:val="auto"/>
+        </w:rPr>
+        <w:t>Engagement Stage</w:t>
+      </w:r>
+      <w:bookmarkEnd w:id="49"/>
     </w:p>
     <w:p>
       <w:pPr>
         <w:pStyle w:val="FirstParagraph"/>
       </w:pPr>
       <w:r>
-        <w:t>SOC 2 readiness workflows generate:</w:t>
-      </w:r>
-    </w:p>
-    <w:p>
-      <w:pPr>
-        <w:pStyle w:val="Compact"/>
-        <w:numPr>
-          <w:ilvl w:val="0"/>
-          <w:numId w:val="14"/>
-        </w:numPr>
-      </w:pPr>
-      <w:r>
-        <w:t>Self-assessment report summarizing readiness findings</w:t>
-      </w:r>
-    </w:p>
-    <w:p>
-      <w:pPr>
-        <w:pStyle w:val="Compact"/>
-        <w:numPr>
-          <w:ilvl w:val="0"/>
-          <w:numId w:val="14"/>
-        </w:numPr>
-      </w:pPr>
-      <w:r>
-        <w:t>Gap-oriented observations</w:t>
-      </w:r>
-    </w:p>
-    <w:p>
-      <w:pPr>
-        <w:pStyle w:val="Compact"/>
-        <w:numPr>
-          <w:ilvl w:val="0"/>
-          <w:numId w:val="14"/>
-        </w:numPr>
-      </w:pPr>
-      <w:r>
-        <w:t>Operational maturity indicators</w:t>
-      </w:r>
-    </w:p>
-    <w:p>
-      <w:pPr>
-        <w:pStyle w:val="Compact"/>
-        <w:numPr>
-          <w:ilvl w:val="0"/>
-          <w:numId w:val="14"/>
-        </w:numPr>
-      </w:pPr>
-      <w:r>
-        <w:t>Directional compliance insights</w:t>
-      </w:r>
+        <w:t>Customer:</w:t>
+      </w:r>
+    </w:p>
+    <w:p>
+      <w:pPr>
+        <w:pStyle w:val="Compact"/>
+        <w:numPr>
+          <w:ilvl w:val="0"/>
+          <w:numId w:val="19"/>
+        </w:numPr>
+      </w:pPr>
+      <w:r>
+        <w:t>Starts assessment</w:t>
+      </w:r>
+    </w:p>
+    <w:p>
+      <w:pPr>
+        <w:pStyle w:val="Compact"/>
+        <w:numPr>
+          <w:ilvl w:val="0"/>
+          <w:numId w:val="19"/>
+        </w:numPr>
+      </w:pPr>
+      <w:r>
+        <w:t>Completes readiness questions</w:t>
+      </w:r>
+    </w:p>
+    <w:p>
+      <w:pPr>
+        <w:pStyle w:val="Compact"/>
+        <w:numPr>
+          <w:ilvl w:val="0"/>
+          <w:numId w:val="19"/>
+        </w:numPr>
+      </w:pPr>
+      <w:r>
+        <w:t>Interacts with assessment workflow</w:t>
+      </w:r>
+    </w:p>
+    <w:p/>
+    <w:p>
+      <w:pPr>
+        <w:pStyle w:val="Heading2"/>
+        <w:rPr>
+          <w:color w:val="auto"/>
+        </w:rPr>
+      </w:pPr>
+      <w:bookmarkStart w:id="50" w:name="evaluation-stage"/>
+      <w:bookmarkStart w:id="51" w:name="_Toc229663329"/>
+      <w:bookmarkEnd w:id="48"/>
+      <w:r>
+        <w:rPr>
+          <w:color w:val="auto"/>
+        </w:rPr>
+        <w:t>Evaluation Stage</w:t>
+      </w:r>
+      <w:bookmarkEnd w:id="51"/>
     </w:p>
     <w:p>
       <w:pPr>
         <w:pStyle w:val="FirstParagraph"/>
       </w:pPr>
       <w:r>
-        <w:t>These self-assessment reports are intended to serve as starting points for deeper readiness discussions.</w:t>
+        <w:t>Customer receives:</w:t>
+      </w:r>
+    </w:p>
+    <w:p>
+      <w:pPr>
+        <w:pStyle w:val="Compact"/>
+        <w:numPr>
+          <w:ilvl w:val="0"/>
+          <w:numId w:val="20"/>
+        </w:numPr>
+      </w:pPr>
+      <w:r>
+        <w:t>Readiness report</w:t>
+      </w:r>
+    </w:p>
+    <w:p>
+      <w:pPr>
+        <w:pStyle w:val="Compact"/>
+        <w:numPr>
+          <w:ilvl w:val="0"/>
+          <w:numId w:val="20"/>
+        </w:numPr>
+      </w:pPr>
+      <w:r>
+        <w:t>Gap observations</w:t>
+      </w:r>
+    </w:p>
+    <w:p>
+      <w:pPr>
+        <w:pStyle w:val="Compact"/>
+        <w:numPr>
+          <w:ilvl w:val="0"/>
+          <w:numId w:val="20"/>
+        </w:numPr>
+      </w:pPr>
+      <w:r>
+        <w:t>Compliance insights</w:t>
       </w:r>
     </w:p>
     <w:p/>
     <w:p>
       <w:pPr>
+        <w:pStyle w:val="Heading2"/>
+        <w:rPr>
+          <w:color w:val="auto"/>
+        </w:rPr>
+      </w:pPr>
+      <w:bookmarkStart w:id="52" w:name="follow-up-stage"/>
+      <w:bookmarkStart w:id="53" w:name="_Toc229663330"/>
+      <w:bookmarkEnd w:id="50"/>
+      <w:r>
+        <w:rPr>
+          <w:color w:val="auto"/>
+        </w:rPr>
+        <w:t>Follow-Up Stage</w:t>
+      </w:r>
+      <w:bookmarkEnd w:id="53"/>
+    </w:p>
+    <w:p>
+      <w:pPr>
+        <w:pStyle w:val="FirstParagraph"/>
+      </w:pPr>
+      <w:r>
+        <w:t>Partner engages customer regarding:</w:t>
+      </w:r>
+    </w:p>
+    <w:p>
+      <w:pPr>
+        <w:pStyle w:val="Compact"/>
+        <w:numPr>
+          <w:ilvl w:val="0"/>
+          <w:numId w:val="21"/>
+        </w:numPr>
+      </w:pPr>
+      <w:r>
+        <w:t>Readiness findings</w:t>
+      </w:r>
+    </w:p>
+    <w:p>
+      <w:pPr>
+        <w:pStyle w:val="Compact"/>
+        <w:numPr>
+          <w:ilvl w:val="0"/>
+          <w:numId w:val="21"/>
+        </w:numPr>
+      </w:pPr>
+      <w:r>
+        <w:t>Remediation priorities</w:t>
+      </w:r>
+    </w:p>
+    <w:p>
+      <w:pPr>
+        <w:pStyle w:val="Compact"/>
+        <w:numPr>
+          <w:ilvl w:val="0"/>
+          <w:numId w:val="21"/>
+        </w:numPr>
+      </w:pPr>
+      <w:r>
+        <w:t>Consulting opportunities</w:t>
+      </w:r>
+    </w:p>
+    <w:p>
+      <w:pPr>
+        <w:pStyle w:val="Compact"/>
+        <w:numPr>
+          <w:ilvl w:val="0"/>
+          <w:numId w:val="21"/>
+        </w:numPr>
+      </w:pPr>
+      <w:r>
+        <w:t>Managed compliance services</w:t>
+      </w:r>
+    </w:p>
+    <w:p/>
+    <w:p>
+      <w:pPr>
         <w:pStyle w:val="Heading1"/>
         <w:rPr>
           <w:color w:val="auto"/>
         </w:rPr>
       </w:pPr>
-      <w:bookmarkStart w:id="36" w:name="_Toc229651024"/>
-      <w:bookmarkStart w:id="37" w:name="how-channel-partners-can-use-the-system"/>
-      <w:bookmarkEnd w:id="31"/>
-      <w:bookmarkEnd w:id="35"/>
+      <w:bookmarkStart w:id="54" w:name="current-capabilities"/>
+      <w:bookmarkStart w:id="55" w:name="_Toc229663331"/>
+      <w:bookmarkEnd w:id="44"/>
+      <w:bookmarkEnd w:id="52"/>
       <w:r>
         <w:rPr>
           <w:color w:val="auto"/>
         </w:rPr>
-        <w:t>7. How Channel Partners Can Use the System</w:t>
-      </w:r>
-      <w:bookmarkEnd w:id="36"/>
-    </w:p>
-    <w:p>
-      <w:pPr>
-        <w:pStyle w:val="Heading2"/>
+        <w:t>9. Current Capabilities</w:t>
+      </w:r>
+      <w:bookmarkEnd w:id="55"/>
+    </w:p>
+    <w:p>
+      <w:pPr>
+        <w:pStyle w:val="FirstParagraph"/>
+      </w:pPr>
+      <w:r>
+        <w:t>Partners and external collaborators can count on the following being available and working today:</w:t>
+      </w:r>
+    </w:p>
+    <w:p>
+      <w:pPr>
+        <w:pStyle w:val="Compact"/>
+        <w:numPr>
+          <w:ilvl w:val="0"/>
+          <w:numId w:val="22"/>
+        </w:numPr>
+      </w:pPr>
+      <w:r>
+        <w:t>Live public landing pages with campaign and partner-branded variants</w:t>
+      </w:r>
+    </w:p>
+    <w:p>
+      <w:pPr>
+        <w:pStyle w:val="Compact"/>
+        <w:numPr>
+          <w:ilvl w:val="0"/>
+          <w:numId w:val="22"/>
+        </w:numPr>
+      </w:pPr>
+      <w:r>
+        <w:t>Guided CMMC and SOC 2 Self-Assessments that prospects can complete independently</w:t>
+      </w:r>
+    </w:p>
+    <w:p>
+      <w:pPr>
+        <w:pStyle w:val="Compact"/>
+        <w:numPr>
+          <w:ilvl w:val="0"/>
+          <w:numId w:val="22"/>
+        </w:numPr>
+      </w:pPr>
+      <w:r>
+        <w:t>Automated self-assessment reports delivered to prospects upon completion</w:t>
+      </w:r>
+    </w:p>
+    <w:p>
+      <w:pPr>
+        <w:pStyle w:val="Compact"/>
+        <w:numPr>
+          <w:ilvl w:val="0"/>
+          <w:numId w:val="22"/>
+        </w:numPr>
+      </w:pPr>
+      <w:r>
+        <w:t>Automated assessment-triggered emails keeping prospects informed at each stage</w:t>
+      </w:r>
+    </w:p>
+    <w:p>
+      <w:pPr>
+        <w:pStyle w:val="Compact"/>
+        <w:numPr>
+          <w:ilvl w:val="0"/>
+          <w:numId w:val="22"/>
+        </w:numPr>
+      </w:pPr>
+      <w:r>
+        <w:lastRenderedPageBreak/>
+        <w:t>Partner visibility into prospect engagement and assessment completion</w:t>
+      </w:r>
+    </w:p>
+    <w:p>
+      <w:pPr>
+        <w:pStyle w:val="Compact"/>
+        <w:numPr>
+          <w:ilvl w:val="0"/>
+          <w:numId w:val="22"/>
+        </w:numPr>
+      </w:pPr>
+      <w:r>
+        <w:t>A self-service experience prospects can complete in under 30 minutes</w:t>
+      </w:r>
+    </w:p>
+    <w:p>
+      <w:pPr>
+        <w:pStyle w:val="FirstParagraph"/>
+      </w:pPr>
+      <w:r>
+        <w:t>Self-assessment reports available today:</w:t>
+      </w:r>
+    </w:p>
+    <w:p>
+      <w:pPr>
+        <w:pStyle w:val="Compact"/>
+        <w:numPr>
+          <w:ilvl w:val="0"/>
+          <w:numId w:val="23"/>
+        </w:numPr>
+      </w:pPr>
+      <w:r>
+        <w:t>CMMC Level 1 Self-Assessment report</w:t>
+      </w:r>
+    </w:p>
+    <w:p>
+      <w:pPr>
+        <w:pStyle w:val="Compact"/>
+        <w:numPr>
+          <w:ilvl w:val="0"/>
+          <w:numId w:val="23"/>
+        </w:numPr>
+      </w:pPr>
+      <w:r>
+        <w:t>SOC 2 Readiness Self-Assessment report</w:t>
+      </w:r>
+    </w:p>
+    <w:p>
+      <w:pPr>
+        <w:pStyle w:val="Compact"/>
+        <w:numPr>
+          <w:ilvl w:val="0"/>
+          <w:numId w:val="24"/>
+        </w:numPr>
+      </w:pPr>
+      <w:r>
+        <w:t>CMMC Level 2 Self-Assessment report</w:t>
+      </w:r>
+    </w:p>
+    <w:p/>
+    <w:p>
+      <w:pPr>
+        <w:pStyle w:val="Heading1"/>
         <w:rPr>
           <w:color w:val="auto"/>
         </w:rPr>
       </w:pPr>
-      <w:bookmarkStart w:id="38" w:name="_Toc229651025"/>
-      <w:bookmarkStart w:id="39" w:name="partner-driven-campaigns"/>
+      <w:bookmarkStart w:id="56" w:name="business-value"/>
+      <w:bookmarkStart w:id="57" w:name="_Toc229663332"/>
+      <w:bookmarkEnd w:id="54"/>
       <w:r>
         <w:rPr>
           <w:color w:val="auto"/>
         </w:rPr>
-        <w:t>Partner-Driven Campaigns</w:t>
-      </w:r>
-      <w:bookmarkEnd w:id="38"/>
+        <w:t>10. Business Value</w:t>
+      </w:r>
+      <w:bookmarkEnd w:id="57"/>
     </w:p>
     <w:p>
       <w:pPr>
         <w:pStyle w:val="FirstParagraph"/>
       </w:pPr>
       <w:r>
-        <w:t>These Readiness Assessment and Self-Assessment tools are designed to support partner-led engagement models.</w:t>
+        <w:t>These tools help transform compliance engagement from:</w:t>
       </w:r>
     </w:p>
     <w:p>
@@ -4406,872 +5470,177 @@
         <w:pStyle w:val="BodyText"/>
       </w:pPr>
       <w:r>
-        <w:t>Channel partners can:</w:t>
-      </w:r>
-    </w:p>
-    <w:p>
-      <w:pPr>
-        <w:pStyle w:val="Compact"/>
-        <w:numPr>
-          <w:ilvl w:val="0"/>
-          <w:numId w:val="15"/>
-        </w:numPr>
-      </w:pPr>
-      <w:r>
-        <w:t>Share branded campaign links</w:t>
-      </w:r>
-    </w:p>
-    <w:p>
-      <w:pPr>
-        <w:pStyle w:val="Compact"/>
-        <w:numPr>
-          <w:ilvl w:val="0"/>
-          <w:numId w:val="15"/>
-        </w:numPr>
-      </w:pPr>
-      <w:r>
-        <w:t>Run outreach campaigns</w:t>
-      </w:r>
-    </w:p>
-    <w:p>
-      <w:pPr>
-        <w:pStyle w:val="Compact"/>
-        <w:numPr>
-          <w:ilvl w:val="0"/>
-          <w:numId w:val="15"/>
-        </w:numPr>
-      </w:pPr>
-      <w:r>
-        <w:t>Use custom landing pages</w:t>
-      </w:r>
-    </w:p>
-    <w:p>
-      <w:pPr>
-        <w:pStyle w:val="Compact"/>
-        <w:numPr>
-          <w:ilvl w:val="0"/>
-          <w:numId w:val="15"/>
-        </w:numPr>
-      </w:pPr>
-      <w:r>
-        <w:t>Receive customer engagement visibility</w:t>
-      </w:r>
-    </w:p>
-    <w:p>
-      <w:pPr>
-        <w:pStyle w:val="Compact"/>
-        <w:numPr>
-          <w:ilvl w:val="0"/>
-          <w:numId w:val="15"/>
-        </w:numPr>
-      </w:pPr>
-      <w:r>
-        <w:t>Use generated reports for follow-up conversations</w:t>
-      </w:r>
-    </w:p>
-    <w:p>
-      <w:pPr>
-        <w:pStyle w:val="Compact"/>
-        <w:numPr>
-          <w:ilvl w:val="0"/>
-          <w:numId w:val="15"/>
-        </w:numPr>
-      </w:pPr>
-      <w:r>
-        <w:t>Position remediation and consulting services</w:t>
-      </w:r>
+        <w:t>Traditional Manual Discovery → Guided Automated Readiness Engagement</w:t>
+      </w:r>
+    </w:p>
+    <w:p>
+      <w:pPr>
+        <w:pStyle w:val="BodyText"/>
+      </w:pPr>
+      <w:r>
+        <w:t>This creates value for:</w:t>
+      </w:r>
+    </w:p>
+    <w:p>
+      <w:pPr>
+        <w:pStyle w:val="Compact"/>
+        <w:numPr>
+          <w:ilvl w:val="0"/>
+          <w:numId w:val="25"/>
+        </w:numPr>
+      </w:pPr>
+      <w:r>
+        <w:t>Customers seeking quick readiness visibility</w:t>
+      </w:r>
+    </w:p>
+    <w:p>
+      <w:pPr>
+        <w:pStyle w:val="Compact"/>
+        <w:numPr>
+          <w:ilvl w:val="0"/>
+          <w:numId w:val="25"/>
+        </w:numPr>
+      </w:pPr>
+      <w:r>
+        <w:t>Channel partners needing scalable outreach</w:t>
+      </w:r>
+    </w:p>
+    <w:p>
+      <w:pPr>
+        <w:pStyle w:val="Compact"/>
+        <w:numPr>
+          <w:ilvl w:val="0"/>
+          <w:numId w:val="25"/>
+        </w:numPr>
+      </w:pPr>
+      <w:r>
+        <w:t>GTM teams looking for engagement acceleration</w:t>
+      </w:r>
+    </w:p>
+    <w:p>
+      <w:pPr>
+        <w:pStyle w:val="Compact"/>
+        <w:numPr>
+          <w:ilvl w:val="0"/>
+          <w:numId w:val="25"/>
+        </w:numPr>
+      </w:pPr>
+      <w:r>
+        <w:t>Consulting organizations seeking qualified compliance leads</w:t>
+      </w:r>
+    </w:p>
+    <w:p/>
+    <w:p>
+      <w:pPr>
+        <w:pStyle w:val="Heading1"/>
+        <w:rPr>
+          <w:color w:val="auto"/>
+        </w:rPr>
+      </w:pPr>
+      <w:bookmarkStart w:id="58" w:name="final-summary"/>
+      <w:bookmarkStart w:id="59" w:name="_Toc229663333"/>
+      <w:bookmarkEnd w:id="56"/>
+      <w:r>
+        <w:rPr>
+          <w:color w:val="auto"/>
+        </w:rPr>
+        <w:t>Final Summary</w:t>
+      </w:r>
+      <w:bookmarkEnd w:id="59"/>
     </w:p>
     <w:p>
       <w:pPr>
         <w:pStyle w:val="FirstParagraph"/>
       </w:pPr>
-      <w:r>
-        <w:t>The Malyszek implementation is an example of this partner-driven model.</w:t>
-      </w:r>
-    </w:p>
-    <w:p/>
-    <w:p>
-      <w:pPr>
-        <w:pStyle w:val="Heading2"/>
-        <w:rPr>
-          <w:color w:val="auto"/>
-        </w:rPr>
-      </w:pPr>
-      <w:bookmarkStart w:id="40" w:name="_Toc229651026"/>
-      <w:bookmarkStart w:id="41" w:name="why-this-matters-for-partners"/>
-      <w:bookmarkEnd w:id="39"/>
-      <w:r>
-        <w:rPr>
-          <w:color w:val="auto"/>
-        </w:rPr>
-        <w:t>Why This Matters for Partners</w:t>
-      </w:r>
-      <w:bookmarkEnd w:id="40"/>
+      <w:proofErr w:type="spellStart"/>
+      <w:r>
+        <w:t>Opsfolio’s</w:t>
+      </w:r>
+      <w:proofErr w:type="spellEnd"/>
+      <w:r>
+        <w:t xml:space="preserve"> Readiness Assessment and Self-Assessment tools provide a structured, customer-friendly compliance engagement experience that combines:</w:t>
+      </w:r>
+    </w:p>
+    <w:p>
+      <w:pPr>
+        <w:pStyle w:val="Compact"/>
+        <w:numPr>
+          <w:ilvl w:val="0"/>
+          <w:numId w:val="26"/>
+        </w:numPr>
+      </w:pPr>
+      <w:r>
+        <w:t>Readiness assessments</w:t>
+      </w:r>
+    </w:p>
+    <w:p>
+      <w:pPr>
+        <w:pStyle w:val="Compact"/>
+        <w:numPr>
+          <w:ilvl w:val="0"/>
+          <w:numId w:val="26"/>
+        </w:numPr>
+      </w:pPr>
+      <w:r>
+        <w:t>Automated reporting</w:t>
+      </w:r>
+    </w:p>
+    <w:p>
+      <w:pPr>
+        <w:pStyle w:val="Compact"/>
+        <w:numPr>
+          <w:ilvl w:val="0"/>
+          <w:numId w:val="26"/>
+        </w:numPr>
+      </w:pPr>
+      <w:r>
+        <w:t>Partner-led engagement</w:t>
+      </w:r>
+    </w:p>
+    <w:p>
+      <w:pPr>
+        <w:pStyle w:val="Compact"/>
+        <w:numPr>
+          <w:ilvl w:val="0"/>
+          <w:numId w:val="26"/>
+        </w:numPr>
+      </w:pPr>
+      <w:r>
+        <w:t>Customer education</w:t>
+      </w:r>
+    </w:p>
+    <w:p>
+      <w:pPr>
+        <w:pStyle w:val="Compact"/>
+        <w:numPr>
+          <w:ilvl w:val="0"/>
+          <w:numId w:val="26"/>
+        </w:numPr>
+      </w:pPr>
+      <w:r>
+        <w:t>Compliance awareness</w:t>
+      </w:r>
+    </w:p>
+    <w:p>
+      <w:pPr>
+        <w:pStyle w:val="Compact"/>
+        <w:numPr>
+          <w:ilvl w:val="0"/>
+          <w:numId w:val="26"/>
+        </w:numPr>
+      </w:pPr>
+      <w:r>
+        <w:t>Funnel acceleration</w:t>
+      </w:r>
     </w:p>
     <w:p>
       <w:pPr>
         <w:pStyle w:val="FirstParagraph"/>
       </w:pPr>
       <w:r>
-        <w:t>The workflows help partners:</w:t>
-      </w:r>
-    </w:p>
-    <w:p>
-      <w:pPr>
-        <w:pStyle w:val="Compact"/>
-        <w:numPr>
-          <w:ilvl w:val="0"/>
-          <w:numId w:val="16"/>
-        </w:numPr>
-      </w:pPr>
-      <w:r>
-        <w:t>Start conversations faster</w:t>
-      </w:r>
-    </w:p>
-    <w:p>
-      <w:pPr>
-        <w:pStyle w:val="Compact"/>
-        <w:numPr>
-          <w:ilvl w:val="0"/>
-          <w:numId w:val="16"/>
-        </w:numPr>
-      </w:pPr>
-      <w:r>
-        <w:t>Reduce manual discovery effort</w:t>
-      </w:r>
-    </w:p>
-    <w:p>
-      <w:pPr>
-        <w:pStyle w:val="Compact"/>
-        <w:numPr>
-          <w:ilvl w:val="0"/>
-          <w:numId w:val="16"/>
-        </w:numPr>
-      </w:pPr>
-      <w:r>
-        <w:t>Generate compliance discussions earlier</w:t>
-      </w:r>
-    </w:p>
-    <w:p>
-      <w:pPr>
-        <w:pStyle w:val="Compact"/>
-        <w:numPr>
-          <w:ilvl w:val="0"/>
-          <w:numId w:val="16"/>
-        </w:numPr>
-      </w:pPr>
-      <w:r>
-        <w:t>Create consulting opportunities</w:t>
-      </w:r>
-    </w:p>
-    <w:p>
-      <w:pPr>
-        <w:pStyle w:val="Compact"/>
-        <w:numPr>
-          <w:ilvl w:val="0"/>
-          <w:numId w:val="16"/>
-        </w:numPr>
-      </w:pPr>
-      <w:r>
-        <w:t>Scale outreach without large technical teams</w:t>
-      </w:r>
-    </w:p>
-    <w:p>
-      <w:pPr>
-        <w:pStyle w:val="FirstParagraph"/>
-      </w:pPr>
-      <w:r>
-        <w:lastRenderedPageBreak/>
-        <w:t>Instead of beginning with generic cybersecurity conversations, partners can immediately discuss:</w:t>
-      </w:r>
-    </w:p>
-    <w:p>
-      <w:pPr>
-        <w:pStyle w:val="Compact"/>
-        <w:numPr>
-          <w:ilvl w:val="0"/>
-          <w:numId w:val="17"/>
-        </w:numPr>
-      </w:pPr>
-      <w:r>
-        <w:t>Readiness findings</w:t>
-      </w:r>
-    </w:p>
-    <w:p>
-      <w:pPr>
-        <w:pStyle w:val="Compact"/>
-        <w:numPr>
-          <w:ilvl w:val="0"/>
-          <w:numId w:val="17"/>
-        </w:numPr>
-      </w:pPr>
-      <w:r>
-        <w:t>Gap areas</w:t>
-      </w:r>
-    </w:p>
-    <w:p>
-      <w:pPr>
-        <w:pStyle w:val="Compact"/>
-        <w:numPr>
-          <w:ilvl w:val="0"/>
-          <w:numId w:val="17"/>
-        </w:numPr>
-      </w:pPr>
-      <w:r>
-        <w:t>Business risks</w:t>
-      </w:r>
-    </w:p>
-    <w:p>
-      <w:pPr>
-        <w:pStyle w:val="Compact"/>
-        <w:numPr>
-          <w:ilvl w:val="0"/>
-          <w:numId w:val="17"/>
-        </w:numPr>
-      </w:pPr>
-      <w:r>
-        <w:t>Improvement opportunities</w:t>
-      </w:r>
-    </w:p>
-    <w:p/>
-    <w:p>
-      <w:pPr>
-        <w:pStyle w:val="Heading1"/>
-        <w:rPr>
-          <w:color w:val="auto"/>
-        </w:rPr>
-      </w:pPr>
-      <w:bookmarkStart w:id="42" w:name="_Toc229651027"/>
-      <w:bookmarkStart w:id="43" w:name="example-funnel-progression"/>
-      <w:bookmarkEnd w:id="37"/>
-      <w:bookmarkEnd w:id="41"/>
-      <w:r>
-        <w:rPr>
-          <w:color w:val="auto"/>
-        </w:rPr>
-        <w:t>8. Example Funnel Progression</w:t>
-      </w:r>
-      <w:bookmarkEnd w:id="42"/>
-    </w:p>
-    <w:p>
-      <w:pPr>
-        <w:pStyle w:val="Heading2"/>
-        <w:rPr>
-          <w:color w:val="auto"/>
-        </w:rPr>
-      </w:pPr>
-      <w:bookmarkStart w:id="44" w:name="_Toc229651028"/>
-      <w:bookmarkStart w:id="45" w:name="awareness-stage"/>
-      <w:r>
-        <w:rPr>
-          <w:color w:val="auto"/>
-        </w:rPr>
-        <w:t>Awareness Stage</w:t>
-      </w:r>
-      <w:bookmarkEnd w:id="44"/>
-    </w:p>
-    <w:p>
-      <w:pPr>
-        <w:pStyle w:val="FirstParagraph"/>
-      </w:pPr>
-      <w:r>
-        <w:t>Customer encounters:</w:t>
-      </w:r>
-    </w:p>
-    <w:p>
-      <w:pPr>
-        <w:pStyle w:val="Compact"/>
-        <w:numPr>
-          <w:ilvl w:val="0"/>
-          <w:numId w:val="18"/>
-        </w:numPr>
-      </w:pPr>
-      <w:r>
-        <w:t>Campaign landing page</w:t>
-      </w:r>
-    </w:p>
-    <w:p>
-      <w:pPr>
-        <w:pStyle w:val="Compact"/>
-        <w:numPr>
-          <w:ilvl w:val="0"/>
-          <w:numId w:val="18"/>
-        </w:numPr>
-      </w:pPr>
-      <w:r>
-        <w:t>Readiness messaging</w:t>
-      </w:r>
-    </w:p>
-    <w:p>
-      <w:pPr>
-        <w:pStyle w:val="Compact"/>
-        <w:numPr>
-          <w:ilvl w:val="0"/>
-          <w:numId w:val="18"/>
-        </w:numPr>
-      </w:pPr>
-      <w:r>
-        <w:t>Compliance awareness content</w:t>
-      </w:r>
-    </w:p>
-    <w:p/>
-    <w:p>
-      <w:pPr>
-        <w:pStyle w:val="Heading2"/>
-        <w:rPr>
-          <w:color w:val="auto"/>
-        </w:rPr>
-      </w:pPr>
-      <w:bookmarkStart w:id="46" w:name="_Toc229651029"/>
-      <w:bookmarkStart w:id="47" w:name="engagement-stage"/>
-      <w:bookmarkEnd w:id="45"/>
-      <w:r>
-        <w:rPr>
-          <w:color w:val="auto"/>
-        </w:rPr>
-        <w:t>Engagement Stage</w:t>
-      </w:r>
-      <w:bookmarkEnd w:id="46"/>
-    </w:p>
-    <w:p>
-      <w:pPr>
-        <w:pStyle w:val="FirstParagraph"/>
-      </w:pPr>
-      <w:r>
-        <w:t>Customer:</w:t>
-      </w:r>
-    </w:p>
-    <w:p>
-      <w:pPr>
-        <w:pStyle w:val="Compact"/>
-        <w:numPr>
-          <w:ilvl w:val="0"/>
-          <w:numId w:val="19"/>
-        </w:numPr>
-      </w:pPr>
-      <w:r>
-        <w:t>Starts assessment</w:t>
-      </w:r>
-    </w:p>
-    <w:p>
-      <w:pPr>
-        <w:pStyle w:val="Compact"/>
-        <w:numPr>
-          <w:ilvl w:val="0"/>
-          <w:numId w:val="19"/>
-        </w:numPr>
-      </w:pPr>
-      <w:r>
-        <w:t>Completes readiness questions</w:t>
-      </w:r>
-    </w:p>
-    <w:p>
-      <w:pPr>
-        <w:pStyle w:val="Compact"/>
-        <w:numPr>
-          <w:ilvl w:val="0"/>
-          <w:numId w:val="19"/>
-        </w:numPr>
-      </w:pPr>
-      <w:r>
-        <w:t>Interacts with assessment workflow</w:t>
-      </w:r>
-    </w:p>
-    <w:p/>
-    <w:p>
-      <w:pPr>
-        <w:pStyle w:val="Heading2"/>
-        <w:rPr>
-          <w:color w:val="auto"/>
-        </w:rPr>
-      </w:pPr>
-      <w:bookmarkStart w:id="48" w:name="_Toc229651030"/>
-      <w:bookmarkStart w:id="49" w:name="evaluation-stage"/>
-      <w:bookmarkEnd w:id="47"/>
-      <w:r>
-        <w:rPr>
-          <w:color w:val="auto"/>
-        </w:rPr>
-        <w:t>Evaluation Stage</w:t>
-      </w:r>
-      <w:bookmarkEnd w:id="48"/>
-    </w:p>
-    <w:p>
-      <w:pPr>
-        <w:pStyle w:val="FirstParagraph"/>
-      </w:pPr>
-      <w:r>
-        <w:t>Customer receives:</w:t>
-      </w:r>
-    </w:p>
-    <w:p>
-      <w:pPr>
-        <w:pStyle w:val="Compact"/>
-        <w:numPr>
-          <w:ilvl w:val="0"/>
-          <w:numId w:val="20"/>
-        </w:numPr>
-      </w:pPr>
-      <w:r>
-        <w:t>Readiness report</w:t>
-      </w:r>
-    </w:p>
-    <w:p>
-      <w:pPr>
-        <w:pStyle w:val="Compact"/>
-        <w:numPr>
-          <w:ilvl w:val="0"/>
-          <w:numId w:val="20"/>
-        </w:numPr>
-      </w:pPr>
-      <w:r>
-        <w:t>Gap observations</w:t>
-      </w:r>
-    </w:p>
-    <w:p>
-      <w:pPr>
-        <w:pStyle w:val="Compact"/>
-        <w:numPr>
-          <w:ilvl w:val="0"/>
-          <w:numId w:val="20"/>
-        </w:numPr>
-      </w:pPr>
-      <w:r>
-        <w:t>Compliance insights</w:t>
-      </w:r>
-    </w:p>
-    <w:p/>
-    <w:p>
-      <w:pPr>
-        <w:pStyle w:val="Heading2"/>
-        <w:rPr>
-          <w:color w:val="auto"/>
-        </w:rPr>
-      </w:pPr>
-      <w:bookmarkStart w:id="50" w:name="_Toc229651031"/>
-      <w:bookmarkStart w:id="51" w:name="follow-up-stage"/>
-      <w:bookmarkEnd w:id="49"/>
-      <w:r>
-        <w:rPr>
-          <w:color w:val="auto"/>
-        </w:rPr>
-        <w:t>Follow-Up Stage</w:t>
-      </w:r>
-      <w:bookmarkEnd w:id="50"/>
-    </w:p>
-    <w:p>
-      <w:pPr>
-        <w:pStyle w:val="FirstParagraph"/>
-      </w:pPr>
-      <w:r>
-        <w:t>Partner engages customer regarding:</w:t>
-      </w:r>
-    </w:p>
-    <w:p>
-      <w:pPr>
-        <w:pStyle w:val="Compact"/>
-        <w:numPr>
-          <w:ilvl w:val="0"/>
-          <w:numId w:val="21"/>
-        </w:numPr>
-      </w:pPr>
-      <w:r>
-        <w:t>Readiness findings</w:t>
-      </w:r>
-    </w:p>
-    <w:p>
-      <w:pPr>
-        <w:pStyle w:val="Compact"/>
-        <w:numPr>
-          <w:ilvl w:val="0"/>
-          <w:numId w:val="21"/>
-        </w:numPr>
-      </w:pPr>
-      <w:r>
-        <w:t>Remediation priorities</w:t>
-      </w:r>
-    </w:p>
-    <w:p>
-      <w:pPr>
-        <w:pStyle w:val="Compact"/>
-        <w:numPr>
-          <w:ilvl w:val="0"/>
-          <w:numId w:val="21"/>
-        </w:numPr>
-      </w:pPr>
-      <w:r>
-        <w:lastRenderedPageBreak/>
-        <w:t>Consulting opportunities</w:t>
-      </w:r>
-    </w:p>
-    <w:p>
-      <w:pPr>
-        <w:pStyle w:val="Compact"/>
-        <w:numPr>
-          <w:ilvl w:val="0"/>
-          <w:numId w:val="21"/>
-        </w:numPr>
-      </w:pPr>
-      <w:r>
-        <w:t>Managed compliance services</w:t>
-      </w:r>
-    </w:p>
-    <w:p/>
-    <w:p>
-      <w:pPr>
-        <w:pStyle w:val="Heading1"/>
-        <w:rPr>
-          <w:color w:val="auto"/>
-        </w:rPr>
-      </w:pPr>
-      <w:bookmarkStart w:id="52" w:name="_Toc229651032"/>
-      <w:bookmarkStart w:id="53" w:name="current-capabilities"/>
-      <w:bookmarkEnd w:id="43"/>
-      <w:bookmarkEnd w:id="51"/>
-      <w:r>
-        <w:rPr>
-          <w:color w:val="auto"/>
-        </w:rPr>
-        <w:t>9. Current Capabilities</w:t>
-      </w:r>
-      <w:bookmarkEnd w:id="52"/>
-    </w:p>
-    <w:p>
-      <w:pPr>
-        <w:pStyle w:val="FirstParagraph"/>
-      </w:pPr>
-      <w:r>
-        <w:t>Partners and external collaborators can count on the following being available and working today:</w:t>
-      </w:r>
-    </w:p>
-    <w:p>
-      <w:pPr>
-        <w:pStyle w:val="Compact"/>
-        <w:numPr>
-          <w:ilvl w:val="0"/>
-          <w:numId w:val="22"/>
-        </w:numPr>
-      </w:pPr>
-      <w:r>
-        <w:t>Live public landing pages with campaign and partner-branded variants</w:t>
-      </w:r>
-    </w:p>
-    <w:p>
-      <w:pPr>
-        <w:pStyle w:val="Compact"/>
-        <w:numPr>
-          <w:ilvl w:val="0"/>
-          <w:numId w:val="22"/>
-        </w:numPr>
-      </w:pPr>
-      <w:r>
-        <w:t>Guided CMMC and SOC 2 Self-Assessments that prospects can complete independently</w:t>
-      </w:r>
-    </w:p>
-    <w:p>
-      <w:pPr>
-        <w:pStyle w:val="Compact"/>
-        <w:numPr>
-          <w:ilvl w:val="0"/>
-          <w:numId w:val="22"/>
-        </w:numPr>
-      </w:pPr>
-      <w:r>
-        <w:t>Automated self-assessment reports delivered to prospects upon completion</w:t>
-      </w:r>
-    </w:p>
-    <w:p>
-      <w:pPr>
-        <w:pStyle w:val="Compact"/>
-        <w:numPr>
-          <w:ilvl w:val="0"/>
-          <w:numId w:val="22"/>
-        </w:numPr>
-      </w:pPr>
-      <w:r>
-        <w:t>Automated assessment-triggered emails keeping prospects informed at each stage</w:t>
-      </w:r>
-    </w:p>
-    <w:p>
-      <w:pPr>
-        <w:pStyle w:val="Compact"/>
-        <w:numPr>
-          <w:ilvl w:val="0"/>
-          <w:numId w:val="22"/>
-        </w:numPr>
-      </w:pPr>
-      <w:r>
-        <w:t>Partner visibility into prospect engagement and assessment completion</w:t>
-      </w:r>
-    </w:p>
-    <w:p>
-      <w:pPr>
-        <w:pStyle w:val="Compact"/>
-        <w:numPr>
-          <w:ilvl w:val="0"/>
-          <w:numId w:val="22"/>
-        </w:numPr>
-      </w:pPr>
-      <w:r>
-        <w:t>A self-service experience prospects can complete in under 30 minutes</w:t>
-      </w:r>
-    </w:p>
-    <w:p>
-      <w:pPr>
-        <w:pStyle w:val="FirstParagraph"/>
-      </w:pPr>
-      <w:r>
-        <w:t>Self-assessment reports available today:</w:t>
-      </w:r>
-    </w:p>
-    <w:p>
-      <w:pPr>
-        <w:pStyle w:val="Compact"/>
-        <w:numPr>
-          <w:ilvl w:val="0"/>
-          <w:numId w:val="23"/>
-        </w:numPr>
-      </w:pPr>
-      <w:r>
-        <w:t>CMMC Level 1 Self-Assessment report</w:t>
-      </w:r>
-    </w:p>
-    <w:p>
-      <w:pPr>
-        <w:pStyle w:val="Compact"/>
-        <w:numPr>
-          <w:ilvl w:val="0"/>
-          <w:numId w:val="23"/>
-        </w:numPr>
-      </w:pPr>
-      <w:r>
-        <w:t>SOC 2 Readiness Self-Assessment report</w:t>
-      </w:r>
-    </w:p>
-    <w:p>
-      <w:pPr>
-        <w:pStyle w:val="FirstParagraph"/>
-      </w:pPr>
-      <w:r>
-        <w:t>Coming soon:</w:t>
-      </w:r>
-    </w:p>
-    <w:p>
-      <w:pPr>
-        <w:pStyle w:val="Compact"/>
-        <w:numPr>
-          <w:ilvl w:val="0"/>
-          <w:numId w:val="24"/>
-        </w:numPr>
-      </w:pPr>
-      <w:r>
-        <w:t>CMMC Level 2 Self-Assessment report</w:t>
-      </w:r>
-    </w:p>
-    <w:p/>
-    <w:p>
-      <w:pPr>
-        <w:pStyle w:val="Heading1"/>
-        <w:rPr>
-          <w:color w:val="auto"/>
-        </w:rPr>
-      </w:pPr>
-      <w:bookmarkStart w:id="54" w:name="_Toc229651033"/>
-      <w:bookmarkStart w:id="55" w:name="business-value"/>
-      <w:bookmarkEnd w:id="53"/>
-      <w:r>
-        <w:rPr>
-          <w:color w:val="auto"/>
-        </w:rPr>
-        <w:t>10. Business Value</w:t>
-      </w:r>
-      <w:bookmarkEnd w:id="54"/>
-    </w:p>
-    <w:p>
-      <w:pPr>
-        <w:pStyle w:val="FirstParagraph"/>
-      </w:pPr>
-      <w:r>
-        <w:t>These tools help transform compliance engagement from:</w:t>
-      </w:r>
-    </w:p>
-    <w:p>
-      <w:pPr>
-        <w:pStyle w:val="BodyText"/>
-      </w:pPr>
-      <w:r>
-        <w:t>Traditional Manual Discovery → Guided Automated Readiness Engagement</w:t>
-      </w:r>
-    </w:p>
-    <w:p>
-      <w:pPr>
-        <w:pStyle w:val="BodyText"/>
-      </w:pPr>
-      <w:r>
-        <w:t>This creates value for:</w:t>
-      </w:r>
-    </w:p>
-    <w:p>
-      <w:pPr>
-        <w:pStyle w:val="Compact"/>
-        <w:numPr>
-          <w:ilvl w:val="0"/>
-          <w:numId w:val="25"/>
-        </w:numPr>
-      </w:pPr>
-      <w:r>
-        <w:t>Customers seeking quick readiness visibility</w:t>
-      </w:r>
-    </w:p>
-    <w:p>
-      <w:pPr>
-        <w:pStyle w:val="Compact"/>
-        <w:numPr>
-          <w:ilvl w:val="0"/>
-          <w:numId w:val="25"/>
-        </w:numPr>
-      </w:pPr>
-      <w:r>
-        <w:t>Channel partners needing scalable outreach</w:t>
-      </w:r>
-    </w:p>
-    <w:p>
-      <w:pPr>
-        <w:pStyle w:val="Compact"/>
-        <w:numPr>
-          <w:ilvl w:val="0"/>
-          <w:numId w:val="25"/>
-        </w:numPr>
-      </w:pPr>
-      <w:r>
-        <w:t>GTM teams looking for engagement acceleration</w:t>
-      </w:r>
-    </w:p>
-    <w:p>
-      <w:pPr>
-        <w:pStyle w:val="Compact"/>
-        <w:numPr>
-          <w:ilvl w:val="0"/>
-          <w:numId w:val="25"/>
-        </w:numPr>
-      </w:pPr>
-      <w:r>
-        <w:t>Consulting organizations seeking qualified compliance leads</w:t>
-      </w:r>
-    </w:p>
-    <w:p/>
-    <w:p>
-      <w:pPr>
-        <w:pStyle w:val="Heading1"/>
-        <w:rPr>
-          <w:color w:val="auto"/>
-        </w:rPr>
-      </w:pPr>
-      <w:bookmarkStart w:id="56" w:name="_Toc229651034"/>
-      <w:bookmarkStart w:id="57" w:name="final-summary"/>
-      <w:bookmarkEnd w:id="55"/>
-      <w:r>
-        <w:rPr>
-          <w:color w:val="auto"/>
-        </w:rPr>
-        <w:lastRenderedPageBreak/>
-        <w:t>Final Summary</w:t>
-      </w:r>
-      <w:bookmarkEnd w:id="56"/>
-    </w:p>
-    <w:p>
-      <w:pPr>
-        <w:pStyle w:val="FirstParagraph"/>
-      </w:pPr>
-      <w:proofErr w:type="spellStart"/>
-      <w:r>
-        <w:t>Opsfolio’s</w:t>
-      </w:r>
-      <w:proofErr w:type="spellEnd"/>
-      <w:r>
-        <w:t xml:space="preserve"> Readiness Assessment and Self-Assessment tools provide a structured, customer-friendly compliance engagement experience that combines:</w:t>
-      </w:r>
-    </w:p>
-    <w:p>
-      <w:pPr>
-        <w:pStyle w:val="Compact"/>
-        <w:numPr>
-          <w:ilvl w:val="0"/>
-          <w:numId w:val="26"/>
-        </w:numPr>
-      </w:pPr>
-      <w:r>
-        <w:t>Readiness assessments</w:t>
-      </w:r>
-    </w:p>
-    <w:p>
-      <w:pPr>
-        <w:pStyle w:val="Compact"/>
-        <w:numPr>
-          <w:ilvl w:val="0"/>
-          <w:numId w:val="26"/>
-        </w:numPr>
-      </w:pPr>
-      <w:r>
-        <w:t>Automated reporting</w:t>
-      </w:r>
-    </w:p>
-    <w:p>
-      <w:pPr>
-        <w:pStyle w:val="Compact"/>
-        <w:numPr>
-          <w:ilvl w:val="0"/>
-          <w:numId w:val="26"/>
-        </w:numPr>
-      </w:pPr>
-      <w:r>
-        <w:t>Partner-led engagement</w:t>
-      </w:r>
-    </w:p>
-    <w:p>
-      <w:pPr>
-        <w:pStyle w:val="Compact"/>
-        <w:numPr>
-          <w:ilvl w:val="0"/>
-          <w:numId w:val="26"/>
-        </w:numPr>
-      </w:pPr>
-      <w:r>
-        <w:t>Customer education</w:t>
-      </w:r>
-    </w:p>
-    <w:p>
-      <w:pPr>
-        <w:pStyle w:val="Compact"/>
-        <w:numPr>
-          <w:ilvl w:val="0"/>
-          <w:numId w:val="26"/>
-        </w:numPr>
-      </w:pPr>
-      <w:r>
-        <w:t>Compliance awareness</w:t>
-      </w:r>
-    </w:p>
-    <w:p>
-      <w:pPr>
-        <w:pStyle w:val="Compact"/>
-        <w:numPr>
-          <w:ilvl w:val="0"/>
-          <w:numId w:val="26"/>
-        </w:numPr>
-      </w:pPr>
-      <w:r>
-        <w:t>Funnel acceleration</w:t>
-      </w:r>
-    </w:p>
-    <w:p>
-      <w:pPr>
-        <w:pStyle w:val="FirstParagraph"/>
-      </w:pPr>
-      <w:r>
         <w:t>The workflows help prospects quickly understand where they stand while giving partners and GTM teams a scalable way to initiate meaningful compliance-readiness conversations.</w:t>
       </w:r>
-      <w:bookmarkEnd w:id="57"/>
+      <w:bookmarkEnd w:id="58"/>
     </w:p>
     <w:sectPr>
       <w:footnotePr>

</xml_diff>

<commit_message>
chore: add hipaa as lead magnet with screnshots and content
</commit_message>
<xml_diff>
--- a/opsfolio-branding/marketing-assets/partner enablement/opsfolio_lead_magnets_tour_public_partner_enablement.docx
+++ b/opsfolio-branding/marketing-assets/partner enablement/opsfolio_lead_magnets_tour_public_partner_enablement.docx
@@ -216,7 +216,7 @@
                         <w:rPr>
                           <w:lang w:val="en-IN"/>
                         </w:rPr>
-                        <w:t>4</w:t>
+                        <w:t>8</w:t>
                       </w:r>
                       <w:r>
                         <w:rPr>
@@ -2451,15 +2451,15 @@
           <w:color w:val="auto"/>
         </w:rPr>
       </w:pPr>
-      <w:bookmarkStart w:id="2" w:name="overview"/>
-      <w:bookmarkStart w:id="3" w:name="_Toc229663306"/>
+      <w:bookmarkStart w:id="2" w:name="_Toc229663306"/>
+      <w:bookmarkStart w:id="3" w:name="overview"/>
       <w:r>
         <w:rPr>
           <w:color w:val="auto"/>
         </w:rPr>
         <w:t>Overview</w:t>
       </w:r>
-      <w:bookmarkEnd w:id="3"/>
+      <w:bookmarkEnd w:id="2"/>
     </w:p>
     <w:p>
       <w:pPr>
@@ -2705,10 +2705,10 @@
           <w:color w:val="auto"/>
         </w:rPr>
       </w:pPr>
-      <w:bookmarkStart w:id="4" w:name="customer-journey-overview"/>
-      <w:bookmarkStart w:id="5" w:name="_Toc229663307"/>
+      <w:bookmarkStart w:id="4" w:name="_Toc229663307"/>
+      <w:bookmarkStart w:id="5" w:name="customer-journey-overview"/>
       <w:bookmarkEnd w:id="0"/>
-      <w:bookmarkEnd w:id="2"/>
+      <w:bookmarkEnd w:id="3"/>
       <w:r>
         <w:rPr>
           <w:color w:val="auto"/>
@@ -2716,7 +2716,7 @@
         <w:lastRenderedPageBreak/>
         <w:t>1. Customer Journey Overview</w:t>
       </w:r>
-      <w:bookmarkEnd w:id="5"/>
+      <w:bookmarkEnd w:id="4"/>
     </w:p>
     <w:p>
       <w:pPr>
@@ -2725,15 +2725,15 @@
           <w:color w:val="auto"/>
         </w:rPr>
       </w:pPr>
-      <w:bookmarkStart w:id="6" w:name="typical-lead-journey"/>
-      <w:bookmarkStart w:id="7" w:name="_Toc229663308"/>
+      <w:bookmarkStart w:id="6" w:name="_Toc229663308"/>
+      <w:bookmarkStart w:id="7" w:name="typical-lead-journey"/>
       <w:r>
         <w:rPr>
           <w:color w:val="auto"/>
         </w:rPr>
         <w:t>Typical Lead Journey</w:t>
       </w:r>
-      <w:bookmarkEnd w:id="7"/>
+      <w:bookmarkEnd w:id="6"/>
     </w:p>
     <w:p>
       <w:pPr>
@@ -2855,17 +2855,17 @@
           <w:color w:val="auto"/>
         </w:rPr>
       </w:pPr>
-      <w:bookmarkStart w:id="8" w:name="landing-pages-campaign-experience"/>
-      <w:bookmarkStart w:id="9" w:name="_Toc229663309"/>
-      <w:bookmarkEnd w:id="4"/>
-      <w:bookmarkEnd w:id="6"/>
+      <w:bookmarkStart w:id="8" w:name="_Toc229663309"/>
+      <w:bookmarkStart w:id="9" w:name="landing-pages-campaign-experience"/>
+      <w:bookmarkEnd w:id="5"/>
+      <w:bookmarkEnd w:id="7"/>
       <w:r>
         <w:rPr>
           <w:color w:val="auto"/>
         </w:rPr>
         <w:t>2. Landing Pages &amp; Campaign Experience</w:t>
       </w:r>
-      <w:bookmarkEnd w:id="9"/>
+      <w:bookmarkEnd w:id="8"/>
     </w:p>
     <w:p>
       <w:pPr>
@@ -2874,15 +2874,15 @@
           <w:color w:val="auto"/>
         </w:rPr>
       </w:pPr>
-      <w:bookmarkStart w:id="10" w:name="example-public-landing-pages"/>
-      <w:bookmarkStart w:id="11" w:name="_Toc229663310"/>
+      <w:bookmarkStart w:id="10" w:name="_Toc229663310"/>
+      <w:bookmarkStart w:id="11" w:name="example-public-landing-pages"/>
       <w:r>
         <w:rPr>
           <w:color w:val="auto"/>
         </w:rPr>
         <w:t>Example Public Landing Pages</w:t>
       </w:r>
-      <w:bookmarkEnd w:id="11"/>
+      <w:bookmarkEnd w:id="10"/>
     </w:p>
     <w:p>
       <w:pPr>
@@ -3037,9 +3037,9 @@
           <w:color w:val="auto"/>
         </w:rPr>
       </w:pPr>
-      <w:bookmarkStart w:id="14" w:name="landing-page-goals"/>
-      <w:bookmarkStart w:id="15" w:name="_Toc229663311"/>
-      <w:bookmarkEnd w:id="10"/>
+      <w:bookmarkStart w:id="14" w:name="_Toc229663311"/>
+      <w:bookmarkStart w:id="15" w:name="landing-page-goals"/>
+      <w:bookmarkEnd w:id="11"/>
       <w:bookmarkEnd w:id="13"/>
       <w:r>
         <w:rPr>
@@ -3057,7 +3057,7 @@
         </w:rPr>
         <w:t>Landing Page Goals</w:t>
       </w:r>
-      <w:bookmarkEnd w:id="15"/>
+      <w:bookmarkEnd w:id="14"/>
     </w:p>
     <w:p>
       <w:pPr>
@@ -3256,17 +3256,17 @@
           <w:color w:val="auto"/>
         </w:rPr>
       </w:pPr>
-      <w:bookmarkStart w:id="16" w:name="sign-up-user-inputs"/>
-      <w:bookmarkStart w:id="17" w:name="_Toc229663312"/>
-      <w:bookmarkEnd w:id="8"/>
-      <w:bookmarkEnd w:id="14"/>
+      <w:bookmarkStart w:id="16" w:name="_Toc229663312"/>
+      <w:bookmarkStart w:id="17" w:name="sign-up-user-inputs"/>
+      <w:bookmarkEnd w:id="9"/>
+      <w:bookmarkEnd w:id="15"/>
       <w:r>
         <w:rPr>
           <w:color w:val="auto"/>
         </w:rPr>
         <w:t>3. Sign-Up &amp; User Inputs</w:t>
       </w:r>
-      <w:bookmarkEnd w:id="17"/>
+      <w:bookmarkEnd w:id="16"/>
     </w:p>
     <w:p>
       <w:pPr>
@@ -3327,8 +3327,8 @@
           <w:color w:val="auto"/>
         </w:rPr>
       </w:pPr>
-      <w:bookmarkStart w:id="18" w:name="initial-sign-up-information"/>
-      <w:bookmarkStart w:id="19" w:name="_Toc229663313"/>
+      <w:bookmarkStart w:id="18" w:name="_Toc229663313"/>
+      <w:bookmarkStart w:id="19" w:name="initial-sign-up-information"/>
       <w:r>
         <w:rPr>
           <w:noProof/>
@@ -3343,7 +3343,7 @@
         </w:rPr>
         <w:t>Initial Sign-Up Information</w:t>
       </w:r>
-      <w:bookmarkEnd w:id="19"/>
+      <w:bookmarkEnd w:id="18"/>
     </w:p>
     <w:p>
       <w:pPr>
@@ -3444,10 +3444,10 @@
           <w:color w:val="auto"/>
         </w:rPr>
       </w:pPr>
-      <w:bookmarkStart w:id="20" w:name="assessment-experience"/>
-      <w:bookmarkStart w:id="21" w:name="_Toc229663314"/>
-      <w:bookmarkEnd w:id="16"/>
-      <w:bookmarkEnd w:id="18"/>
+      <w:bookmarkStart w:id="20" w:name="_Toc229663314"/>
+      <w:bookmarkStart w:id="21" w:name="assessment-experience"/>
+      <w:bookmarkEnd w:id="17"/>
+      <w:bookmarkEnd w:id="19"/>
       <w:r>
         <w:rPr>
           <w:color w:val="auto"/>
@@ -3455,7 +3455,7 @@
         <w:lastRenderedPageBreak/>
         <w:t>4. Assessment Experience</w:t>
       </w:r>
-      <w:bookmarkEnd w:id="21"/>
+      <w:bookmarkEnd w:id="20"/>
     </w:p>
     <w:p>
       <w:pPr>
@@ -3464,15 +3464,15 @@
           <w:color w:val="auto"/>
         </w:rPr>
       </w:pPr>
-      <w:bookmarkStart w:id="22" w:name="cmmc-assessments"/>
-      <w:bookmarkStart w:id="23" w:name="_Toc229663315"/>
+      <w:bookmarkStart w:id="22" w:name="_Toc229663315"/>
+      <w:bookmarkStart w:id="23" w:name="cmmc-assessments"/>
       <w:r>
         <w:rPr>
           <w:color w:val="auto"/>
         </w:rPr>
         <w:t>CMMC Assessments</w:t>
       </w:r>
-      <w:bookmarkEnd w:id="23"/>
+      <w:bookmarkEnd w:id="22"/>
     </w:p>
     <w:p>
       <w:pPr>
@@ -3495,7 +3495,7 @@
           <w:noProof/>
         </w:rPr>
         <w:drawing>
-          <wp:anchor distT="0" distB="0" distL="114300" distR="114300" simplePos="0" relativeHeight="251655168" behindDoc="0" locked="0" layoutInCell="1" allowOverlap="1" wp14:anchorId="6E34D4D9" wp14:editId="751EE464">
+          <wp:anchor distT="0" distB="0" distL="114300" distR="114300" simplePos="0" relativeHeight="251652608" behindDoc="0" locked="0" layoutInCell="1" allowOverlap="1" wp14:anchorId="6E34D4D9" wp14:editId="01E6C86E">
             <wp:simplePos x="0" y="0"/>
             <wp:positionH relativeFrom="column">
               <wp:posOffset>4475480</wp:posOffset>
@@ -3635,6 +3635,11 @@
     </w:p>
     <w:p>
       <w:pPr>
+        <w:pStyle w:val="Compact"/>
+      </w:pPr>
+    </w:p>
+    <w:p>
+      <w:pPr>
         <w:pStyle w:val="FirstParagraph"/>
       </w:pPr>
       <w:r>
@@ -3687,6 +3692,11 @@
     </w:p>
     <w:p>
       <w:pPr>
+        <w:pStyle w:val="Compact"/>
+      </w:pPr>
+    </w:p>
+    <w:p>
+      <w:pPr>
         <w:pStyle w:val="FirstParagraph"/>
       </w:pPr>
       <w:r>
@@ -3731,19 +3741,14 @@
     </w:p>
     <w:p>
       <w:pPr>
-        <w:pStyle w:val="Compact"/>
-      </w:pPr>
-    </w:p>
-    <w:p>
-      <w:pPr>
         <w:pStyle w:val="Heading2"/>
         <w:rPr>
           <w:color w:val="auto"/>
         </w:rPr>
       </w:pPr>
-      <w:bookmarkStart w:id="24" w:name="soc-2-readiness-assessments"/>
-      <w:bookmarkStart w:id="25" w:name="_Toc229663316"/>
-      <w:bookmarkEnd w:id="22"/>
+      <w:bookmarkStart w:id="24" w:name="_Toc229663316"/>
+      <w:bookmarkStart w:id="25" w:name="soc-2-readiness-assessments"/>
+      <w:bookmarkEnd w:id="23"/>
       <w:r>
         <w:rPr>
           <w:color w:val="auto"/>
@@ -3751,7 +3756,7 @@
         <w:lastRenderedPageBreak/>
         <w:t>SOC 2 Readiness Assessments</w:t>
       </w:r>
-      <w:bookmarkEnd w:id="25"/>
+      <w:bookmarkEnd w:id="24"/>
     </w:p>
     <w:p>
       <w:pPr>
@@ -3762,7 +3767,7 @@
           <w:noProof/>
         </w:rPr>
         <w:drawing>
-          <wp:anchor distT="0" distB="0" distL="114300" distR="114300" simplePos="0" relativeHeight="251657216" behindDoc="0" locked="0" layoutInCell="1" allowOverlap="1" wp14:anchorId="76E7A80C" wp14:editId="098BA944">
+          <wp:anchor distT="0" distB="0" distL="114300" distR="114300" simplePos="0" relativeHeight="251658752" behindDoc="0" locked="0" layoutInCell="1" allowOverlap="1" wp14:anchorId="76E7A80C" wp14:editId="098BA944">
             <wp:simplePos x="0" y="0"/>
             <wp:positionH relativeFrom="column">
               <wp:posOffset>4390390</wp:posOffset>
@@ -3909,12 +3914,17 @@
       </w:r>
     </w:p>
     <w:p>
+      <w:pPr>
+        <w:pStyle w:val="Compact"/>
+      </w:pPr>
+    </w:p>
+    <w:p>
       <w:r>
         <w:rPr>
           <w:noProof/>
         </w:rPr>
         <w:drawing>
-          <wp:inline distT="0" distB="0" distL="0" distR="0" wp14:anchorId="2DD2A561" wp14:editId="03AA18EE">
+          <wp:inline distT="0" distB="0" distL="0" distR="0" wp14:anchorId="2DD2A561" wp14:editId="768B0D7C">
             <wp:extent cx="5943600" cy="3557270"/>
             <wp:effectExtent l="19050" t="19050" r="0" b="5080"/>
             <wp:docPr id="1683598458" name="Picture 1"/>
@@ -3957,7 +3967,247 @@
         </w:drawing>
       </w:r>
     </w:p>
-    <w:p/>
+    <w:p>
+      <w:pPr>
+        <w:pStyle w:val="Compact"/>
+      </w:pPr>
+    </w:p>
+    <w:p>
+      <w:pPr>
+        <w:pStyle w:val="Heading2"/>
+        <w:rPr>
+          <w:color w:val="auto"/>
+        </w:rPr>
+      </w:pPr>
+      <w:bookmarkStart w:id="26" w:name="hipaa-self-assessment"/>
+      <w:r>
+        <w:rPr>
+          <w:color w:val="auto"/>
+        </w:rPr>
+        <w:t>HIPAA Self-Assessment</w:t>
+      </w:r>
+      <w:bookmarkEnd w:id="26"/>
+    </w:p>
+    <w:p>
+      <w:pPr>
+        <w:pStyle w:val="FirstParagraph"/>
+      </w:pPr>
+      <w:r>
+        <w:t>The HIPAA Self-Assessment guides users through a structured, four-step review of their organization's current safeguard implementation. The experience is guided and self-service, covering:</w:t>
+      </w:r>
+      <w:r>
+        <w:t xml:space="preserve"> </w:t>
+      </w:r>
+    </w:p>
+    <w:p>
+      <w:pPr>
+        <w:pStyle w:val="Compact"/>
+        <w:numPr>
+          <w:ilvl w:val="0"/>
+          <w:numId w:val="10"/>
+        </w:numPr>
+      </w:pPr>
+      <w:r>
+        <w:t>Company and contact information</w:t>
+      </w:r>
+    </w:p>
+    <w:p>
+      <w:pPr>
+        <w:pStyle w:val="Compact"/>
+        <w:numPr>
+          <w:ilvl w:val="0"/>
+          <w:numId w:val="10"/>
+        </w:numPr>
+      </w:pPr>
+      <w:r>
+        <w:rPr>
+          <w:noProof/>
+        </w:rPr>
+        <w:lastRenderedPageBreak/>
+        <w:drawing>
+          <wp:anchor distT="0" distB="0" distL="114300" distR="114300" simplePos="0" relativeHeight="251665920" behindDoc="0" locked="0" layoutInCell="1" allowOverlap="1" wp14:anchorId="3544F0D6" wp14:editId="533AF4AF">
+            <wp:simplePos x="0" y="0"/>
+            <wp:positionH relativeFrom="column">
+              <wp:posOffset>4391025</wp:posOffset>
+            </wp:positionH>
+            <wp:positionV relativeFrom="paragraph">
+              <wp:posOffset>31750</wp:posOffset>
+            </wp:positionV>
+            <wp:extent cx="1554480" cy="1554480"/>
+            <wp:effectExtent l="0" t="0" r="0" b="0"/>
+            <wp:wrapSquare wrapText="bothSides"/>
+            <wp:docPr id="1707708054" name="Picture 1" descr="HIPAA • BrightInsight"/>
+            <wp:cNvGraphicFramePr>
+              <a:graphicFrameLocks xmlns:a="http://schemas.openxmlformats.org/drawingml/2006/main" noChangeAspect="1"/>
+            </wp:cNvGraphicFramePr>
+            <a:graphic xmlns:a="http://schemas.openxmlformats.org/drawingml/2006/main">
+              <a:graphicData uri="http://schemas.openxmlformats.org/drawingml/2006/picture">
+                <pic:pic xmlns:pic="http://schemas.openxmlformats.org/drawingml/2006/picture">
+                  <pic:nvPicPr>
+                    <pic:cNvPr id="0" name="Picture 1" descr="HIPAA • BrightInsight"/>
+                    <pic:cNvPicPr>
+                      <a:picLocks noChangeAspect="1" noChangeArrowheads="1"/>
+                    </pic:cNvPicPr>
+                  </pic:nvPicPr>
+                  <pic:blipFill>
+                    <a:blip r:embed="rId23" cstate="print">
+                      <a:extLst>
+                        <a:ext uri="{28A0092B-C50C-407E-A947-70E740481C1C}">
+                          <a14:useLocalDpi xmlns:a14="http://schemas.microsoft.com/office/drawing/2010/main" val="0"/>
+                        </a:ext>
+                      </a:extLst>
+                    </a:blip>
+                    <a:srcRect/>
+                    <a:stretch>
+                      <a:fillRect/>
+                    </a:stretch>
+                  </pic:blipFill>
+                  <pic:spPr bwMode="auto">
+                    <a:xfrm>
+                      <a:off x="0" y="0"/>
+                      <a:ext cx="1554480" cy="1554480"/>
+                    </a:xfrm>
+                    <a:prstGeom prst="rect">
+                      <a:avLst/>
+                    </a:prstGeom>
+                    <a:noFill/>
+                    <a:ln>
+                      <a:noFill/>
+                    </a:ln>
+                  </pic:spPr>
+                </pic:pic>
+              </a:graphicData>
+            </a:graphic>
+            <wp14:sizeRelH relativeFrom="margin">
+              <wp14:pctWidth>0</wp14:pctWidth>
+            </wp14:sizeRelH>
+            <wp14:sizeRelV relativeFrom="margin">
+              <wp14:pctHeight>0</wp14:pctHeight>
+            </wp14:sizeRelV>
+          </wp:anchor>
+        </w:drawing>
+      </w:r>
+      <w:r>
+        <w:t>Administrative Safeguards: security management, workforce access, training, incident response, and contingency planning (164.308)</w:t>
+      </w:r>
+    </w:p>
+    <w:p>
+      <w:pPr>
+        <w:pStyle w:val="Compact"/>
+        <w:numPr>
+          <w:ilvl w:val="0"/>
+          <w:numId w:val="10"/>
+        </w:numPr>
+      </w:pPr>
+      <w:r>
+        <w:t>Physical Safeguards: facility access, workstation controls, and device and media handling (164.310)</w:t>
+      </w:r>
+    </w:p>
+    <w:p>
+      <w:pPr>
+        <w:pStyle w:val="Compact"/>
+        <w:numPr>
+          <w:ilvl w:val="0"/>
+          <w:numId w:val="10"/>
+        </w:numPr>
+      </w:pPr>
+      <w:r>
+        <w:t>Technical Safeguards: access controls, audit controls, data integrity, authentication, and transmission security (164.312)</w:t>
+      </w:r>
+    </w:p>
+    <w:p>
+      <w:pPr>
+        <w:pStyle w:val="FirstParagraph"/>
+      </w:pPr>
+      <w:r>
+        <w:t>At the end of the assessment, users can view their report immediately via the View Report button, which is available throughout the workflow once the session is saved.</w:t>
+      </w:r>
+    </w:p>
+    <w:p>
+      <w:pPr>
+        <w:pStyle w:val="Compact"/>
+      </w:pPr>
+    </w:p>
+    <w:p>
+      <w:pPr>
+        <w:spacing w:after="0"/>
+      </w:pPr>
+      <w:r>
+        <w:drawing>
+          <wp:inline distT="0" distB="0" distL="0" distR="0" wp14:anchorId="64D9BF77" wp14:editId="3829335B">
+            <wp:extent cx="5943600" cy="3457575"/>
+            <wp:effectExtent l="19050" t="19050" r="0" b="9525"/>
+            <wp:docPr id="1133961557" name="Picture 1"/>
+            <wp:cNvGraphicFramePr>
+              <a:graphicFrameLocks xmlns:a="http://schemas.openxmlformats.org/drawingml/2006/main" noChangeAspect="1"/>
+            </wp:cNvGraphicFramePr>
+            <a:graphic xmlns:a="http://schemas.openxmlformats.org/drawingml/2006/main">
+              <a:graphicData uri="http://schemas.openxmlformats.org/drawingml/2006/picture">
+                <pic:pic xmlns:pic="http://schemas.openxmlformats.org/drawingml/2006/picture">
+                  <pic:nvPicPr>
+                    <pic:cNvPr id="1133961557" name=""/>
+                    <pic:cNvPicPr/>
+                  </pic:nvPicPr>
+                  <pic:blipFill rotWithShape="1">
+                    <a:blip r:embed="rId24"/>
+                    <a:srcRect b="-442"/>
+                    <a:stretch>
+                      <a:fillRect/>
+                    </a:stretch>
+                  </pic:blipFill>
+                  <pic:spPr bwMode="auto">
+                    <a:xfrm>
+                      <a:off x="0" y="0"/>
+                      <a:ext cx="5943600" cy="3457575"/>
+                    </a:xfrm>
+                    <a:prstGeom prst="rect">
+                      <a:avLst/>
+                    </a:prstGeom>
+                    <a:ln w="9525" cap="flat" cmpd="sng" algn="ctr">
+                      <a:solidFill>
+                        <a:sysClr val="window" lastClr="FFFFFF">
+                          <a:lumMod val="85000"/>
+                        </a:sysClr>
+                      </a:solidFill>
+                      <a:prstDash val="solid"/>
+                      <a:round/>
+                      <a:headEnd type="none" w="med" len="med"/>
+                      <a:tailEnd type="none" w="med" len="med"/>
+                      <a:extLst>
+                        <a:ext uri="{C807C97D-BFC1-408E-A445-0C87EB9F89A2}">
+                          <ask:lineSketchStyleProps xmlns:ask="http://schemas.microsoft.com/office/drawing/2018/sketchyshapes" sd="0">
+                            <a:custGeom>
+                              <a:avLst/>
+                              <a:gdLst/>
+                              <a:ahLst/>
+                              <a:cxnLst/>
+                              <a:rect l="0" t="0" r="0" b="0"/>
+                              <a:pathLst/>
+                            </a:custGeom>
+                            <ask:type/>
+                          </ask:lineSketchStyleProps>
+                        </a:ext>
+                      </a:extLst>
+                    </a:ln>
+                    <a:extLst>
+                      <a:ext uri="{53640926-AAD7-44D8-BBD7-CCE9431645EC}">
+                        <a14:shadowObscured xmlns:a14="http://schemas.microsoft.com/office/drawing/2010/main"/>
+                      </a:ext>
+                    </a:extLst>
+                  </pic:spPr>
+                </pic:pic>
+              </a:graphicData>
+            </a:graphic>
+          </wp:inline>
+        </w:drawing>
+      </w:r>
+    </w:p>
+    <w:p>
+      <w:bookmarkStart w:id="27" w:name="_Toc229663317"/>
+      <w:bookmarkStart w:id="28" w:name="automated-emails-customer-touchpoints"/>
+      <w:bookmarkEnd w:id="21"/>
+      <w:bookmarkEnd w:id="25"/>
+    </w:p>
     <w:p>
       <w:pPr>
         <w:pStyle w:val="Heading1"/>
@@ -3965,10 +4215,6 @@
           <w:color w:val="auto"/>
         </w:rPr>
       </w:pPr>
-      <w:bookmarkStart w:id="26" w:name="automated-emails-customer-touchpoints"/>
-      <w:bookmarkStart w:id="27" w:name="_Toc229663317"/>
-      <w:bookmarkEnd w:id="20"/>
-      <w:bookmarkEnd w:id="24"/>
       <w:r>
         <w:rPr>
           <w:color w:val="auto"/>
@@ -3984,8 +4230,8 @@
           <w:color w:val="auto"/>
         </w:rPr>
       </w:pPr>
-      <w:bookmarkStart w:id="28" w:name="automated-customer-experience"/>
       <w:bookmarkStart w:id="29" w:name="_Toc229663318"/>
+      <w:bookmarkStart w:id="30" w:name="automated-customer-experience"/>
       <w:r>
         <w:rPr>
           <w:color w:val="auto"/>
@@ -4019,8 +4265,32 @@
         </w:numPr>
       </w:pPr>
       <w:r>
+        <w:t>Assessment initiation notifications</w:t>
+      </w:r>
+    </w:p>
+    <w:p>
+      <w:pPr>
+        <w:pStyle w:val="Compact"/>
+        <w:numPr>
+          <w:ilvl w:val="0"/>
+          <w:numId w:val="11"/>
+        </w:numPr>
+      </w:pPr>
+      <w:r>
+        <w:t>Workflow-based email responses</w:t>
+      </w:r>
+    </w:p>
+    <w:p>
+      <w:pPr>
+        <w:pStyle w:val="Compact"/>
+        <w:numPr>
+          <w:ilvl w:val="0"/>
+          <w:numId w:val="11"/>
+        </w:numPr>
+      </w:pPr>
+      <w:r>
         <w:lastRenderedPageBreak/>
-        <w:t>Assessment initiation notifications</w:t>
+        <w:t>Level determination follow-up emails</w:t>
       </w:r>
     </w:p>
     <w:p>
@@ -4032,30 +4302,6 @@
         </w:numPr>
       </w:pPr>
       <w:r>
-        <w:t>Workflow-based email responses</w:t>
-      </w:r>
-    </w:p>
-    <w:p>
-      <w:pPr>
-        <w:pStyle w:val="Compact"/>
-        <w:numPr>
-          <w:ilvl w:val="0"/>
-          <w:numId w:val="11"/>
-        </w:numPr>
-      </w:pPr>
-      <w:r>
-        <w:t>Level determination follow-up emails</w:t>
-      </w:r>
-    </w:p>
-    <w:p>
-      <w:pPr>
-        <w:pStyle w:val="Compact"/>
-        <w:numPr>
-          <w:ilvl w:val="0"/>
-          <w:numId w:val="11"/>
-        </w:numPr>
-      </w:pPr>
-      <w:r>
         <w:t>Report delivery emails</w:t>
       </w:r>
     </w:p>
@@ -4066,6 +4312,11 @@
       <w:r>
         <w:t>These touchpoints help maintain engagement during the assessment journey.</w:t>
       </w:r>
+    </w:p>
+    <w:p>
+      <w:pPr>
+        <w:pStyle w:val="Compact"/>
+      </w:pPr>
     </w:p>
     <w:p>
       <w:pPr>
@@ -4091,7 +4342,7 @@
                     <pic:cNvPicPr/>
                   </pic:nvPicPr>
                   <pic:blipFill>
-                    <a:blip r:embed="rId23"/>
+                    <a:blip r:embed="rId25"/>
                     <a:stretch>
                       <a:fillRect/>
                     </a:stretch>
@@ -4131,7 +4382,7 @@
                     <pic:cNvPicPr/>
                   </pic:nvPicPr>
                   <pic:blipFill>
-                    <a:blip r:embed="rId24"/>
+                    <a:blip r:embed="rId26"/>
                     <a:stretch>
                       <a:fillRect/>
                     </a:stretch>
@@ -4159,10 +4410,10 @@
           <w:color w:val="auto"/>
         </w:rPr>
       </w:pPr>
-      <w:bookmarkStart w:id="30" w:name="reports-outputs-generated"/>
       <w:bookmarkStart w:id="31" w:name="_Toc229663319"/>
-      <w:bookmarkEnd w:id="26"/>
+      <w:bookmarkStart w:id="32" w:name="reports-outputs-generated"/>
       <w:bookmarkEnd w:id="28"/>
+      <w:bookmarkEnd w:id="30"/>
       <w:r>
         <w:rPr>
           <w:color w:val="auto"/>
@@ -4179,8 +4430,8 @@
           <w:color w:val="auto"/>
         </w:rPr>
       </w:pPr>
-      <w:bookmarkStart w:id="32" w:name="cmmc-level-1-reports"/>
       <w:bookmarkStart w:id="33" w:name="_Toc229663320"/>
+      <w:bookmarkStart w:id="34" w:name="cmmc-level-1-reports"/>
       <w:r>
         <w:rPr>
           <w:color w:val="auto"/>
@@ -4250,7 +4501,7 @@
                     <pic:cNvPicPr/>
                   </pic:nvPicPr>
                   <pic:blipFill rotWithShape="1">
-                    <a:blip r:embed="rId25"/>
+                    <a:blip r:embed="rId27"/>
                     <a:srcRect t="1616" b="15634"/>
                     <a:stretch>
                       <a:fillRect/>
@@ -4379,8 +4630,8 @@
           <w:color w:val="auto"/>
         </w:rPr>
       </w:pPr>
-      <w:bookmarkStart w:id="34" w:name="cmmc-level-2-reports"/>
-      <w:bookmarkStart w:id="35" w:name="_Toc229663321"/>
+      <w:bookmarkStart w:id="35" w:name="cmmc-level-2-reports"/>
+      <w:bookmarkStart w:id="36" w:name="_Toc229663321"/>
       <w:r>
         <w:rPr>
           <w:color w:val="auto"/>
@@ -4388,8 +4639,8 @@
         <w:lastRenderedPageBreak/>
         <w:t>CMMC Level 2 Reports</w:t>
       </w:r>
-      <w:bookmarkEnd w:id="34"/>
       <w:bookmarkEnd w:id="35"/>
+      <w:bookmarkEnd w:id="36"/>
     </w:p>
     <w:p>
       <w:pPr>
@@ -4452,7 +4703,7 @@
                     <pic:cNvPicPr/>
                   </pic:nvPicPr>
                   <pic:blipFill rotWithShape="1">
-                    <a:blip r:embed="rId26"/>
+                    <a:blip r:embed="rId28"/>
                     <a:srcRect l="-961" t="2444" r="-963" b="29734"/>
                     <a:stretch>
                       <a:fillRect/>
@@ -4592,9 +4843,9 @@
           <w:color w:val="auto"/>
         </w:rPr>
       </w:pPr>
-      <w:bookmarkStart w:id="36" w:name="soc-2-readiness-reports"/>
       <w:bookmarkStart w:id="37" w:name="_Toc229663322"/>
-      <w:bookmarkEnd w:id="32"/>
+      <w:bookmarkStart w:id="38" w:name="soc-2-readiness-reports"/>
+      <w:bookmarkEnd w:id="34"/>
       <w:r>
         <w:rPr>
           <w:color w:val="auto"/>
@@ -4667,9 +4918,11 @@
       <w:r>
         <w:t>These self-assessment reports are intended to serve as starting points for deeper readiness discussions.</w:t>
       </w:r>
-      <w:r>
-        <w:br/>
-      </w:r>
+    </w:p>
+    <w:p>
+      <w:pPr>
+        <w:pStyle w:val="Compact"/>
+      </w:pPr>
     </w:p>
     <w:p>
       <w:pPr>
@@ -4695,7 +4948,7 @@
                     <pic:cNvPicPr/>
                   </pic:nvPicPr>
                   <pic:blipFill>
-                    <a:blip r:embed="rId27"/>
+                    <a:blip r:embed="rId29"/>
                     <a:stretch>
                       <a:fillRect/>
                     </a:stretch>
@@ -4724,16 +4977,216 @@
       </w:r>
     </w:p>
     <w:p>
+      <w:bookmarkStart w:id="39" w:name="hipaa-self-assessment-reports"/>
+    </w:p>
+    <w:p>
+      <w:pPr>
+        <w:pStyle w:val="Heading2"/>
+        <w:rPr>
+          <w:color w:val="auto"/>
+        </w:rPr>
+      </w:pPr>
+      <w:r>
+        <w:rPr>
+          <w:color w:val="auto"/>
+        </w:rPr>
+        <w:lastRenderedPageBreak/>
+        <w:t>HIPAA Self-Assessment Reports</w:t>
+      </w:r>
+      <w:bookmarkEnd w:id="39"/>
+    </w:p>
+    <w:p>
+      <w:pPr>
+        <w:pStyle w:val="FirstParagraph"/>
+      </w:pPr>
+      <w:r>
+        <w:t>Upon successful completion of the HIPAA Self-Assessment:</w:t>
+      </w:r>
+    </w:p>
+    <w:p>
+      <w:pPr>
+        <w:pStyle w:val="Compact"/>
+        <w:numPr>
+          <w:ilvl w:val="0"/>
+          <w:numId w:val="14"/>
+        </w:numPr>
+      </w:pPr>
+      <w:r>
+        <w:t>A self-assessment report is automatically generated</w:t>
+      </w:r>
+    </w:p>
+    <w:p>
+      <w:pPr>
+        <w:pStyle w:val="Compact"/>
+        <w:numPr>
+          <w:ilvl w:val="0"/>
+          <w:numId w:val="14"/>
+        </w:numPr>
+      </w:pPr>
+      <w:r>
+        <w:t>A report link is delivered to the user</w:t>
+      </w:r>
+    </w:p>
+    <w:p>
+      <w:pPr>
+        <w:pStyle w:val="Compact"/>
+      </w:pPr>
+    </w:p>
+    <w:p>
+      <w:pPr>
+        <w:spacing w:after="0"/>
+      </w:pPr>
+      <w:r>
+        <w:drawing>
+          <wp:inline distT="0" distB="0" distL="0" distR="0" wp14:anchorId="3B68E95F" wp14:editId="3A53735E">
+            <wp:extent cx="5943600" cy="4095750"/>
+            <wp:effectExtent l="19050" t="19050" r="0" b="0"/>
+            <wp:docPr id="834547155" name="Picture 1"/>
+            <wp:cNvGraphicFramePr>
+              <a:graphicFrameLocks xmlns:a="http://schemas.openxmlformats.org/drawingml/2006/main" noChangeAspect="1"/>
+            </wp:cNvGraphicFramePr>
+            <a:graphic xmlns:a="http://schemas.openxmlformats.org/drawingml/2006/main">
+              <a:graphicData uri="http://schemas.openxmlformats.org/drawingml/2006/picture">
+                <pic:pic xmlns:pic="http://schemas.openxmlformats.org/drawingml/2006/picture">
+                  <pic:nvPicPr>
+                    <pic:cNvPr id="834547155" name=""/>
+                    <pic:cNvPicPr/>
+                  </pic:nvPicPr>
+                  <pic:blipFill rotWithShape="1">
+                    <a:blip r:embed="rId30"/>
+                    <a:srcRect t="-2" b="20341"/>
+                    <a:stretch>
+                      <a:fillRect/>
+                    </a:stretch>
+                  </pic:blipFill>
+                  <pic:spPr bwMode="auto">
+                    <a:xfrm>
+                      <a:off x="0" y="0"/>
+                      <a:ext cx="5943600" cy="4095750"/>
+                    </a:xfrm>
+                    <a:prstGeom prst="rect">
+                      <a:avLst/>
+                    </a:prstGeom>
+                    <a:ln w="9525" cap="flat" cmpd="sng" algn="ctr">
+                      <a:solidFill>
+                        <a:sysClr val="window" lastClr="FFFFFF">
+                          <a:lumMod val="85000"/>
+                        </a:sysClr>
+                      </a:solidFill>
+                      <a:prstDash val="solid"/>
+                      <a:round/>
+                      <a:headEnd type="none" w="med" len="med"/>
+                      <a:tailEnd type="none" w="med" len="med"/>
+                      <a:extLst>
+                        <a:ext uri="{C807C97D-BFC1-408E-A445-0C87EB9F89A2}">
+                          <ask:lineSketchStyleProps xmlns:ask="http://schemas.microsoft.com/office/drawing/2018/sketchyshapes" sd="0">
+                            <a:custGeom>
+                              <a:avLst/>
+                              <a:gdLst/>
+                              <a:ahLst/>
+                              <a:cxnLst/>
+                              <a:rect l="0" t="0" r="0" b="0"/>
+                              <a:pathLst/>
+                            </a:custGeom>
+                            <ask:type/>
+                          </ask:lineSketchStyleProps>
+                        </a:ext>
+                      </a:extLst>
+                    </a:ln>
+                    <a:extLst>
+                      <a:ext uri="{53640926-AAD7-44D8-BBD7-CCE9431645EC}">
+                        <a14:shadowObscured xmlns:a14="http://schemas.microsoft.com/office/drawing/2010/main"/>
+                      </a:ext>
+                    </a:extLst>
+                  </pic:spPr>
+                </pic:pic>
+              </a:graphicData>
+            </a:graphic>
+          </wp:inline>
+        </w:drawing>
+      </w:r>
+    </w:p>
+    <w:p>
+      <w:pPr>
+        <w:pStyle w:val="FirstParagraph"/>
+      </w:pPr>
+    </w:p>
+    <w:p>
+      <w:pPr>
+        <w:pStyle w:val="FirstParagraph"/>
+      </w:pPr>
+      <w:r>
+        <w:t>The report helps organizations understand:</w:t>
+      </w:r>
+    </w:p>
+    <w:p>
+      <w:pPr>
+        <w:pStyle w:val="Compact"/>
+        <w:numPr>
+          <w:ilvl w:val="0"/>
+          <w:numId w:val="15"/>
+        </w:numPr>
+      </w:pPr>
+      <w:r>
+        <w:t>Overall safeguards readiness score across all HIPAA Security Rule controls</w:t>
+      </w:r>
+    </w:p>
+    <w:p>
+      <w:pPr>
+        <w:pStyle w:val="Compact"/>
+        <w:numPr>
+          <w:ilvl w:val="0"/>
+          <w:numId w:val="15"/>
+        </w:numPr>
+      </w:pPr>
+      <w:r>
+        <w:t>Section-level scores for Administrative, Physical, and Technical Safeguards</w:t>
+      </w:r>
+    </w:p>
+    <w:p>
+      <w:pPr>
+        <w:pStyle w:val="Compact"/>
+        <w:numPr>
+          <w:ilvl w:val="0"/>
+          <w:numId w:val="15"/>
+        </w:numPr>
+      </w:pPr>
+      <w:r>
+        <w:t>A breakdown of controls reviewed with Yes, No, and Not Applicable counts</w:t>
+      </w:r>
+    </w:p>
+    <w:p>
+      <w:pPr>
+        <w:pStyle w:val="Compact"/>
+        <w:numPr>
+          <w:ilvl w:val="0"/>
+          <w:numId w:val="15"/>
+        </w:numPr>
+      </w:pPr>
+      <w:r>
+        <w:t>Specific priority gaps tied to individual 164.308, 164.310, and 164.312 regulation references</w:t>
+      </w:r>
+    </w:p>
+    <w:p>
+      <w:pPr>
+        <w:pStyle w:val="Compact"/>
+        <w:numPr>
+          <w:ilvl w:val="0"/>
+          <w:numId w:val="15"/>
+        </w:numPr>
+      </w:pPr>
+      <w:r>
+        <w:t>The user's own responses and explanations captured against each gap item</w:t>
+      </w:r>
+    </w:p>
+    <w:p>
       <w:pPr>
         <w:pStyle w:val="BodyText"/>
       </w:pPr>
-    </w:p>
-    <w:p>
-      <w:pPr>
-        <w:pStyle w:val="BodyText"/>
-      </w:pPr>
-    </w:p>
-    <w:p/>
+      <w:r>
+        <w:t>The HIPAA Self-Assessment report gives healthcare organizations and their business associates a structured, regulation-referenced view of their current safeguard posture and a prioritized starting point for remediation.</w:t>
+      </w:r>
+    </w:p>
     <w:p>
       <w:pPr>
         <w:pStyle w:val="Heading1"/>
@@ -4741,10 +5194,10 @@
           <w:color w:val="auto"/>
         </w:rPr>
       </w:pPr>
-      <w:bookmarkStart w:id="38" w:name="how-channel-partners-can-use-the-system"/>
-      <w:bookmarkStart w:id="39" w:name="_Toc229663323"/>
-      <w:bookmarkEnd w:id="30"/>
-      <w:bookmarkEnd w:id="36"/>
+      <w:bookmarkStart w:id="40" w:name="_Toc229663323"/>
+      <w:bookmarkStart w:id="41" w:name="how-channel-partners-can-use-the-system"/>
+      <w:bookmarkEnd w:id="32"/>
+      <w:bookmarkEnd w:id="38"/>
       <w:r>
         <w:rPr>
           <w:color w:val="auto"/>
@@ -4752,7 +5205,7 @@
         <w:lastRenderedPageBreak/>
         <w:t>7. How Channel Partners Can Use the System</w:t>
       </w:r>
-      <w:bookmarkEnd w:id="39"/>
+      <w:bookmarkEnd w:id="40"/>
     </w:p>
     <w:p>
       <w:pPr>
@@ -4761,113 +5214,288 @@
           <w:color w:val="auto"/>
         </w:rPr>
       </w:pPr>
-      <w:bookmarkStart w:id="40" w:name="partner-driven-campaigns"/>
-      <w:bookmarkStart w:id="41" w:name="_Toc229663324"/>
+      <w:bookmarkStart w:id="42" w:name="_Toc229663324"/>
+      <w:bookmarkStart w:id="43" w:name="partner-driven-campaigns"/>
       <w:r>
         <w:rPr>
           <w:color w:val="auto"/>
         </w:rPr>
         <w:t>Partner-Driven Campaigns</w:t>
       </w:r>
+      <w:bookmarkEnd w:id="42"/>
+    </w:p>
+    <w:p>
+      <w:pPr>
+        <w:pStyle w:val="FirstParagraph"/>
+      </w:pPr>
+      <w:r>
+        <w:t>These Readiness Assessment and Self-Assessment tools are designed to support partner-led engagement models.</w:t>
+      </w:r>
+    </w:p>
+    <w:p>
+      <w:pPr>
+        <w:pStyle w:val="BodyText"/>
+      </w:pPr>
+      <w:r>
+        <w:t>Channel partners can:</w:t>
+      </w:r>
+    </w:p>
+    <w:p>
+      <w:pPr>
+        <w:pStyle w:val="Compact"/>
+        <w:numPr>
+          <w:ilvl w:val="0"/>
+          <w:numId w:val="15"/>
+        </w:numPr>
+      </w:pPr>
+      <w:r>
+        <w:t>Share branded campaign links</w:t>
+      </w:r>
+    </w:p>
+    <w:p>
+      <w:pPr>
+        <w:pStyle w:val="Compact"/>
+        <w:numPr>
+          <w:ilvl w:val="0"/>
+          <w:numId w:val="15"/>
+        </w:numPr>
+      </w:pPr>
+      <w:r>
+        <w:t>Run outreach campaigns</w:t>
+      </w:r>
+    </w:p>
+    <w:p>
+      <w:pPr>
+        <w:pStyle w:val="Compact"/>
+        <w:numPr>
+          <w:ilvl w:val="0"/>
+          <w:numId w:val="15"/>
+        </w:numPr>
+      </w:pPr>
+      <w:r>
+        <w:t>Use custom landing pages</w:t>
+      </w:r>
+    </w:p>
+    <w:p>
+      <w:pPr>
+        <w:pStyle w:val="Compact"/>
+        <w:numPr>
+          <w:ilvl w:val="0"/>
+          <w:numId w:val="15"/>
+        </w:numPr>
+      </w:pPr>
+      <w:r>
+        <w:t>Receive customer engagement visibility</w:t>
+      </w:r>
+    </w:p>
+    <w:p>
+      <w:pPr>
+        <w:pStyle w:val="Compact"/>
+        <w:numPr>
+          <w:ilvl w:val="0"/>
+          <w:numId w:val="15"/>
+        </w:numPr>
+      </w:pPr>
+      <w:r>
+        <w:t>Use generated reports for follow-up conversations</w:t>
+      </w:r>
+    </w:p>
+    <w:p>
+      <w:pPr>
+        <w:pStyle w:val="Compact"/>
+        <w:numPr>
+          <w:ilvl w:val="0"/>
+          <w:numId w:val="15"/>
+        </w:numPr>
+      </w:pPr>
+      <w:r>
+        <w:t>Position remediation and consulting services</w:t>
+      </w:r>
+    </w:p>
+    <w:p>
+      <w:pPr>
+        <w:pStyle w:val="FirstParagraph"/>
+      </w:pPr>
+      <w:r>
+        <w:t xml:space="preserve">The </w:t>
+      </w:r>
+      <w:hyperlink r:id="rId31" w:history="1">
+        <w:proofErr w:type="spellStart"/>
+        <w:r>
+          <w:rPr>
+            <w:rStyle w:val="Hyperlink"/>
+          </w:rPr>
+          <w:t>Malyszek</w:t>
+        </w:r>
+        <w:proofErr w:type="spellEnd"/>
+      </w:hyperlink>
+      <w:r>
+        <w:t xml:space="preserve"> implementation is an example of this partner-driven model.</w:t>
+      </w:r>
+    </w:p>
+    <w:p/>
+    <w:p>
+      <w:pPr>
+        <w:pStyle w:val="Heading2"/>
+        <w:rPr>
+          <w:color w:val="auto"/>
+        </w:rPr>
+      </w:pPr>
+      <w:bookmarkStart w:id="44" w:name="_Toc229663325"/>
+      <w:bookmarkStart w:id="45" w:name="why-this-matters-for-partners"/>
+      <w:bookmarkEnd w:id="43"/>
+      <w:r>
+        <w:rPr>
+          <w:color w:val="auto"/>
+        </w:rPr>
+        <w:t>Why This Matters for Partners</w:t>
+      </w:r>
+      <w:bookmarkEnd w:id="44"/>
+    </w:p>
+    <w:p>
+      <w:pPr>
+        <w:pStyle w:val="FirstParagraph"/>
+      </w:pPr>
+      <w:r>
+        <w:t>The workflows help partners:</w:t>
+      </w:r>
+    </w:p>
+    <w:p>
+      <w:pPr>
+        <w:pStyle w:val="Compact"/>
+        <w:numPr>
+          <w:ilvl w:val="0"/>
+          <w:numId w:val="16"/>
+        </w:numPr>
+      </w:pPr>
+      <w:r>
+        <w:t>Start conversations faster</w:t>
+      </w:r>
+    </w:p>
+    <w:p>
+      <w:pPr>
+        <w:pStyle w:val="Compact"/>
+        <w:numPr>
+          <w:ilvl w:val="0"/>
+          <w:numId w:val="16"/>
+        </w:numPr>
+      </w:pPr>
+      <w:r>
+        <w:t>Reduce manual discovery effort</w:t>
+      </w:r>
+    </w:p>
+    <w:p>
+      <w:pPr>
+        <w:pStyle w:val="Compact"/>
+        <w:numPr>
+          <w:ilvl w:val="0"/>
+          <w:numId w:val="16"/>
+        </w:numPr>
+      </w:pPr>
+      <w:r>
+        <w:t>Generate compliance discussions earlier</w:t>
+      </w:r>
+    </w:p>
+    <w:p>
+      <w:pPr>
+        <w:pStyle w:val="Compact"/>
+        <w:numPr>
+          <w:ilvl w:val="0"/>
+          <w:numId w:val="16"/>
+        </w:numPr>
+      </w:pPr>
+      <w:r>
+        <w:t>Create consulting opportunities</w:t>
+      </w:r>
+    </w:p>
+    <w:p>
+      <w:pPr>
+        <w:pStyle w:val="Compact"/>
+        <w:numPr>
+          <w:ilvl w:val="0"/>
+          <w:numId w:val="16"/>
+        </w:numPr>
+      </w:pPr>
+      <w:r>
+        <w:t>Scale outreach without large technical teams</w:t>
+      </w:r>
+    </w:p>
+    <w:p>
+      <w:pPr>
+        <w:pStyle w:val="FirstParagraph"/>
+      </w:pPr>
+      <w:r>
+        <w:t>Instead of beginning with generic cybersecurity conversations, partners can immediately discuss:</w:t>
+      </w:r>
+    </w:p>
+    <w:p>
+      <w:pPr>
+        <w:pStyle w:val="Compact"/>
+        <w:numPr>
+          <w:ilvl w:val="0"/>
+          <w:numId w:val="17"/>
+        </w:numPr>
+      </w:pPr>
+      <w:r>
+        <w:t>Readiness findings</w:t>
+      </w:r>
+    </w:p>
+    <w:p>
+      <w:pPr>
+        <w:pStyle w:val="Compact"/>
+        <w:numPr>
+          <w:ilvl w:val="0"/>
+          <w:numId w:val="17"/>
+        </w:numPr>
+      </w:pPr>
+      <w:r>
+        <w:t>Gap areas</w:t>
+      </w:r>
+    </w:p>
+    <w:p>
+      <w:pPr>
+        <w:pStyle w:val="Compact"/>
+        <w:numPr>
+          <w:ilvl w:val="0"/>
+          <w:numId w:val="17"/>
+        </w:numPr>
+      </w:pPr>
+      <w:r>
+        <w:t>Business risks</w:t>
+      </w:r>
+    </w:p>
+    <w:p>
+      <w:pPr>
+        <w:pStyle w:val="Compact"/>
+        <w:numPr>
+          <w:ilvl w:val="0"/>
+          <w:numId w:val="17"/>
+        </w:numPr>
+      </w:pPr>
+      <w:r>
+        <w:t>Improvement opportunities</w:t>
+      </w:r>
+    </w:p>
+    <w:p/>
+    <w:p>
+      <w:pPr>
+        <w:pStyle w:val="Heading1"/>
+        <w:rPr>
+          <w:color w:val="auto"/>
+        </w:rPr>
+      </w:pPr>
+      <w:bookmarkStart w:id="46" w:name="_Toc229663326"/>
+      <w:bookmarkStart w:id="47" w:name="example-funnel-progression"/>
       <w:bookmarkEnd w:id="41"/>
-    </w:p>
-    <w:p>
-      <w:pPr>
-        <w:pStyle w:val="FirstParagraph"/>
-      </w:pPr>
-      <w:r>
-        <w:t>These Readiness Assessment and Self-Assessment tools are designed to support partner-led engagement models.</w:t>
-      </w:r>
-    </w:p>
-    <w:p>
-      <w:pPr>
-        <w:pStyle w:val="BodyText"/>
-      </w:pPr>
-      <w:r>
-        <w:t>Channel partners can:</w:t>
-      </w:r>
-    </w:p>
-    <w:p>
-      <w:pPr>
-        <w:pStyle w:val="Compact"/>
-        <w:numPr>
-          <w:ilvl w:val="0"/>
-          <w:numId w:val="15"/>
-        </w:numPr>
-      </w:pPr>
-      <w:r>
-        <w:t>Share branded campaign links</w:t>
-      </w:r>
-    </w:p>
-    <w:p>
-      <w:pPr>
-        <w:pStyle w:val="Compact"/>
-        <w:numPr>
-          <w:ilvl w:val="0"/>
-          <w:numId w:val="15"/>
-        </w:numPr>
-      </w:pPr>
-      <w:r>
-        <w:t>Run outreach campaigns</w:t>
-      </w:r>
-    </w:p>
-    <w:p>
-      <w:pPr>
-        <w:pStyle w:val="Compact"/>
-        <w:numPr>
-          <w:ilvl w:val="0"/>
-          <w:numId w:val="15"/>
-        </w:numPr>
-      </w:pPr>
-      <w:r>
-        <w:t>Use custom landing pages</w:t>
-      </w:r>
-    </w:p>
-    <w:p>
-      <w:pPr>
-        <w:pStyle w:val="Compact"/>
-        <w:numPr>
-          <w:ilvl w:val="0"/>
-          <w:numId w:val="15"/>
-        </w:numPr>
-      </w:pPr>
-      <w:r>
-        <w:t>Receive customer engagement visibility</w:t>
-      </w:r>
-    </w:p>
-    <w:p>
-      <w:pPr>
-        <w:pStyle w:val="Compact"/>
-        <w:numPr>
-          <w:ilvl w:val="0"/>
-          <w:numId w:val="15"/>
-        </w:numPr>
-      </w:pPr>
-      <w:r>
-        <w:t>Use generated reports for follow-up conversations</w:t>
-      </w:r>
-    </w:p>
-    <w:p>
-      <w:pPr>
-        <w:pStyle w:val="Compact"/>
-        <w:numPr>
-          <w:ilvl w:val="0"/>
-          <w:numId w:val="15"/>
-        </w:numPr>
-      </w:pPr>
-      <w:r>
-        <w:t>Position remediation and consulting services</w:t>
-      </w:r>
-    </w:p>
-    <w:p>
-      <w:pPr>
-        <w:pStyle w:val="FirstParagraph"/>
-      </w:pPr>
-      <w:r>
-        <w:t>The Malyszek implementation is an example of this partner-driven model.</w:t>
-      </w:r>
-    </w:p>
-    <w:p/>
+      <w:bookmarkEnd w:id="45"/>
+      <w:r>
+        <w:rPr>
+          <w:color w:val="auto"/>
+        </w:rPr>
+        <w:t>8. Example Funnel Progression</w:t>
+      </w:r>
+      <w:bookmarkEnd w:id="46"/>
+    </w:p>
     <w:p>
       <w:pPr>
         <w:pStyle w:val="Heading2"/>
@@ -4875,177 +5503,15 @@
           <w:color w:val="auto"/>
         </w:rPr>
       </w:pPr>
-      <w:bookmarkStart w:id="42" w:name="why-this-matters-for-partners"/>
-      <w:bookmarkStart w:id="43" w:name="_Toc229663325"/>
-      <w:bookmarkEnd w:id="40"/>
+      <w:bookmarkStart w:id="48" w:name="_Toc229663327"/>
+      <w:bookmarkStart w:id="49" w:name="awareness-stage"/>
       <w:r>
         <w:rPr>
           <w:color w:val="auto"/>
         </w:rPr>
-        <w:t>Why This Matters for Partners</w:t>
-      </w:r>
-      <w:bookmarkEnd w:id="43"/>
-    </w:p>
-    <w:p>
-      <w:pPr>
-        <w:pStyle w:val="FirstParagraph"/>
-      </w:pPr>
-      <w:r>
-        <w:t>The workflows help partners:</w:t>
-      </w:r>
-    </w:p>
-    <w:p>
-      <w:pPr>
-        <w:pStyle w:val="Compact"/>
-        <w:numPr>
-          <w:ilvl w:val="0"/>
-          <w:numId w:val="16"/>
-        </w:numPr>
-      </w:pPr>
-      <w:r>
-        <w:t>Start conversations faster</w:t>
-      </w:r>
-    </w:p>
-    <w:p>
-      <w:pPr>
-        <w:pStyle w:val="Compact"/>
-        <w:numPr>
-          <w:ilvl w:val="0"/>
-          <w:numId w:val="16"/>
-        </w:numPr>
-      </w:pPr>
-      <w:r>
-        <w:t>Reduce manual discovery effort</w:t>
-      </w:r>
-    </w:p>
-    <w:p>
-      <w:pPr>
-        <w:pStyle w:val="Compact"/>
-        <w:numPr>
-          <w:ilvl w:val="0"/>
-          <w:numId w:val="16"/>
-        </w:numPr>
-      </w:pPr>
-      <w:r>
-        <w:t>Generate compliance discussions earlier</w:t>
-      </w:r>
-    </w:p>
-    <w:p>
-      <w:pPr>
-        <w:pStyle w:val="Compact"/>
-        <w:numPr>
-          <w:ilvl w:val="0"/>
-          <w:numId w:val="16"/>
-        </w:numPr>
-      </w:pPr>
-      <w:r>
-        <w:t>Create consulting opportunities</w:t>
-      </w:r>
-    </w:p>
-    <w:p>
-      <w:pPr>
-        <w:pStyle w:val="Compact"/>
-        <w:numPr>
-          <w:ilvl w:val="0"/>
-          <w:numId w:val="16"/>
-        </w:numPr>
-      </w:pPr>
-      <w:r>
-        <w:t>Scale outreach without large technical teams</w:t>
-      </w:r>
-    </w:p>
-    <w:p>
-      <w:pPr>
-        <w:pStyle w:val="FirstParagraph"/>
-      </w:pPr>
-      <w:r>
-        <w:t>Instead of beginning with generic cybersecurity conversations, partners can immediately discuss:</w:t>
-      </w:r>
-    </w:p>
-    <w:p>
-      <w:pPr>
-        <w:pStyle w:val="Compact"/>
-        <w:numPr>
-          <w:ilvl w:val="0"/>
-          <w:numId w:val="17"/>
-        </w:numPr>
-      </w:pPr>
-      <w:r>
-        <w:t>Readiness findings</w:t>
-      </w:r>
-    </w:p>
-    <w:p>
-      <w:pPr>
-        <w:pStyle w:val="Compact"/>
-        <w:numPr>
-          <w:ilvl w:val="0"/>
-          <w:numId w:val="17"/>
-        </w:numPr>
-      </w:pPr>
-      <w:r>
-        <w:t>Gap areas</w:t>
-      </w:r>
-    </w:p>
-    <w:p>
-      <w:pPr>
-        <w:pStyle w:val="Compact"/>
-        <w:numPr>
-          <w:ilvl w:val="0"/>
-          <w:numId w:val="17"/>
-        </w:numPr>
-      </w:pPr>
-      <w:r>
-        <w:t>Business risks</w:t>
-      </w:r>
-    </w:p>
-    <w:p>
-      <w:pPr>
-        <w:pStyle w:val="Compact"/>
-        <w:numPr>
-          <w:ilvl w:val="0"/>
-          <w:numId w:val="17"/>
-        </w:numPr>
-      </w:pPr>
-      <w:r>
-        <w:t>Improvement opportunities</w:t>
-      </w:r>
-    </w:p>
-    <w:p/>
-    <w:p>
-      <w:pPr>
-        <w:pStyle w:val="Heading1"/>
-        <w:rPr>
-          <w:color w:val="auto"/>
-        </w:rPr>
-      </w:pPr>
-      <w:bookmarkStart w:id="44" w:name="example-funnel-progression"/>
-      <w:bookmarkStart w:id="45" w:name="_Toc229663326"/>
-      <w:bookmarkEnd w:id="38"/>
-      <w:bookmarkEnd w:id="42"/>
-      <w:r>
-        <w:rPr>
-          <w:color w:val="auto"/>
-        </w:rPr>
-        <w:t>8. Example Funnel Progression</w:t>
-      </w:r>
-      <w:bookmarkEnd w:id="45"/>
-    </w:p>
-    <w:p>
-      <w:pPr>
-        <w:pStyle w:val="Heading2"/>
-        <w:rPr>
-          <w:color w:val="auto"/>
-        </w:rPr>
-      </w:pPr>
-      <w:bookmarkStart w:id="46" w:name="awareness-stage"/>
-      <w:bookmarkStart w:id="47" w:name="_Toc229663327"/>
-      <w:r>
-        <w:rPr>
-          <w:color w:val="auto"/>
-        </w:rPr>
         <w:t>Awareness Stage</w:t>
       </w:r>
-      <w:bookmarkEnd w:id="47"/>
+      <w:bookmarkEnd w:id="48"/>
     </w:p>
     <w:p>
       <w:pPr>
@@ -5100,16 +5566,16 @@
           <w:color w:val="auto"/>
         </w:rPr>
       </w:pPr>
-      <w:bookmarkStart w:id="48" w:name="engagement-stage"/>
-      <w:bookmarkStart w:id="49" w:name="_Toc229663328"/>
-      <w:bookmarkEnd w:id="46"/>
+      <w:bookmarkStart w:id="50" w:name="_Toc229663328"/>
+      <w:bookmarkStart w:id="51" w:name="engagement-stage"/>
+      <w:bookmarkEnd w:id="49"/>
       <w:r>
         <w:rPr>
           <w:color w:val="auto"/>
         </w:rPr>
         <w:t>Engagement Stage</w:t>
       </w:r>
-      <w:bookmarkEnd w:id="49"/>
+      <w:bookmarkEnd w:id="50"/>
     </w:p>
     <w:p>
       <w:pPr>
@@ -5163,16 +5629,16 @@
           <w:color w:val="auto"/>
         </w:rPr>
       </w:pPr>
-      <w:bookmarkStart w:id="50" w:name="evaluation-stage"/>
-      <w:bookmarkStart w:id="51" w:name="_Toc229663329"/>
-      <w:bookmarkEnd w:id="48"/>
+      <w:bookmarkStart w:id="52" w:name="_Toc229663329"/>
+      <w:bookmarkStart w:id="53" w:name="evaluation-stage"/>
+      <w:bookmarkEnd w:id="51"/>
       <w:r>
         <w:rPr>
           <w:color w:val="auto"/>
         </w:rPr>
         <w:t>Evaluation Stage</w:t>
       </w:r>
-      <w:bookmarkEnd w:id="51"/>
+      <w:bookmarkEnd w:id="52"/>
     </w:p>
     <w:p>
       <w:pPr>
@@ -5226,16 +5692,16 @@
           <w:color w:val="auto"/>
         </w:rPr>
       </w:pPr>
-      <w:bookmarkStart w:id="52" w:name="follow-up-stage"/>
-      <w:bookmarkStart w:id="53" w:name="_Toc229663330"/>
-      <w:bookmarkEnd w:id="50"/>
+      <w:bookmarkStart w:id="54" w:name="_Toc229663330"/>
+      <w:bookmarkStart w:id="55" w:name="follow-up-stage"/>
+      <w:bookmarkEnd w:id="53"/>
       <w:r>
         <w:rPr>
           <w:color w:val="auto"/>
         </w:rPr>
         <w:t>Follow-Up Stage</w:t>
       </w:r>
-      <w:bookmarkEnd w:id="53"/>
+      <w:bookmarkEnd w:id="54"/>
     </w:p>
     <w:p>
       <w:pPr>
@@ -5301,17 +5767,17 @@
           <w:color w:val="auto"/>
         </w:rPr>
       </w:pPr>
-      <w:bookmarkStart w:id="54" w:name="current-capabilities"/>
-      <w:bookmarkStart w:id="55" w:name="_Toc229663331"/>
-      <w:bookmarkEnd w:id="44"/>
-      <w:bookmarkEnd w:id="52"/>
+      <w:bookmarkStart w:id="56" w:name="_Toc229663331"/>
+      <w:bookmarkStart w:id="57" w:name="current-capabilities"/>
+      <w:bookmarkEnd w:id="47"/>
+      <w:bookmarkEnd w:id="55"/>
       <w:r>
         <w:rPr>
           <w:color w:val="auto"/>
         </w:rPr>
         <w:t>9. Current Capabilities</w:t>
       </w:r>
-      <w:bookmarkEnd w:id="55"/>
+      <w:bookmarkEnd w:id="56"/>
     </w:p>
     <w:p>
       <w:pPr>
@@ -5446,16 +5912,16 @@
           <w:color w:val="auto"/>
         </w:rPr>
       </w:pPr>
-      <w:bookmarkStart w:id="56" w:name="business-value"/>
-      <w:bookmarkStart w:id="57" w:name="_Toc229663332"/>
-      <w:bookmarkEnd w:id="54"/>
+      <w:bookmarkStart w:id="58" w:name="_Toc229663332"/>
+      <w:bookmarkStart w:id="59" w:name="business-value"/>
+      <w:bookmarkEnd w:id="57"/>
       <w:r>
         <w:rPr>
           <w:color w:val="auto"/>
         </w:rPr>
         <w:t>10. Business Value</w:t>
       </w:r>
-      <w:bookmarkEnd w:id="57"/>
+      <w:bookmarkEnd w:id="58"/>
     </w:p>
     <w:p>
       <w:pPr>
@@ -5537,16 +6003,16 @@
           <w:color w:val="auto"/>
         </w:rPr>
       </w:pPr>
-      <w:bookmarkStart w:id="58" w:name="final-summary"/>
-      <w:bookmarkStart w:id="59" w:name="_Toc229663333"/>
-      <w:bookmarkEnd w:id="56"/>
+      <w:bookmarkStart w:id="60" w:name="_Toc229663333"/>
+      <w:bookmarkStart w:id="61" w:name="final-summary"/>
+      <w:bookmarkEnd w:id="59"/>
       <w:r>
         <w:rPr>
           <w:color w:val="auto"/>
         </w:rPr>
         <w:t>Final Summary</w:t>
       </w:r>
-      <w:bookmarkEnd w:id="59"/>
+      <w:bookmarkEnd w:id="60"/>
     </w:p>
     <w:p>
       <w:pPr>
@@ -5640,7 +6106,7 @@
       <w:r>
         <w:t>The workflows help prospects quickly understand where they stand while giving partners and GTM teams a scalable way to initiate meaningful compliance-readiness conversations.</w:t>
       </w:r>
-      <w:bookmarkEnd w:id="58"/>
+      <w:bookmarkEnd w:id="61"/>
     </w:p>
     <w:sectPr>
       <w:footnotePr>

</xml_diff>

<commit_message>
chore: fine tuning the tour document
</commit_message>
<xml_diff>
--- a/opsfolio-branding/marketing-assets/partner enablement/opsfolio_lead_magnets_tour_public_partner_enablement.docx
+++ b/opsfolio-branding/marketing-assets/partner enablement/opsfolio_lead_magnets_tour_public_partner_enablement.docx
@@ -2465,13 +2465,8 @@
       <w:pPr>
         <w:pStyle w:val="FirstParagraph"/>
       </w:pPr>
-      <w:proofErr w:type="spellStart"/>
-      <w:r>
-        <w:t>Opsfolio’s</w:t>
-      </w:r>
-      <w:proofErr w:type="spellEnd"/>
-      <w:r>
-        <w:t xml:space="preserve"> </w:t>
+      <w:r>
+        <w:t xml:space="preserve">Opsfolio’s </w:t>
       </w:r>
       <w:hyperlink r:id="rId11" w:history="1">
         <w:r>
@@ -3495,7 +3490,7 @@
           <w:noProof/>
         </w:rPr>
         <w:drawing>
-          <wp:anchor distT="0" distB="0" distL="114300" distR="114300" simplePos="0" relativeHeight="251652608" behindDoc="0" locked="0" layoutInCell="1" allowOverlap="1" wp14:anchorId="6E34D4D9" wp14:editId="01E6C86E">
+          <wp:anchor distT="0" distB="0" distL="114300" distR="114300" simplePos="0" relativeHeight="251653632" behindDoc="0" locked="0" layoutInCell="1" allowOverlap="1" wp14:anchorId="6E34D4D9" wp14:editId="01E6C86E">
             <wp:simplePos x="0" y="0"/>
             <wp:positionH relativeFrom="column">
               <wp:posOffset>4475480</wp:posOffset>
@@ -3767,7 +3762,7 @@
           <w:noProof/>
         </w:rPr>
         <w:drawing>
-          <wp:anchor distT="0" distB="0" distL="114300" distR="114300" simplePos="0" relativeHeight="251658752" behindDoc="0" locked="0" layoutInCell="1" allowOverlap="1" wp14:anchorId="76E7A80C" wp14:editId="098BA944">
+          <wp:anchor distT="0" distB="0" distL="114300" distR="114300" simplePos="0" relativeHeight="251659776" behindDoc="0" locked="0" layoutInCell="1" allowOverlap="1" wp14:anchorId="76E7A80C" wp14:editId="098BA944">
             <wp:simplePos x="0" y="0"/>
             <wp:positionH relativeFrom="column">
               <wp:posOffset>4390390</wp:posOffset>
@@ -4025,7 +4020,7 @@
         </w:rPr>
         <w:lastRenderedPageBreak/>
         <w:drawing>
-          <wp:anchor distT="0" distB="0" distL="114300" distR="114300" simplePos="0" relativeHeight="251665920" behindDoc="0" locked="0" layoutInCell="1" allowOverlap="1" wp14:anchorId="3544F0D6" wp14:editId="533AF4AF">
+          <wp:anchor distT="0" distB="0" distL="114300" distR="114300" simplePos="0" relativeHeight="251666944" behindDoc="0" locked="0" layoutInCell="1" allowOverlap="1" wp14:anchorId="3544F0D6" wp14:editId="533AF4AF">
             <wp:simplePos x="0" y="0"/>
             <wp:positionH relativeFrom="column">
               <wp:posOffset>4391025</wp:posOffset>
@@ -4612,15 +4607,7 @@
         </w:numPr>
       </w:pPr>
       <w:r>
-        <w:t xml:space="preserve">Suggested improvement </w:t>
-      </w:r>
-      <w:proofErr w:type="gramStart"/>
-      <w:r>
-        <w:t>focus</w:t>
-      </w:r>
-      <w:proofErr w:type="gramEnd"/>
-      <w:r>
-        <w:t xml:space="preserve"> areas</w:t>
+        <w:t>Suggested improvement focus areas</w:t>
       </w:r>
     </w:p>
     <w:p>
@@ -4688,9 +4675,9 @@
           <w:noProof/>
         </w:rPr>
         <w:drawing>
-          <wp:inline distT="0" distB="0" distL="0" distR="0" wp14:anchorId="3F930DAE" wp14:editId="793185A2">
-            <wp:extent cx="5942965" cy="4686300"/>
-            <wp:effectExtent l="19050" t="19050" r="635" b="0"/>
+          <wp:inline distT="0" distB="0" distL="0" distR="0" wp14:anchorId="3F930DAE" wp14:editId="2896443E">
+            <wp:extent cx="5942965" cy="5038725"/>
+            <wp:effectExtent l="19050" t="19050" r="635" b="9525"/>
             <wp:docPr id="931357689" name="Picture 1"/>
             <wp:cNvGraphicFramePr>
               <a:graphicFrameLocks xmlns:a="http://schemas.openxmlformats.org/drawingml/2006/main" noChangeAspect="1"/>
@@ -4704,7 +4691,7 @@
                   </pic:nvPicPr>
                   <pic:blipFill rotWithShape="1">
                     <a:blip r:embed="rId28"/>
-                    <a:srcRect l="-961" t="2444" r="-963" b="29734"/>
+                    <a:srcRect l="-961" t="1066" r="-963" b="26014"/>
                     <a:stretch>
                       <a:fillRect/>
                     </a:stretch>
@@ -4712,7 +4699,7 @@
                   <pic:spPr bwMode="auto">
                     <a:xfrm>
                       <a:off x="0" y="0"/>
-                      <a:ext cx="5943600" cy="4686801"/>
+                      <a:ext cx="5943600" cy="5039264"/>
                     </a:xfrm>
                     <a:prstGeom prst="rect">
                       <a:avLst/>
@@ -4833,8 +4820,14 @@
         <w:pStyle w:val="Compact"/>
       </w:pPr>
       <w:r>
+        <w:lastRenderedPageBreak/>
         <w:t>The Level 2 self-assessment report gives organizations a structured, practice-level view of their current compliance posture and a concrete starting point for remediation planning.</w:t>
       </w:r>
+    </w:p>
+    <w:p>
+      <w:pPr>
+        <w:pStyle w:val="Compact"/>
+      </w:pPr>
     </w:p>
     <w:p>
       <w:pPr>
@@ -4850,7 +4843,6 @@
         <w:rPr>
           <w:color w:val="auto"/>
         </w:rPr>
-        <w:lastRenderedPageBreak/>
         <w:t>SOC 2 Readiness Reports</w:t>
       </w:r>
       <w:bookmarkEnd w:id="37"/>
@@ -4933,7 +4925,7 @@
           <w:noProof/>
         </w:rPr>
         <w:drawing>
-          <wp:inline distT="0" distB="0" distL="0" distR="0" wp14:anchorId="32012F92" wp14:editId="441FFA56">
+          <wp:inline distT="0" distB="0" distL="0" distR="0" wp14:anchorId="32012F92" wp14:editId="42D5FA2D">
             <wp:extent cx="5943600" cy="4876800"/>
             <wp:effectExtent l="19050" t="19050" r="0" b="0"/>
             <wp:docPr id="2063426448" name="Picture 1"/>
@@ -4947,13 +4939,14 @@
                     <pic:cNvPr id="2063426448" name=""/>
                     <pic:cNvPicPr/>
                   </pic:nvPicPr>
-                  <pic:blipFill>
+                  <pic:blipFill rotWithShape="1">
                     <a:blip r:embed="rId29"/>
+                    <a:srcRect/>
                     <a:stretch>
                       <a:fillRect/>
                     </a:stretch>
                   </pic:blipFill>
-                  <pic:spPr>
+                  <pic:spPr bwMode="auto">
                     <a:xfrm>
                       <a:off x="0" y="0"/>
                       <a:ext cx="5943600" cy="4876800"/>
@@ -4961,13 +4954,37 @@
                     <a:prstGeom prst="rect">
                       <a:avLst/>
                     </a:prstGeom>
-                    <a:ln>
+                    <a:ln w="9525" cap="flat" cmpd="sng" algn="ctr">
                       <a:solidFill>
-                        <a:schemeClr val="bg1">
+                        <a:sysClr val="window" lastClr="FFFFFF">
                           <a:lumMod val="85000"/>
-                        </a:schemeClr>
+                        </a:sysClr>
                       </a:solidFill>
+                      <a:prstDash val="solid"/>
+                      <a:round/>
+                      <a:headEnd type="none" w="med" len="med"/>
+                      <a:tailEnd type="none" w="med" len="med"/>
+                      <a:extLst>
+                        <a:ext uri="{C807C97D-BFC1-408E-A445-0C87EB9F89A2}">
+                          <ask:lineSketchStyleProps xmlns:ask="http://schemas.microsoft.com/office/drawing/2018/sketchyshapes" sd="0">
+                            <a:custGeom>
+                              <a:avLst/>
+                              <a:gdLst/>
+                              <a:ahLst/>
+                              <a:cxnLst/>
+                              <a:rect l="0" t="0" r="0" b="0"/>
+                              <a:pathLst/>
+                            </a:custGeom>
+                            <ask:type/>
+                          </ask:lineSketchStyleProps>
+                        </a:ext>
+                      </a:extLst>
                     </a:ln>
+                    <a:extLst>
+                      <a:ext uri="{53640926-AAD7-44D8-BBD7-CCE9431645EC}">
+                        <a14:shadowObscured xmlns:a14="http://schemas.microsoft.com/office/drawing/2010/main"/>
+                      </a:ext>
+                    </a:extLst>
                   </pic:spPr>
                 </pic:pic>
               </a:graphicData>
@@ -4977,15 +4994,13 @@
       </w:r>
     </w:p>
     <w:p>
+      <w:pPr>
+        <w:pStyle w:val="Heading2"/>
+        <w:rPr>
+          <w:color w:val="auto"/>
+        </w:rPr>
+      </w:pPr>
       <w:bookmarkStart w:id="39" w:name="hipaa-self-assessment-reports"/>
-    </w:p>
-    <w:p>
-      <w:pPr>
-        <w:pStyle w:val="Heading2"/>
-        <w:rPr>
-          <w:color w:val="auto"/>
-        </w:rPr>
-      </w:pPr>
       <w:r>
         <w:rPr>
           <w:color w:val="auto"/>
@@ -5320,14 +5335,12 @@
         <w:t xml:space="preserve">The </w:t>
       </w:r>
       <w:hyperlink r:id="rId31" w:history="1">
-        <w:proofErr w:type="spellStart"/>
         <w:r>
           <w:rPr>
             <w:rStyle w:val="Hyperlink"/>
           </w:rPr>
           <w:t>Malyszek</w:t>
         </w:r>
-        <w:proofErr w:type="spellEnd"/>
       </w:hyperlink>
       <w:r>
         <w:t xml:space="preserve"> implementation is an example of this partner-driven model.</w:t>
@@ -6018,13 +6031,8 @@
       <w:pPr>
         <w:pStyle w:val="FirstParagraph"/>
       </w:pPr>
-      <w:proofErr w:type="spellStart"/>
-      <w:r>
-        <w:t>Opsfolio’s</w:t>
-      </w:r>
-      <w:proofErr w:type="spellEnd"/>
-      <w:r>
-        <w:t xml:space="preserve"> Readiness Assessment and Self-Assessment tools provide a structured, customer-friendly compliance engagement experience that combines:</w:t>
+      <w:r>
+        <w:t>Opsfolio’s Readiness Assessment and Self-Assessment tools provide a structured, customer-friendly compliance engagement experience that combines:</w:t>
       </w:r>
     </w:p>
     <w:p>

</xml_diff>